<commit_message>
- Existing window overhead and cwnd growth restriction adapted to work better with cellular access, configurable schedulingJitterMargin. - postCogestionDelayRtts is configurable - New SCReAM BW test tool parameters -jittermargin and -postcongdelay - Build date for BW test tool sender changed
</commit_message>
<xml_diff>
--- a/SCReAM-BW-test-tool.docx
+++ b/SCReAM-BW-test-tool.docx
@@ -1,6 +1,6 @@
 
 <file path=word/document.xml><?xml version="1.0" encoding="utf-8"?>
-<w:document xmlns:wpc="http://schemas.microsoft.com/office/word/2010/wordprocessingCanvas" xmlns:cx="http://schemas.microsoft.com/office/drawing/2014/chartex" xmlns:cx1="http://schemas.microsoft.com/office/drawing/2015/9/8/chartex" xmlns:cx2="http://schemas.microsoft.com/office/drawing/2015/10/21/chartex" xmlns:cx3="http://schemas.microsoft.com/office/drawing/2016/5/9/chartex" xmlns:cx4="http://schemas.microsoft.com/office/drawing/2016/5/10/chartex" xmlns:cx5="http://schemas.microsoft.com/office/drawing/2016/5/11/chartex" xmlns:cx6="http://schemas.microsoft.com/office/drawing/2016/5/12/chartex" xmlns:cx7="http://schemas.microsoft.com/office/drawing/2016/5/13/chartex" xmlns:cx8="http://schemas.microsoft.com/office/drawing/2016/5/14/chartex" xmlns:mc="http://schemas.openxmlformats.org/markup-compatibility/2006" xmlns:aink="http://schemas.microsoft.com/office/drawing/2016/ink" xmlns:am3d="http://schemas.microsoft.com/office/drawing/2017/model3d" xmlns:o="urn:schemas-microsoft-com:office:office" xmlns:oel="http://schemas.microsoft.com/office/2019/extlst" xmlns:r="http://schemas.openxmlformats.org/officeDocument/2006/relationships" xmlns:m="http://schemas.openxmlformats.org/officeDocument/2006/math" xmlns:v="urn:schemas-microsoft-com:vml" xmlns:wp14="http://schemas.microsoft.com/office/word/2010/wordprocessingDrawing" xmlns:wp="http://schemas.openxmlformats.org/drawingml/2006/wordprocessingDrawing" xmlns:w10="urn:schemas-microsoft-com:office:word" xmlns:w="http://schemas.openxmlformats.org/wordprocessingml/2006/main" xmlns:w14="http://schemas.microsoft.com/office/word/2010/wordml" xmlns:w15="http://schemas.microsoft.com/office/word/2012/wordml" xmlns:w16cex="http://schemas.microsoft.com/office/word/2018/wordml/cex" xmlns:w16cid="http://schemas.microsoft.com/office/word/2016/wordml/cid" xmlns:w16="http://schemas.microsoft.com/office/word/2018/wordml" xmlns:w16sdtdh="http://schemas.microsoft.com/office/word/2020/wordml/sdtdatahash" xmlns:w16se="http://schemas.microsoft.com/office/word/2015/wordml/symex" xmlns:wpg="http://schemas.microsoft.com/office/word/2010/wordprocessingGroup" xmlns:wpi="http://schemas.microsoft.com/office/word/2010/wordprocessingInk" xmlns:wne="http://schemas.microsoft.com/office/word/2006/wordml" xmlns:wps="http://schemas.microsoft.com/office/word/2010/wordprocessingShape" mc:Ignorable="w14 w15 w16se w16cid w16 w16cex w16sdtdh wp14">
+<w:document xmlns:wpc="http://schemas.microsoft.com/office/word/2010/wordprocessingCanvas" xmlns:cx="http://schemas.microsoft.com/office/drawing/2014/chartex" xmlns:cx1="http://schemas.microsoft.com/office/drawing/2015/9/8/chartex" xmlns:cx2="http://schemas.microsoft.com/office/drawing/2015/10/21/chartex" xmlns:cx3="http://schemas.microsoft.com/office/drawing/2016/5/9/chartex" xmlns:cx4="http://schemas.microsoft.com/office/drawing/2016/5/10/chartex" xmlns:cx5="http://schemas.microsoft.com/office/drawing/2016/5/11/chartex" xmlns:cx6="http://schemas.microsoft.com/office/drawing/2016/5/12/chartex" xmlns:cx7="http://schemas.microsoft.com/office/drawing/2016/5/13/chartex" xmlns:cx8="http://schemas.microsoft.com/office/drawing/2016/5/14/chartex" xmlns:mc="http://schemas.openxmlformats.org/markup-compatibility/2006" xmlns:aink="http://schemas.microsoft.com/office/drawing/2016/ink" xmlns:am3d="http://schemas.microsoft.com/office/drawing/2017/model3d" xmlns:o="urn:schemas-microsoft-com:office:office" xmlns:oel="http://schemas.microsoft.com/office/2019/extlst" xmlns:r="http://schemas.openxmlformats.org/officeDocument/2006/relationships" xmlns:m="http://schemas.openxmlformats.org/officeDocument/2006/math" xmlns:v="urn:schemas-microsoft-com:vml" xmlns:wp14="http://schemas.microsoft.com/office/word/2010/wordprocessingDrawing" xmlns:wp="http://schemas.openxmlformats.org/drawingml/2006/wordprocessingDrawing" xmlns:w10="urn:schemas-microsoft-com:office:word" xmlns:w="http://schemas.openxmlformats.org/wordprocessingml/2006/main" xmlns:w14="http://schemas.microsoft.com/office/word/2010/wordml" xmlns:w15="http://schemas.microsoft.com/office/word/2012/wordml" xmlns:w16cex="http://schemas.microsoft.com/office/word/2018/wordml/cex" xmlns:w16cid="http://schemas.microsoft.com/office/word/2016/wordml/cid" xmlns:w16="http://schemas.microsoft.com/office/word/2018/wordml" xmlns:w16du="http://schemas.microsoft.com/office/word/2023/wordml/word16du" xmlns:w16sdtdh="http://schemas.microsoft.com/office/word/2020/wordml/sdtdatahash" xmlns:w16sdtfl="http://schemas.microsoft.com/office/word/2024/wordml/sdtformatlock" xmlns:w16se="http://schemas.microsoft.com/office/word/2015/wordml/symex" xmlns:wpg="http://schemas.microsoft.com/office/word/2010/wordprocessingGroup" xmlns:wpi="http://schemas.microsoft.com/office/word/2010/wordprocessingInk" xmlns:wne="http://schemas.microsoft.com/office/word/2006/wordml" xmlns:wps="http://schemas.microsoft.com/office/word/2010/wordprocessingShape" mc:Ignorable="w14 w15 w16se w16cid w16 w16cex w16sdtdh w16sdtfl w16du wp14">
   <w:body>
     <w:p>
       <w:r>
@@ -484,7 +484,15 @@
         <w:t>est tool can operate at bitrates ranging from a few 100 kbps up to about 500Mbps</w:t>
       </w:r>
       <w:r>
-        <w:t>. As mentioned before the tool does not generate any meaningful video</w:t>
+        <w:t xml:space="preserve">. As mentioned </w:t>
+      </w:r>
+      <w:proofErr w:type="gramStart"/>
+      <w:r>
+        <w:t>before</w:t>
+      </w:r>
+      <w:proofErr w:type="gramEnd"/>
+      <w:r>
+        <w:t xml:space="preserve"> the tool does not generate any meaningful video</w:t>
       </w:r>
       <w:r>
         <w:t>, it does however mimic video en</w:t>
@@ -624,9 +632,6 @@
           <w:ilvl w:val="0"/>
           <w:numId w:val="29"/>
         </w:numPr>
-        <w:rPr>
-          <w:lang w:val="en-SE"/>
-        </w:rPr>
       </w:pPr>
       <w:r>
         <w:t>scream-</w:t>
@@ -916,54 +921,30 @@
           <w:numId w:val="34"/>
         </w:numPr>
         <w:ind w:left="426"/>
-        <w:rPr>
-          <w:lang w:val="en-SE"/>
-        </w:rPr>
-      </w:pPr>
-      <w:r>
-        <w:rPr>
-          <w:lang w:val="en-SE"/>
-        </w:rPr>
+      </w:pPr>
+      <w:r>
         <w:t xml:space="preserve">Download TERMUX APK from </w:t>
       </w:r>
       <w:proofErr w:type="spellStart"/>
       <w:r>
-        <w:rPr>
-          <w:lang w:val="en-SE"/>
-        </w:rPr>
         <w:t>Termux</w:t>
       </w:r>
       <w:proofErr w:type="spellEnd"/>
       <w:r>
-        <w:rPr>
-          <w:lang w:val="en-SE"/>
-        </w:rPr>
         <w:t xml:space="preserve"> | F-Droid - Free and </w:t>
       </w:r>
       <w:proofErr w:type="gramStart"/>
       <w:r>
-        <w:rPr>
-          <w:lang w:val="en-SE"/>
-        </w:rPr>
         <w:t>Open Source</w:t>
       </w:r>
       <w:proofErr w:type="gramEnd"/>
       <w:r>
-        <w:rPr>
-          <w:lang w:val="en-SE"/>
-        </w:rPr>
         <w:t xml:space="preserve"> Android App Repository, I chose</w:t>
       </w:r>
       <w:r>
-        <w:rPr>
-          <w:lang w:val="en-SE"/>
-        </w:rPr>
         <w:t xml:space="preserve"> </w:t>
       </w:r>
       <w:r>
-        <w:rPr>
-          <w:lang w:val="en-SE"/>
-        </w:rPr>
         <w:t>com.termux_118.apk</w:t>
       </w:r>
     </w:p>
@@ -975,98 +956,56 @@
           <w:numId w:val="34"/>
         </w:numPr>
         <w:ind w:left="426"/>
-        <w:rPr>
-          <w:lang w:val="en-SE"/>
-        </w:rPr>
-      </w:pPr>
-      <w:r>
-        <w:rPr>
-          <w:lang w:val="en-SE"/>
-        </w:rPr>
+      </w:pPr>
+      <w:r>
         <w:t xml:space="preserve">Use </w:t>
       </w:r>
       <w:proofErr w:type="spellStart"/>
       <w:r>
-        <w:rPr>
-          <w:lang w:val="en-SE"/>
-        </w:rPr>
         <w:t>adb</w:t>
       </w:r>
       <w:proofErr w:type="spellEnd"/>
       <w:r>
-        <w:rPr>
-          <w:lang w:val="en-SE"/>
-        </w:rPr>
         <w:t xml:space="preserve"> shell to push it to /</w:t>
       </w:r>
       <w:proofErr w:type="spellStart"/>
       <w:r>
-        <w:rPr>
-          <w:lang w:val="en-SE"/>
-        </w:rPr>
         <w:t>sdcard</w:t>
       </w:r>
       <w:proofErr w:type="spellEnd"/>
       <w:r>
-        <w:rPr>
-          <w:lang w:val="en-SE"/>
-        </w:rPr>
         <w:t>/Download </w:t>
       </w:r>
       <w:r>
-        <w:rPr>
-          <w:lang w:val="en-SE"/>
-        </w:rPr>
         <w:br/>
         <w:t>&gt;</w:t>
       </w:r>
       <w:proofErr w:type="spellStart"/>
       <w:r>
-        <w:rPr>
-          <w:lang w:val="en-SE"/>
-        </w:rPr>
         <w:t>adb</w:t>
       </w:r>
       <w:proofErr w:type="spellEnd"/>
       <w:r>
-        <w:rPr>
-          <w:lang w:val="en-SE"/>
-        </w:rPr>
         <w:t xml:space="preserve"> root</w:t>
       </w:r>
       <w:r>
-        <w:rPr>
-          <w:lang w:val="en-SE"/>
-        </w:rPr>
         <w:br/>
         <w:t>&gt;</w:t>
       </w:r>
       <w:proofErr w:type="spellStart"/>
       <w:r>
-        <w:rPr>
-          <w:lang w:val="en-SE"/>
-        </w:rPr>
         <w:t>adb</w:t>
       </w:r>
       <w:proofErr w:type="spellEnd"/>
       <w:r>
-        <w:rPr>
-          <w:lang w:val="en-SE"/>
-        </w:rPr>
         <w:t xml:space="preserve"> push com.termux_118.apk /</w:t>
       </w:r>
       <w:proofErr w:type="spellStart"/>
       <w:r>
-        <w:rPr>
-          <w:lang w:val="en-SE"/>
-        </w:rPr>
         <w:t>sdcard</w:t>
       </w:r>
       <w:proofErr w:type="spellEnd"/>
       <w:r>
-        <w:rPr>
-          <w:lang w:val="en-SE"/>
-        </w:rPr>
         <w:t>/Download</w:t>
       </w:r>
     </w:p>
@@ -1078,21 +1017,20 @@
           <w:numId w:val="34"/>
         </w:numPr>
         <w:ind w:left="426"/>
-        <w:rPr>
-          <w:lang w:val="en-SE"/>
-        </w:rPr>
-      </w:pPr>
-      <w:r>
-        <w:rPr>
-          <w:lang w:val="en-SE"/>
-        </w:rPr>
+      </w:pPr>
+      <w:r>
         <w:t>F</w:t>
       </w:r>
       <w:r>
-        <w:rPr>
-          <w:lang w:val="en-SE"/>
-        </w:rPr>
-        <w:t>rom UE UI, choose files-&gt;internal storage-&gt;Download, com.termux_118.apk should show up there. Click on it, you should see the install from unknown source notice, click on setting to allow installing from unknown source. Then it is installed.</w:t>
+        <w:t xml:space="preserve">rom UE UI, choose files-&gt;internal storage-&gt;Download, com.termux_118.apk should show up there. Click on it, you should see the install from unknown source notice, click on setting to allow </w:t>
+      </w:r>
+      <w:proofErr w:type="gramStart"/>
+      <w:r>
+        <w:t>installing</w:t>
+      </w:r>
+      <w:proofErr w:type="gramEnd"/>
+      <w:r>
+        <w:t xml:space="preserve"> from unknown source. Then it is installed.</w:t>
       </w:r>
     </w:p>
     <w:p>
@@ -1103,40 +1041,22 @@
           <w:numId w:val="34"/>
         </w:numPr>
         <w:ind w:left="426"/>
-        <w:rPr>
-          <w:lang w:val="en-SE"/>
-        </w:rPr>
-      </w:pPr>
-      <w:r>
-        <w:rPr>
-          <w:lang w:val="en-SE"/>
-        </w:rPr>
+      </w:pPr>
+      <w:r>
         <w:t>L</w:t>
       </w:r>
       <w:r>
-        <w:rPr>
-          <w:lang w:val="en-SE"/>
-        </w:rPr>
         <w:t>a</w:t>
       </w:r>
       <w:r>
-        <w:rPr>
-          <w:lang w:val="en-SE"/>
-        </w:rPr>
         <w:t xml:space="preserve">unch </w:t>
       </w:r>
       <w:proofErr w:type="spellStart"/>
       <w:r>
-        <w:rPr>
-          <w:lang w:val="en-SE"/>
-        </w:rPr>
         <w:t>Termux</w:t>
       </w:r>
       <w:proofErr w:type="spellEnd"/>
       <w:r>
-        <w:rPr>
-          <w:lang w:val="en-SE"/>
-        </w:rPr>
         <w:t xml:space="preserve"> through APP window.</w:t>
       </w:r>
     </w:p>
@@ -1148,26 +1068,14 @@
           <w:numId w:val="34"/>
         </w:numPr>
         <w:ind w:left="426"/>
-        <w:rPr>
-          <w:lang w:val="en-SE"/>
-        </w:rPr>
-      </w:pPr>
-      <w:r>
-        <w:rPr>
-          <w:lang w:val="en-SE"/>
-        </w:rPr>
+      </w:pPr>
+      <w:r>
         <w:t xml:space="preserve">Make sure the </w:t>
       </w:r>
       <w:r>
-        <w:rPr>
-          <w:lang w:val="en-SE"/>
-        </w:rPr>
         <w:t>UE</w:t>
       </w:r>
       <w:r>
-        <w:rPr>
-          <w:lang w:val="en-SE"/>
-        </w:rPr>
         <w:t xml:space="preserve"> has Wi-fi connection to internet.</w:t>
       </w:r>
     </w:p>
@@ -1179,32 +1087,17 @@
           <w:numId w:val="34"/>
         </w:numPr>
         <w:ind w:left="426"/>
-        <w:rPr>
-          <w:lang w:val="en-SE"/>
-        </w:rPr>
-      </w:pPr>
-      <w:r>
-        <w:rPr>
-          <w:lang w:val="en-SE"/>
-        </w:rPr>
+      </w:pPr>
+      <w:r>
         <w:t>&gt;</w:t>
       </w:r>
       <w:r>
-        <w:rPr>
-          <w:lang w:val="en-SE"/>
-        </w:rPr>
         <w:t>pkg clean</w:t>
       </w:r>
       <w:r>
-        <w:rPr>
-          <w:lang w:val="en-SE"/>
-        </w:rPr>
         <w:t xml:space="preserve"> </w:t>
       </w:r>
       <w:r>
-        <w:rPr>
-          <w:lang w:val="en-SE"/>
-        </w:rPr>
         <w:t>(Sometimes, issues with the package lists can cause problems)</w:t>
       </w:r>
     </w:p>
@@ -1216,20 +1109,11 @@
           <w:numId w:val="34"/>
         </w:numPr>
         <w:ind w:left="426"/>
-        <w:rPr>
-          <w:lang w:val="en-SE"/>
-        </w:rPr>
-      </w:pPr>
-      <w:r>
-        <w:rPr>
-          <w:lang w:val="en-SE"/>
-        </w:rPr>
+      </w:pPr>
+      <w:r>
         <w:t>&gt;</w:t>
       </w:r>
       <w:r>
-        <w:rPr>
-          <w:lang w:val="en-SE"/>
-        </w:rPr>
         <w:t>pkg update (Answer Y for all the prompt)</w:t>
       </w:r>
     </w:p>
@@ -1241,27 +1125,15 @@
           <w:numId w:val="34"/>
         </w:numPr>
         <w:ind w:left="426"/>
-        <w:rPr>
-          <w:lang w:val="en-SE"/>
-        </w:rPr>
-      </w:pPr>
-      <w:r>
-        <w:rPr>
-          <w:lang w:val="en-SE"/>
-        </w:rPr>
+      </w:pPr>
+      <w:r>
         <w:t>&gt;</w:t>
       </w:r>
       <w:r>
-        <w:rPr>
-          <w:lang w:val="en-SE"/>
-        </w:rPr>
         <w:t xml:space="preserve">pkg install </w:t>
       </w:r>
       <w:proofErr w:type="spellStart"/>
       <w:r>
-        <w:rPr>
-          <w:lang w:val="en-SE"/>
-        </w:rPr>
         <w:t>cmake</w:t>
       </w:r>
       <w:proofErr w:type="spellEnd"/>
@@ -1274,40 +1146,22 @@
           <w:numId w:val="34"/>
         </w:numPr>
         <w:ind w:left="426"/>
-        <w:rPr>
-          <w:lang w:val="en-SE"/>
-        </w:rPr>
-      </w:pPr>
-      <w:r>
-        <w:rPr>
-          <w:lang w:val="en-SE"/>
-        </w:rPr>
+      </w:pPr>
+      <w:r>
         <w:t>&gt;</w:t>
       </w:r>
       <w:r>
-        <w:rPr>
-          <w:lang w:val="en-SE"/>
-        </w:rPr>
         <w:t xml:space="preserve">pkg install </w:t>
       </w:r>
       <w:proofErr w:type="gramStart"/>
       <w:r>
-        <w:rPr>
-          <w:lang w:val="en-SE"/>
-        </w:rPr>
         <w:t>vim</w:t>
       </w:r>
       <w:r>
-        <w:rPr>
-          <w:lang w:val="en-SE"/>
-        </w:rPr>
         <w:t xml:space="preserve">  (</w:t>
       </w:r>
       <w:proofErr w:type="gramEnd"/>
       <w:r>
-        <w:rPr>
-          <w:lang w:val="en-SE"/>
-        </w:rPr>
         <w:t>or nano)</w:t>
       </w:r>
     </w:p>
@@ -1319,20 +1173,11 @@
           <w:numId w:val="34"/>
         </w:numPr>
         <w:ind w:left="426"/>
-        <w:rPr>
-          <w:lang w:val="en-SE"/>
-        </w:rPr>
-      </w:pPr>
-      <w:r>
-        <w:rPr>
-          <w:lang w:val="en-SE"/>
-        </w:rPr>
+      </w:pPr>
+      <w:r>
         <w:t>&gt;</w:t>
       </w:r>
       <w:r>
-        <w:rPr>
-          <w:lang w:val="en-SE"/>
-        </w:rPr>
         <w:t>pkg install git</w:t>
       </w:r>
     </w:p>
@@ -1344,111 +1189,63 @@
           <w:numId w:val="34"/>
         </w:numPr>
         <w:ind w:left="426"/>
-        <w:rPr>
-          <w:lang w:val="en-SE"/>
-        </w:rPr>
-      </w:pPr>
-      <w:r>
-        <w:rPr>
-          <w:lang w:val="en-SE"/>
-        </w:rPr>
+      </w:pPr>
+      <w:r>
         <w:t>&gt;</w:t>
       </w:r>
       <w:r>
-        <w:rPr>
-          <w:lang w:val="en-SE"/>
-        </w:rPr>
         <w:t>git clone </w:t>
       </w:r>
       <w:hyperlink r:id="rId15" w:tgtFrame="_blank" w:tooltip="https://github.com/ericssonresearch/scream.git" w:history="1">
         <w:r>
           <w:rPr>
             <w:rStyle w:val="Hyperlink"/>
-            <w:lang w:val="en-SE"/>
           </w:rPr>
           <w:t>https://github.com/EricssonResearch/scream.git</w:t>
         </w:r>
       </w:hyperlink>
       <w:r>
         <w:br/>
-      </w:r>
-      <w:r>
-        <w:rPr>
-          <w:lang w:val="en-SE"/>
-        </w:rPr>
         <w:t xml:space="preserve">In </w:t>
       </w:r>
       <w:r>
-        <w:rPr>
-          <w:lang w:val="en-SE"/>
-        </w:rPr>
         <w:t>file: ./scream/code/scream_sender.cpp (Edit line 554 and 573 , change "bind(" to "::bind("</w:t>
       </w:r>
       <w:r>
-        <w:rPr>
-          <w:lang w:val="en-SE"/>
-        </w:rPr>
         <w:br/>
         <w:t xml:space="preserve">In </w:t>
       </w:r>
       <w:r>
-        <w:rPr>
-          <w:lang w:val="en-SE"/>
-        </w:rPr>
         <w:t>file: ./scream/code/scream_receiver.cpp (Edit line 229, change  "bind("  to "::bind("</w:t>
       </w:r>
       <w:r>
-        <w:rPr>
-          <w:lang w:val="en-SE"/>
-        </w:rPr>
         <w:br/>
         <w:t xml:space="preserve">In </w:t>
       </w:r>
       <w:r>
-        <w:rPr>
-          <w:lang w:val="en-SE"/>
-        </w:rPr>
         <w:t>file: ./scream/</w:t>
       </w:r>
       <w:proofErr w:type="spellStart"/>
       <w:r>
-        <w:rPr>
-          <w:lang w:val="en-SE"/>
-        </w:rPr>
         <w:t>multicam</w:t>
       </w:r>
       <w:proofErr w:type="spellEnd"/>
       <w:r>
-        <w:rPr>
-          <w:lang w:val="en-SE"/>
-        </w:rPr>
         <w:t>/sender/scream/code/scream_sender.cpp (Edit line 914 and 993 , change      "bind("  to "::bind("</w:t>
       </w:r>
       <w:r>
-        <w:rPr>
-          <w:lang w:val="en-SE"/>
-        </w:rPr>
         <w:br/>
         <w:t xml:space="preserve">In </w:t>
       </w:r>
       <w:r>
-        <w:rPr>
-          <w:lang w:val="en-SE"/>
-        </w:rPr>
         <w:t>file: ./scream/</w:t>
       </w:r>
       <w:proofErr w:type="spellStart"/>
       <w:r>
-        <w:rPr>
-          <w:lang w:val="en-SE"/>
-        </w:rPr>
         <w:t>multicam</w:t>
       </w:r>
       <w:proofErr w:type="spellEnd"/>
       <w:r>
-        <w:rPr>
-          <w:lang w:val="en-SE"/>
-        </w:rPr>
         <w:t>/receiver/scream/code/scream_receiver.cpp (Edit line 293 and 344 , change      "bind("  to "::bind("</w:t>
       </w:r>
     </w:p>
@@ -1460,125 +1257,87 @@
           <w:numId w:val="34"/>
         </w:numPr>
         <w:ind w:left="426"/>
-        <w:rPr>
-          <w:lang w:val="en-SE"/>
-        </w:rPr>
-      </w:pPr>
-      <w:r>
-        <w:rPr>
-          <w:lang w:val="en-SE"/>
-        </w:rPr>
+      </w:pPr>
+      <w:r>
         <w:t>&gt;</w:t>
       </w:r>
       <w:proofErr w:type="gramStart"/>
       <w:r>
-        <w:rPr>
-          <w:lang w:val="en-SE"/>
-        </w:rPr>
         <w:t>cd .</w:t>
       </w:r>
       <w:proofErr w:type="gramEnd"/>
       <w:r>
-        <w:rPr>
-          <w:lang w:val="en-SE"/>
-        </w:rPr>
         <w:t>/scream</w:t>
       </w:r>
       <w:r>
-        <w:rPr>
-          <w:lang w:val="en-SE"/>
-        </w:rPr>
         <w:br/>
         <w:t xml:space="preserve">In </w:t>
       </w:r>
       <w:r>
-        <w:rPr>
-          <w:lang w:val="en-SE"/>
-        </w:rPr>
-        <w:t>file: CMakeLists.txt SET(CMAKE_CXX_FLAGS "-</w:t>
+        <w:t xml:space="preserve">file: CMakeLists.txt </w:t>
+      </w:r>
+      <w:proofErr w:type="gramStart"/>
+      <w:r>
+        <w:t>SET(</w:t>
+      </w:r>
+      <w:proofErr w:type="gramEnd"/>
+      <w:r>
+        <w:t>CMAKE_CXX_FLAGS "-</w:t>
       </w:r>
       <w:proofErr w:type="spellStart"/>
       <w:r>
-        <w:rPr>
-          <w:lang w:val="en-SE"/>
-        </w:rPr>
         <w:t>fPIC</w:t>
       </w:r>
       <w:proofErr w:type="spellEnd"/>
       <w:r>
-        <w:rPr>
-          <w:lang w:val="en-SE"/>
-        </w:rPr>
         <w:t xml:space="preserve"> -</w:t>
       </w:r>
       <w:proofErr w:type="spellStart"/>
       <w:r>
-        <w:rPr>
-          <w:lang w:val="en-SE"/>
-        </w:rPr>
         <w:t>fpermissive</w:t>
       </w:r>
       <w:proofErr w:type="spellEnd"/>
       <w:r>
-        <w:rPr>
-          <w:lang w:val="en-SE"/>
-        </w:rPr>
         <w:t xml:space="preserve"> -</w:t>
       </w:r>
       <w:proofErr w:type="spellStart"/>
       <w:r>
-        <w:rPr>
-          <w:lang w:val="en-SE"/>
-        </w:rPr>
         <w:t>pthread</w:t>
       </w:r>
       <w:proofErr w:type="spellEnd"/>
       <w:r>
-        <w:rPr>
-          <w:lang w:val="en-SE"/>
-        </w:rPr>
-        <w:t>") to SET(CMAKE_CXX_FLAGS "-</w:t>
+        <w:t xml:space="preserve">") to </w:t>
+      </w:r>
+      <w:proofErr w:type="gramStart"/>
+      <w:r>
+        <w:t>SET(</w:t>
+      </w:r>
+      <w:proofErr w:type="gramEnd"/>
+      <w:r>
+        <w:t>CMAKE_CXX_FLAGS "-</w:t>
       </w:r>
       <w:proofErr w:type="spellStart"/>
       <w:r>
-        <w:rPr>
-          <w:lang w:val="en-SE"/>
-        </w:rPr>
         <w:t>fPIC</w:t>
       </w:r>
       <w:proofErr w:type="spellEnd"/>
       <w:r>
-        <w:rPr>
-          <w:lang w:val="en-SE"/>
-        </w:rPr>
         <w:t xml:space="preserve"> -</w:t>
       </w:r>
       <w:proofErr w:type="spellStart"/>
       <w:r>
-        <w:rPr>
-          <w:lang w:val="en-SE"/>
-        </w:rPr>
         <w:t>fpermissive</w:t>
       </w:r>
       <w:proofErr w:type="spellEnd"/>
       <w:r>
-        <w:rPr>
-          <w:lang w:val="en-SE"/>
-        </w:rPr>
         <w:t xml:space="preserve"> -</w:t>
       </w:r>
       <w:proofErr w:type="spellStart"/>
       <w:r>
-        <w:rPr>
-          <w:lang w:val="en-SE"/>
-        </w:rPr>
         <w:t>pthread</w:t>
       </w:r>
       <w:proofErr w:type="spellEnd"/>
       <w:r>
-        <w:rPr>
-          <w:lang w:val="en-SE"/>
-        </w:rPr>
         <w:t xml:space="preserve"> -DV2")</w:t>
       </w:r>
     </w:p>
@@ -1590,29 +1349,17 @@
           <w:numId w:val="34"/>
         </w:numPr>
         <w:ind w:left="426"/>
-        <w:rPr>
-          <w:lang w:val="en-SE"/>
-        </w:rPr>
-      </w:pPr>
-      <w:r>
-        <w:rPr>
-          <w:lang w:val="en-SE"/>
-        </w:rPr>
+      </w:pPr>
+      <w:r>
         <w:t>&gt;</w:t>
       </w:r>
       <w:proofErr w:type="spellStart"/>
       <w:proofErr w:type="gramStart"/>
       <w:r>
-        <w:rPr>
-          <w:lang w:val="en-SE"/>
-        </w:rPr>
         <w:t>cmake</w:t>
       </w:r>
       <w:proofErr w:type="spellEnd"/>
       <w:r>
-        <w:rPr>
-          <w:lang w:val="en-SE"/>
-        </w:rPr>
         <w:t xml:space="preserve"> .</w:t>
       </w:r>
       <w:proofErr w:type="gramEnd"/>
@@ -1625,20 +1372,11 @@
           <w:numId w:val="34"/>
         </w:numPr>
         <w:ind w:left="426"/>
-        <w:rPr>
-          <w:lang w:val="en-SE"/>
-        </w:rPr>
-      </w:pPr>
-      <w:r>
-        <w:rPr>
-          <w:lang w:val="en-SE"/>
-        </w:rPr>
+      </w:pPr>
+      <w:r>
         <w:t>&gt;</w:t>
       </w:r>
       <w:r>
-        <w:rPr>
-          <w:lang w:val="en-SE"/>
-        </w:rPr>
         <w:t>make</w:t>
       </w:r>
     </w:p>
@@ -1650,80 +1388,44 @@
           <w:numId w:val="34"/>
         </w:numPr>
         <w:ind w:left="426"/>
-        <w:rPr>
-          <w:lang w:val="en-SE"/>
-        </w:rPr>
-      </w:pPr>
-      <w:r>
-        <w:rPr>
-          <w:lang w:val="en-SE"/>
-        </w:rPr>
+      </w:pPr>
+      <w:r>
         <w:t xml:space="preserve">In </w:t>
       </w:r>
       <w:proofErr w:type="gramStart"/>
       <w:r>
-        <w:rPr>
-          <w:lang w:val="en-SE"/>
-        </w:rPr>
         <w:t>directory .</w:t>
       </w:r>
       <w:proofErr w:type="gramEnd"/>
       <w:r>
-        <w:rPr>
-          <w:lang w:val="en-SE"/>
-        </w:rPr>
         <w:t xml:space="preserve">/bin/ you should </w:t>
       </w:r>
       <w:r>
-        <w:rPr>
-          <w:lang w:val="en-SE"/>
-        </w:rPr>
         <w:t xml:space="preserve">now </w:t>
       </w:r>
       <w:r>
-        <w:rPr>
-          <w:lang w:val="en-SE"/>
-        </w:rPr>
         <w:t xml:space="preserve">see file </w:t>
       </w:r>
       <w:proofErr w:type="spellStart"/>
       <w:r>
-        <w:rPr>
-          <w:lang w:val="en-SE"/>
-        </w:rPr>
         <w:t>s</w:t>
       </w:r>
       <w:bookmarkStart w:id="2" w:name="_Hlk197540363"/>
       <w:r>
-        <w:rPr>
-          <w:lang w:val="en-SE"/>
-        </w:rPr>
         <w:t>cream_bw_test_rx</w:t>
       </w:r>
       <w:proofErr w:type="spellEnd"/>
       <w:r>
-        <w:rPr>
-          <w:lang w:val="en-SE"/>
-        </w:rPr>
         <w:t xml:space="preserve"> and </w:t>
       </w:r>
       <w:proofErr w:type="spellStart"/>
       <w:r>
-        <w:rPr>
-          <w:lang w:val="en-SE"/>
-        </w:rPr>
         <w:t>scream_bw_test_tx</w:t>
       </w:r>
       <w:bookmarkEnd w:id="2"/>
       <w:proofErr w:type="spellEnd"/>
     </w:p>
-    <w:p>
-      <w:pPr>
-        <w:rPr>
-          <w:lang w:val="en-SE"/>
-        </w:rPr>
-      </w:pPr>
-    </w:p>
+    <w:p/>
     <w:p>
       <w:pPr>
         <w:tabs>
@@ -1816,14 +1518,10 @@
       <w:r>
         <w:rPr>
           <w:rFonts w:ascii="Cambria Math" w:hAnsi="Cambria Math" w:cs="Cambria Math"/>
-          <w:lang w:val="en-SE"/>
         </w:rPr>
         <w:t>↵</w:t>
       </w:r>
       <w:r>
-        <w:rPr>
-          <w:lang w:val="en-SE"/>
-        </w:rPr>
         <w:t xml:space="preserve"> </w:t>
       </w:r>
       <w:r>
@@ -1912,14 +1610,12 @@
       <w:r>
         <w:rPr>
           <w:rFonts w:ascii="Cambria Math" w:hAnsi="Cambria Math" w:cs="Cambria Math"/>
-          <w:lang w:val="en-SE"/>
         </w:rPr>
         <w:t>↵</w:t>
       </w:r>
       <w:r>
         <w:rPr>
           <w:rFonts w:ascii="Cambria Math" w:hAnsi="Cambria Math" w:cs="Cambria Math"/>
-          <w:lang w:val="en-SE"/>
         </w:rPr>
         <w:br/>
       </w:r>
@@ -2001,18 +1697,11 @@
       <w:r>
         <w:rPr>
           <w:rFonts w:ascii="Cambria Math" w:hAnsi="Cambria Math" w:cs="Cambria Math"/>
-          <w:lang w:val="en-SE"/>
         </w:rPr>
         <w:t>↵</w:t>
       </w:r>
       <w:r>
-        <w:rPr>
-          <w:lang w:val="en-SE"/>
-        </w:rPr>
-        <w:t xml:space="preserve"> </w:t>
-      </w:r>
-      <w:r>
-        <w:t xml:space="preserve">   </w:t>
+        <w:t xml:space="preserve">    </w:t>
       </w:r>
       <w:r>
         <w:br/>
@@ -2074,14 +1763,12 @@
       <w:r>
         <w:rPr>
           <w:rFonts w:ascii="Cambria Math" w:hAnsi="Cambria Math" w:cs="Cambria Math"/>
-          <w:lang w:val="en-SE"/>
         </w:rPr>
         <w:t>↵</w:t>
       </w:r>
       <w:r>
         <w:rPr>
           <w:rFonts w:asciiTheme="majorHAnsi" w:hAnsiTheme="majorHAnsi" w:cs="Cambria Math"/>
-          <w:lang w:val="en-SE"/>
         </w:rPr>
         <w:br/>
         <w:t xml:space="preserve">Where RX_IP is the IP address of the receiver side and TX_IP is the IP address of the sender side. PORT is the UDP port number. </w:t>
@@ -2089,48 +1776,55 @@
       <w:r>
         <w:rPr>
           <w:rFonts w:asciiTheme="majorHAnsi" w:hAnsiTheme="majorHAnsi" w:cs="Cambria Math"/>
-          <w:lang w:val="en-SE"/>
         </w:rPr>
-        <w:t xml:space="preserve">Note that the IP and PORT is last. </w:t>
-      </w:r>
+        <w:t xml:space="preserve">Note that the IP and PORT </w:t>
+      </w:r>
+      <w:proofErr w:type="gramStart"/>
       <w:r>
         <w:rPr>
           <w:rFonts w:asciiTheme="majorHAnsi" w:hAnsiTheme="majorHAnsi" w:cs="Cambria Math"/>
-          <w:lang w:val="en-SE"/>
+        </w:rPr>
+        <w:t>is</w:t>
+      </w:r>
+      <w:proofErr w:type="gramEnd"/>
+      <w:r>
+        <w:rPr>
+          <w:rFonts w:asciiTheme="majorHAnsi" w:hAnsiTheme="majorHAnsi" w:cs="Cambria Math"/>
+        </w:rPr>
+        <w:t xml:space="preserve"> last. </w:t>
+      </w:r>
+      <w:r>
+        <w:rPr>
+          <w:rFonts w:asciiTheme="majorHAnsi" w:hAnsiTheme="majorHAnsi" w:cs="Cambria Math"/>
         </w:rPr>
         <w:br/>
       </w:r>
       <w:r>
         <w:rPr>
           <w:rFonts w:asciiTheme="majorHAnsi" w:hAnsiTheme="majorHAnsi" w:cs="Cambria Math"/>
-          <w:lang w:val="en-SE"/>
         </w:rPr>
         <w:t xml:space="preserve">The sender side will print summary output every 2 seconds, shown in </w:t>
       </w:r>
       <w:r>
         <w:rPr>
           <w:rFonts w:asciiTheme="majorHAnsi" w:hAnsiTheme="majorHAnsi" w:cs="Cambria Math"/>
-          <w:lang w:val="en-SE"/>
         </w:rPr>
         <w:fldChar w:fldCharType="begin"/>
       </w:r>
       <w:r>
         <w:rPr>
           <w:rFonts w:asciiTheme="majorHAnsi" w:hAnsiTheme="majorHAnsi" w:cs="Cambria Math"/>
-          <w:lang w:val="en-SE"/>
         </w:rPr>
         <w:instrText xml:space="preserve"> REF _Ref197510796 \h </w:instrText>
       </w:r>
       <w:r>
         <w:rPr>
           <w:rFonts w:asciiTheme="majorHAnsi" w:hAnsiTheme="majorHAnsi" w:cs="Cambria Math"/>
-          <w:lang w:val="en-SE"/>
         </w:rPr>
       </w:r>
       <w:r>
         <w:rPr>
           <w:rFonts w:asciiTheme="majorHAnsi" w:hAnsiTheme="majorHAnsi" w:cs="Cambria Math"/>
-          <w:lang w:val="en-SE"/>
         </w:rPr>
         <w:fldChar w:fldCharType="separate"/>
       </w:r>
@@ -2146,35 +1840,30 @@
       <w:r>
         <w:rPr>
           <w:rFonts w:asciiTheme="majorHAnsi" w:hAnsiTheme="majorHAnsi" w:cs="Cambria Math"/>
-          <w:lang w:val="en-SE"/>
         </w:rPr>
         <w:fldChar w:fldCharType="end"/>
       </w:r>
       <w:r>
         <w:rPr>
           <w:rFonts w:asciiTheme="majorHAnsi" w:hAnsiTheme="majorHAnsi" w:cs="Cambria Math"/>
-          <w:lang w:val="en-SE"/>
         </w:rPr>
         <w:t>, until it is terminated with Ctrl-C</w:t>
       </w:r>
       <w:r>
         <w:rPr>
           <w:rFonts w:asciiTheme="majorHAnsi" w:hAnsiTheme="majorHAnsi" w:cs="Cambria Math"/>
-          <w:lang w:val="en-SE"/>
         </w:rPr>
         <w:t xml:space="preserve">. </w:t>
       </w:r>
       <w:r>
         <w:rPr>
           <w:rFonts w:asciiTheme="majorHAnsi" w:hAnsiTheme="majorHAnsi" w:cs="Cambria Math"/>
-          <w:lang w:val="en-SE"/>
         </w:rPr>
         <w:br/>
       </w:r>
       <w:r>
         <w:rPr>
           <w:rFonts w:asciiTheme="majorHAnsi" w:hAnsiTheme="majorHAnsi" w:cs="Cambria Math"/>
-          <w:lang w:val="en-SE"/>
         </w:rPr>
         <w:br/>
       </w:r>
@@ -2374,11 +2063,19 @@
       </w:r>
       <w:proofErr w:type="gramStart"/>
       <w:r>
-        <w:t>ECT(</w:t>
+        <w:t>ECT(0)%</w:t>
       </w:r>
       <w:proofErr w:type="gramEnd"/>
       <w:r>
-        <w:t>0)%, ECT(1)%, CE%]</w:t>
+        <w:t xml:space="preserve">, </w:t>
+      </w:r>
+      <w:proofErr w:type="gramStart"/>
+      <w:r>
+        <w:t>ECT(1)%</w:t>
+      </w:r>
+      <w:proofErr w:type="gramEnd"/>
+      <w:r>
+        <w:t>, CE%]</w:t>
       </w:r>
       <w:r>
         <w:t xml:space="preserve"> </w:t>
@@ -2412,7 +2109,6 @@
       <w:r>
         <w:rPr>
           <w:rFonts w:ascii="Cambria Math" w:hAnsi="Cambria Math" w:cs="Cambria Math"/>
-          <w:lang w:val="en-SE"/>
         </w:rPr>
         <w:br/>
       </w:r>
@@ -2554,18 +2250,11 @@
       <w:r>
         <w:rPr>
           <w:rFonts w:ascii="Cambria Math" w:hAnsi="Cambria Math" w:cs="Cambria Math"/>
-          <w:lang w:val="en-SE"/>
         </w:rPr>
         <w:t>↵</w:t>
       </w:r>
       <w:r>
-        <w:rPr>
-          <w:lang w:val="en-SE"/>
-        </w:rPr>
-        <w:t xml:space="preserve"> </w:t>
-      </w:r>
-      <w:r>
-        <w:t xml:space="preserve">   </w:t>
+        <w:t xml:space="preserve">    </w:t>
       </w:r>
       <w:r>
         <w:br/>
@@ -2637,7 +2326,15 @@
         <w:t xml:space="preserve"> parameters first. </w:t>
       </w:r>
       <w:r>
-        <w:t>Some options are not listed, they will be added as users begin to ask about them</w:t>
+        <w:t xml:space="preserve">Some options are not </w:t>
+      </w:r>
+      <w:proofErr w:type="gramStart"/>
+      <w:r>
+        <w:t>listed,</w:t>
+      </w:r>
+      <w:proofErr w:type="gramEnd"/>
+      <w:r>
+        <w:t xml:space="preserve"> they will be added as users begin to ask about them</w:t>
       </w:r>
     </w:p>
     <w:p>
@@ -2828,7 +2525,25 @@
                 <w:sz w:val="16"/>
                 <w:szCs w:val="16"/>
               </w:rPr>
-              <w:t xml:space="preserve"> default 200000kbps (200Mbps)</w:t>
+              <w:t xml:space="preserve"> </w:t>
+            </w:r>
+            <w:proofErr w:type="gramStart"/>
+            <w:r>
+              <w:rPr>
+                <w:rFonts w:asciiTheme="minorHAnsi" w:hAnsiTheme="minorHAnsi" w:cs="Cambria Math"/>
+                <w:sz w:val="16"/>
+                <w:szCs w:val="16"/>
+              </w:rPr>
+              <w:t>default</w:t>
+            </w:r>
+            <w:proofErr w:type="gramEnd"/>
+            <w:r>
+              <w:rPr>
+                <w:rFonts w:asciiTheme="minorHAnsi" w:hAnsiTheme="minorHAnsi" w:cs="Cambria Math"/>
+                <w:sz w:val="16"/>
+                <w:szCs w:val="16"/>
+              </w:rPr>
+              <w:t xml:space="preserve"> 200000kbps (200Mbps)</w:t>
             </w:r>
           </w:p>
         </w:tc>
@@ -3987,6 +3702,14 @@
               <w:t>delaytarget</w:t>
             </w:r>
             <w:proofErr w:type="spellEnd"/>
+            <w:r>
+              <w:rPr>
+                <w:rFonts w:asciiTheme="minorHAnsi" w:hAnsiTheme="minorHAnsi" w:cs="Cambria Math"/>
+                <w:sz w:val="16"/>
+                <w:szCs w:val="16"/>
+              </w:rPr>
+              <w:t xml:space="preserve"> value</w:t>
+            </w:r>
           </w:p>
         </w:tc>
         <w:tc>
@@ -4106,6 +3829,303 @@
                 <w:szCs w:val="16"/>
               </w:rPr>
               <w:t>Disable packet pacing</w:t>
+            </w:r>
+          </w:p>
+        </w:tc>
+      </w:tr>
+      <w:tr>
+        <w:trPr>
+          <w:trHeight w:val="65"/>
+        </w:trPr>
+        <w:tc>
+          <w:tcPr>
+            <w:tcW w:w="2122" w:type="dxa"/>
+          </w:tcPr>
+          <w:p>
+            <w:pPr>
+              <w:spacing w:after="120"/>
+              <w:rPr>
+                <w:rFonts w:asciiTheme="minorHAnsi" w:hAnsiTheme="minorHAnsi" w:cs="Cambria Math"/>
+                <w:sz w:val="16"/>
+                <w:szCs w:val="16"/>
+              </w:rPr>
+            </w:pPr>
+            <w:r>
+              <w:rPr>
+                <w:rFonts w:asciiTheme="minorHAnsi" w:hAnsiTheme="minorHAnsi" w:cs="Cambria Math"/>
+                <w:sz w:val="16"/>
+                <w:szCs w:val="16"/>
+              </w:rPr>
+              <w:t>-</w:t>
+            </w:r>
+            <w:proofErr w:type="spellStart"/>
+            <w:r>
+              <w:rPr>
+                <w:rFonts w:asciiTheme="minorHAnsi" w:hAnsiTheme="minorHAnsi" w:cs="Cambria Math"/>
+                <w:sz w:val="16"/>
+                <w:szCs w:val="16"/>
+              </w:rPr>
+              <w:t>mulincrease</w:t>
+            </w:r>
+            <w:proofErr w:type="spellEnd"/>
+            <w:r>
+              <w:rPr>
+                <w:rFonts w:asciiTheme="minorHAnsi" w:hAnsiTheme="minorHAnsi" w:cs="Cambria Math"/>
+                <w:sz w:val="16"/>
+                <w:szCs w:val="16"/>
+              </w:rPr>
+              <w:t xml:space="preserve"> value</w:t>
+            </w:r>
+          </w:p>
+        </w:tc>
+        <w:tc>
+          <w:tcPr>
+            <w:tcW w:w="6804" w:type="dxa"/>
+          </w:tcPr>
+          <w:p>
+            <w:pPr>
+              <w:spacing w:after="120"/>
+              <w:rPr>
+                <w:rFonts w:asciiTheme="minorHAnsi" w:hAnsiTheme="minorHAnsi" w:cs="Cambria Math"/>
+                <w:sz w:val="16"/>
+                <w:szCs w:val="16"/>
+              </w:rPr>
+            </w:pPr>
+            <w:r>
+              <w:rPr>
+                <w:rFonts w:asciiTheme="minorHAnsi" w:hAnsiTheme="minorHAnsi" w:cs="Cambria Math"/>
+                <w:sz w:val="16"/>
+                <w:szCs w:val="16"/>
+              </w:rPr>
+              <w:t>Max CWND increase factor</w:t>
+            </w:r>
+            <w:r>
+              <w:rPr>
+                <w:rFonts w:asciiTheme="minorHAnsi" w:hAnsiTheme="minorHAnsi" w:cs="Cambria Math"/>
+                <w:sz w:val="16"/>
+                <w:szCs w:val="16"/>
+              </w:rPr>
+              <w:t xml:space="preserve"> in fraction of CWND per RTT, default 0.05</w:t>
+            </w:r>
+            <w:r>
+              <w:rPr>
+                <w:rFonts w:asciiTheme="minorHAnsi" w:hAnsiTheme="minorHAnsi" w:cs="Cambria Math"/>
+                <w:sz w:val="16"/>
+                <w:szCs w:val="16"/>
+              </w:rPr>
+              <w:t>.</w:t>
+            </w:r>
+            <w:r>
+              <w:rPr>
+                <w:rFonts w:asciiTheme="minorHAnsi" w:hAnsiTheme="minorHAnsi" w:cs="Cambria Math"/>
+                <w:sz w:val="16"/>
+                <w:szCs w:val="16"/>
+              </w:rPr>
+              <w:t xml:space="preserve"> A value 0.05 means that the CWND can increase by </w:t>
+            </w:r>
+            <w:proofErr w:type="gramStart"/>
+            <w:r>
+              <w:rPr>
+                <w:rFonts w:asciiTheme="minorHAnsi" w:hAnsiTheme="minorHAnsi" w:cs="Cambria Math"/>
+                <w:sz w:val="16"/>
+                <w:szCs w:val="16"/>
+              </w:rPr>
+              <w:t>max(</w:t>
+            </w:r>
+            <w:proofErr w:type="gramEnd"/>
+            <w:r>
+              <w:rPr>
+                <w:rFonts w:asciiTheme="minorHAnsi" w:hAnsiTheme="minorHAnsi" w:cs="Cambria Math"/>
+                <w:sz w:val="16"/>
+                <w:szCs w:val="16"/>
+              </w:rPr>
+              <w:t xml:space="preserve">MSS, 0.05*CWND) per RTT.  </w:t>
+            </w:r>
+            <w:r>
+              <w:rPr>
+                <w:rFonts w:asciiTheme="minorHAnsi" w:hAnsiTheme="minorHAnsi" w:cs="Cambria Math"/>
+                <w:sz w:val="16"/>
+                <w:szCs w:val="16"/>
+              </w:rPr>
+              <w:t xml:space="preserve">  </w:t>
+            </w:r>
+          </w:p>
+        </w:tc>
+      </w:tr>
+      <w:tr>
+        <w:trPr>
+          <w:trHeight w:val="65"/>
+        </w:trPr>
+        <w:tc>
+          <w:tcPr>
+            <w:tcW w:w="2122" w:type="dxa"/>
+          </w:tcPr>
+          <w:p>
+            <w:pPr>
+              <w:spacing w:after="120"/>
+              <w:rPr>
+                <w:rFonts w:asciiTheme="minorHAnsi" w:hAnsiTheme="minorHAnsi" w:cs="Cambria Math"/>
+                <w:sz w:val="16"/>
+                <w:szCs w:val="16"/>
+              </w:rPr>
+            </w:pPr>
+            <w:r>
+              <w:rPr>
+                <w:rFonts w:asciiTheme="minorHAnsi" w:hAnsiTheme="minorHAnsi" w:cs="Cambria Math"/>
+                <w:sz w:val="16"/>
+                <w:szCs w:val="16"/>
+              </w:rPr>
+              <w:t>-</w:t>
+            </w:r>
+            <w:proofErr w:type="spellStart"/>
+            <w:r>
+              <w:rPr>
+                <w:rFonts w:asciiTheme="minorHAnsi" w:hAnsiTheme="minorHAnsi" w:cs="Cambria Math"/>
+                <w:sz w:val="16"/>
+                <w:szCs w:val="16"/>
+              </w:rPr>
+              <w:t>jittermargin</w:t>
+            </w:r>
+            <w:proofErr w:type="spellEnd"/>
+            <w:r>
+              <w:rPr>
+                <w:rFonts w:asciiTheme="minorHAnsi" w:hAnsiTheme="minorHAnsi" w:cs="Cambria Math"/>
+                <w:sz w:val="16"/>
+                <w:szCs w:val="16"/>
+              </w:rPr>
+              <w:t xml:space="preserve"> value</w:t>
+            </w:r>
+          </w:p>
+        </w:tc>
+        <w:tc>
+          <w:tcPr>
+            <w:tcW w:w="6804" w:type="dxa"/>
+          </w:tcPr>
+          <w:p>
+            <w:pPr>
+              <w:spacing w:after="120"/>
+              <w:rPr>
+                <w:rFonts w:asciiTheme="minorHAnsi" w:hAnsiTheme="minorHAnsi" w:cs="Cambria Math"/>
+                <w:sz w:val="16"/>
+                <w:szCs w:val="16"/>
+              </w:rPr>
+            </w:pPr>
+            <w:r>
+              <w:rPr>
+                <w:rFonts w:asciiTheme="minorHAnsi" w:hAnsiTheme="minorHAnsi" w:cs="Cambria Math"/>
+                <w:sz w:val="16"/>
+                <w:szCs w:val="16"/>
+              </w:rPr>
+              <w:t xml:space="preserve">Restriction of the window headroom and the congestion window is applied when the estimated queue delay increases. The jitter margin (default 10ms) gives slack to avoid that scheduling jitter, for instance in cellular access, triggers a restriction.  </w:t>
+            </w:r>
+          </w:p>
+        </w:tc>
+      </w:tr>
+      <w:tr>
+        <w:trPr>
+          <w:trHeight w:val="65"/>
+        </w:trPr>
+        <w:tc>
+          <w:tcPr>
+            <w:tcW w:w="2122" w:type="dxa"/>
+          </w:tcPr>
+          <w:p>
+            <w:pPr>
+              <w:spacing w:after="120"/>
+              <w:rPr>
+                <w:rFonts w:asciiTheme="minorHAnsi" w:hAnsiTheme="minorHAnsi" w:cs="Cambria Math"/>
+                <w:sz w:val="16"/>
+                <w:szCs w:val="16"/>
+              </w:rPr>
+            </w:pPr>
+            <w:r>
+              <w:rPr>
+                <w:rFonts w:asciiTheme="minorHAnsi" w:hAnsiTheme="minorHAnsi" w:cs="Cambria Math"/>
+                <w:sz w:val="16"/>
+                <w:szCs w:val="16"/>
+              </w:rPr>
+              <w:t>-</w:t>
+            </w:r>
+            <w:proofErr w:type="spellStart"/>
+            <w:r>
+              <w:rPr>
+                <w:rFonts w:asciiTheme="minorHAnsi" w:hAnsiTheme="minorHAnsi" w:cs="Cambria Math"/>
+                <w:sz w:val="16"/>
+                <w:szCs w:val="16"/>
+              </w:rPr>
+              <w:t>postcongdelay</w:t>
+            </w:r>
+            <w:proofErr w:type="spellEnd"/>
+            <w:r>
+              <w:rPr>
+                <w:rFonts w:asciiTheme="minorHAnsi" w:hAnsiTheme="minorHAnsi" w:cs="Cambria Math"/>
+                <w:sz w:val="16"/>
+                <w:szCs w:val="16"/>
+              </w:rPr>
+              <w:t xml:space="preserve"> value</w:t>
+            </w:r>
+          </w:p>
+        </w:tc>
+        <w:tc>
+          <w:tcPr>
+            <w:tcW w:w="6804" w:type="dxa"/>
+          </w:tcPr>
+          <w:p>
+            <w:pPr>
+              <w:spacing w:after="120"/>
+              <w:rPr>
+                <w:rFonts w:asciiTheme="minorHAnsi" w:hAnsiTheme="minorHAnsi" w:cs="Cambria Math"/>
+                <w:sz w:val="16"/>
+                <w:szCs w:val="16"/>
+              </w:rPr>
+            </w:pPr>
+            <w:r>
+              <w:rPr>
+                <w:rFonts w:asciiTheme="minorHAnsi" w:hAnsiTheme="minorHAnsi" w:cs="Cambria Math"/>
+                <w:sz w:val="16"/>
+                <w:szCs w:val="16"/>
+              </w:rPr>
+              <w:t>Delay</w:t>
+            </w:r>
+            <w:r>
+              <w:rPr>
+                <w:rFonts w:asciiTheme="minorHAnsi" w:hAnsiTheme="minorHAnsi" w:cs="Cambria Math"/>
+                <w:sz w:val="16"/>
+                <w:szCs w:val="16"/>
+              </w:rPr>
+              <w:t xml:space="preserve"> from last congestion event</w:t>
+            </w:r>
+            <w:r>
+              <w:rPr>
+                <w:rFonts w:asciiTheme="minorHAnsi" w:hAnsiTheme="minorHAnsi" w:cs="Cambria Math"/>
+                <w:sz w:val="16"/>
+                <w:szCs w:val="16"/>
+              </w:rPr>
+              <w:t xml:space="preserve"> (RTT</w:t>
+            </w:r>
+            <w:r>
+              <w:rPr>
+                <w:rFonts w:asciiTheme="minorHAnsi" w:hAnsiTheme="minorHAnsi" w:cs="Cambria Math"/>
+                <w:sz w:val="16"/>
+                <w:szCs w:val="16"/>
+              </w:rPr>
+              <w:t>s</w:t>
+            </w:r>
+            <w:r>
+              <w:rPr>
+                <w:rFonts w:asciiTheme="minorHAnsi" w:hAnsiTheme="minorHAnsi" w:cs="Cambria Math"/>
+                <w:sz w:val="16"/>
+                <w:szCs w:val="16"/>
+              </w:rPr>
+              <w:t>)</w:t>
+            </w:r>
+            <w:r>
+              <w:rPr>
+                <w:rFonts w:asciiTheme="minorHAnsi" w:hAnsiTheme="minorHAnsi" w:cs="Cambria Math"/>
+                <w:sz w:val="16"/>
+                <w:szCs w:val="16"/>
+              </w:rPr>
+              <w:t xml:space="preserve"> until a full increase of CWND is reached.</w:t>
             </w:r>
           </w:p>
         </w:tc>
@@ -4455,7 +4475,61 @@
                 <w:sz w:val="16"/>
                 <w:szCs w:val="16"/>
               </w:rPr>
-              <w:t xml:space="preserve">. Which means that an RTCP feedback is transmitted no more seldom than evert 16 RTP packets. For at low </w:t>
+              <w:t xml:space="preserve">. Which means that </w:t>
+            </w:r>
+            <w:proofErr w:type="gramStart"/>
+            <w:r>
+              <w:rPr>
+                <w:rFonts w:asciiTheme="minorHAnsi" w:hAnsiTheme="minorHAnsi" w:cs="Cambria Math"/>
+                <w:sz w:val="16"/>
+                <w:szCs w:val="16"/>
+              </w:rPr>
+              <w:t>an RTCP feedback</w:t>
+            </w:r>
+            <w:proofErr w:type="gramEnd"/>
+            <w:r>
+              <w:rPr>
+                <w:rFonts w:asciiTheme="minorHAnsi" w:hAnsiTheme="minorHAnsi" w:cs="Cambria Math"/>
+                <w:sz w:val="16"/>
+                <w:szCs w:val="16"/>
+              </w:rPr>
+              <w:t xml:space="preserve"> is transmitted no more seldom than </w:t>
+            </w:r>
+            <w:proofErr w:type="gramStart"/>
+            <w:r>
+              <w:rPr>
+                <w:rFonts w:asciiTheme="minorHAnsi" w:hAnsiTheme="minorHAnsi" w:cs="Cambria Math"/>
+                <w:sz w:val="16"/>
+                <w:szCs w:val="16"/>
+              </w:rPr>
+              <w:t>evert</w:t>
+            </w:r>
+            <w:proofErr w:type="gramEnd"/>
+            <w:r>
+              <w:rPr>
+                <w:rFonts w:asciiTheme="minorHAnsi" w:hAnsiTheme="minorHAnsi" w:cs="Cambria Math"/>
+                <w:sz w:val="16"/>
+                <w:szCs w:val="16"/>
+              </w:rPr>
+              <w:t xml:space="preserve"> 16 RTP packets. </w:t>
+            </w:r>
+            <w:proofErr w:type="gramStart"/>
+            <w:r>
+              <w:rPr>
+                <w:rFonts w:asciiTheme="minorHAnsi" w:hAnsiTheme="minorHAnsi" w:cs="Cambria Math"/>
+                <w:sz w:val="16"/>
+                <w:szCs w:val="16"/>
+              </w:rPr>
+              <w:t>For at</w:t>
+            </w:r>
+            <w:proofErr w:type="gramEnd"/>
+            <w:r>
+              <w:rPr>
+                <w:rFonts w:asciiTheme="minorHAnsi" w:hAnsiTheme="minorHAnsi" w:cs="Cambria Math"/>
+                <w:sz w:val="16"/>
+                <w:szCs w:val="16"/>
+              </w:rPr>
+              <w:t xml:space="preserve"> low </w:t>
             </w:r>
             <w:proofErr w:type="gramStart"/>
             <w:r>
@@ -4945,7 +5019,15 @@
     </w:p>
     <w:p>
       <w:r>
-        <w:t>The logfile gives more detailed information that is useful for instance for presentation of time traces or for statistical analysis.</w:t>
+        <w:t xml:space="preserve">The logfile gives more detailed information that is </w:t>
+      </w:r>
+      <w:proofErr w:type="gramStart"/>
+      <w:r>
+        <w:t>useful</w:t>
+      </w:r>
+      <w:proofErr w:type="gramEnd"/>
+      <w:r>
+        <w:t xml:space="preserve"> for instance for presentation of time traces or for statistical analysis.</w:t>
       </w:r>
       <w:r>
         <w:br/>
@@ -5110,7 +5192,6 @@
         <w:rPr>
           <w:rFonts w:ascii="Times New Roman" w:eastAsia="Times New Roman" w:hAnsi="Times New Roman" w:cs="Times New Roman"/>
           <w:color w:val="181818"/>
-          <w:lang w:val="en-SE" w:eastAsia="en-SE"/>
         </w:rPr>
       </w:pPr>
       <w:r>
@@ -5119,7 +5200,6 @@
           <w:color w:val="181818"/>
           <w:spacing w:val="-6"/>
           <w:kern w:val="24"/>
-          <w:lang w:eastAsia="en-SE"/>
         </w:rPr>
         <w:t xml:space="preserve">Time [s] </w:t>
       </w:r>
@@ -5143,7 +5223,6 @@
         <w:rPr>
           <w:rFonts w:ascii="Times New Roman" w:eastAsia="Times New Roman" w:hAnsi="Times New Roman" w:cs="Times New Roman"/>
           <w:color w:val="181818"/>
-          <w:lang w:val="en-SE" w:eastAsia="en-SE"/>
         </w:rPr>
       </w:pPr>
       <w:r>
@@ -5152,7 +5231,6 @@
           <w:color w:val="181818"/>
           <w:spacing w:val="-6"/>
           <w:kern w:val="24"/>
-          <w:lang w:eastAsia="en-SE"/>
         </w:rPr>
         <w:t xml:space="preserve">Estimated queue delay [s] </w:t>
       </w:r>
@@ -5176,7 +5254,6 @@
         <w:rPr>
           <w:rFonts w:ascii="Times New Roman" w:eastAsia="Times New Roman" w:hAnsi="Times New Roman" w:cs="Times New Roman"/>
           <w:color w:val="181818"/>
-          <w:lang w:val="en-SE" w:eastAsia="en-SE"/>
         </w:rPr>
       </w:pPr>
       <w:r>
@@ -5185,7 +5262,6 @@
           <w:color w:val="181818"/>
           <w:spacing w:val="-6"/>
           <w:kern w:val="24"/>
-          <w:lang w:eastAsia="en-SE"/>
         </w:rPr>
         <w:t xml:space="preserve">RTT [s] </w:t>
       </w:r>
@@ -5209,7 +5285,6 @@
         <w:rPr>
           <w:rFonts w:ascii="Times New Roman" w:eastAsia="Times New Roman" w:hAnsi="Times New Roman" w:cs="Times New Roman"/>
           <w:color w:val="181818"/>
-          <w:lang w:val="en-SE" w:eastAsia="en-SE"/>
         </w:rPr>
       </w:pPr>
       <w:r>
@@ -5218,7 +5293,6 @@
           <w:color w:val="181818"/>
           <w:spacing w:val="-6"/>
           <w:kern w:val="24"/>
-          <w:lang w:eastAsia="en-SE"/>
         </w:rPr>
         <w:t xml:space="preserve">Congestion window [byte] </w:t>
       </w:r>
@@ -5242,7 +5316,6 @@
         <w:rPr>
           <w:rFonts w:ascii="Times New Roman" w:eastAsia="Times New Roman" w:hAnsi="Times New Roman" w:cs="Times New Roman"/>
           <w:color w:val="181818"/>
-          <w:lang w:val="en-SE" w:eastAsia="en-SE"/>
         </w:rPr>
       </w:pPr>
       <w:r>
@@ -5251,7 +5324,6 @@
           <w:color w:val="181818"/>
           <w:spacing w:val="-6"/>
           <w:kern w:val="24"/>
-          <w:lang w:eastAsia="en-SE"/>
         </w:rPr>
         <w:t xml:space="preserve">Bytes in flight [byte] </w:t>
       </w:r>
@@ -5275,7 +5347,6 @@
         <w:rPr>
           <w:rFonts w:ascii="Times New Roman" w:eastAsia="Times New Roman" w:hAnsi="Times New Roman" w:cs="Times New Roman"/>
           <w:color w:val="181818"/>
-          <w:lang w:val="en-SE" w:eastAsia="en-SE"/>
         </w:rPr>
       </w:pPr>
       <w:r>
@@ -5284,7 +5355,6 @@
           <w:color w:val="181818"/>
           <w:spacing w:val="-6"/>
           <w:kern w:val="24"/>
-          <w:lang w:eastAsia="en-SE"/>
         </w:rPr>
         <w:t>Fast increase mode</w:t>
       </w:r>
@@ -5294,7 +5364,6 @@
           <w:color w:val="181818"/>
           <w:spacing w:val="-6"/>
           <w:kern w:val="24"/>
-          <w:lang w:eastAsia="en-SE"/>
         </w:rPr>
         <w:t xml:space="preserve"> (not used, but is still here for backwards compatibility</w:t>
       </w:r>
@@ -5318,7 +5387,6 @@
         <w:rPr>
           <w:rFonts w:ascii="Times New Roman" w:eastAsia="Times New Roman" w:hAnsi="Times New Roman" w:cs="Times New Roman"/>
           <w:color w:val="181818"/>
-          <w:lang w:val="en-SE" w:eastAsia="en-SE"/>
         </w:rPr>
       </w:pPr>
       <w:proofErr w:type="gramStart"/>
@@ -5328,7 +5396,6 @@
           <w:color w:val="181818"/>
           <w:spacing w:val="-6"/>
           <w:kern w:val="24"/>
-          <w:lang w:eastAsia="en-SE"/>
         </w:rPr>
         <w:t>Total</w:t>
       </w:r>
@@ -5339,7 +5406,6 @@
           <w:color w:val="181818"/>
           <w:spacing w:val="-6"/>
           <w:kern w:val="24"/>
-          <w:lang w:eastAsia="en-SE"/>
         </w:rPr>
         <w:t xml:space="preserve"> transmit bitrate [bps] </w:t>
       </w:r>
@@ -5349,7 +5415,6 @@
           <w:color w:val="181818"/>
           <w:spacing w:val="-6"/>
           <w:kern w:val="24"/>
-          <w:lang w:eastAsia="en-SE"/>
         </w:rPr>
         <w:t>(same values as col. 13)</w:t>
       </w:r>
@@ -5373,7 +5438,6 @@
         <w:rPr>
           <w:rFonts w:ascii="Times New Roman" w:eastAsia="Times New Roman" w:hAnsi="Times New Roman" w:cs="Times New Roman"/>
           <w:color w:val="181818"/>
-          <w:lang w:val="en-SE" w:eastAsia="en-SE"/>
         </w:rPr>
       </w:pPr>
       <w:r>
@@ -5382,7 +5446,6 @@
           <w:color w:val="181818"/>
           <w:spacing w:val="-6"/>
           <w:kern w:val="24"/>
-          <w:lang w:eastAsia="en-SE"/>
         </w:rPr>
         <w:t>Stream ID</w:t>
       </w:r>
@@ -5392,7 +5455,6 @@
           <w:color w:val="181818"/>
           <w:spacing w:val="-6"/>
           <w:kern w:val="24"/>
-          <w:lang w:eastAsia="en-SE"/>
         </w:rPr>
         <w:t xml:space="preserve"> (not relevant for the </w:t>
       </w:r>
@@ -5403,7 +5465,6 @@
           <w:color w:val="181818"/>
           <w:spacing w:val="-6"/>
           <w:kern w:val="24"/>
-          <w:lang w:eastAsia="en-SE"/>
         </w:rPr>
         <w:t>SCReAM</w:t>
       </w:r>
@@ -5414,7 +5475,6 @@
           <w:color w:val="181818"/>
           <w:spacing w:val="-6"/>
           <w:kern w:val="24"/>
-          <w:lang w:eastAsia="en-SE"/>
         </w:rPr>
         <w:t xml:space="preserve"> BW test as it is only one media stream)</w:t>
       </w:r>
@@ -5438,7 +5498,6 @@
         <w:rPr>
           <w:rFonts w:ascii="Times New Roman" w:eastAsia="Times New Roman" w:hAnsi="Times New Roman" w:cs="Times New Roman"/>
           <w:color w:val="181818"/>
-          <w:lang w:val="en-SE" w:eastAsia="en-SE"/>
         </w:rPr>
       </w:pPr>
       <w:r>
@@ -5447,7 +5506,6 @@
           <w:color w:val="181818"/>
           <w:spacing w:val="-6"/>
           <w:kern w:val="24"/>
-          <w:lang w:eastAsia="en-SE"/>
         </w:rPr>
         <w:t>RTP SN</w:t>
       </w:r>
@@ -5471,7 +5529,6 @@
         <w:rPr>
           <w:rFonts w:ascii="Times New Roman" w:eastAsia="Times New Roman" w:hAnsi="Times New Roman" w:cs="Times New Roman"/>
           <w:color w:val="181818"/>
-          <w:lang w:val="en-SE" w:eastAsia="en-SE"/>
         </w:rPr>
       </w:pPr>
       <w:r>
@@ -5480,7 +5537,6 @@
           <w:color w:val="181818"/>
           <w:spacing w:val="-6"/>
           <w:kern w:val="24"/>
-          <w:lang w:eastAsia="en-SE"/>
         </w:rPr>
         <w:t xml:space="preserve">Bytes newly </w:t>
       </w:r>
@@ -5491,7 +5547,6 @@
           <w:color w:val="181818"/>
           <w:spacing w:val="-6"/>
           <w:kern w:val="24"/>
-          <w:lang w:eastAsia="en-SE"/>
         </w:rPr>
         <w:t>ACKed</w:t>
       </w:r>
@@ -5516,7 +5571,6 @@
         <w:rPr>
           <w:rFonts w:ascii="Times New Roman" w:eastAsia="Times New Roman" w:hAnsi="Times New Roman" w:cs="Times New Roman"/>
           <w:color w:val="181818"/>
-          <w:lang w:val="en-SE" w:eastAsia="en-SE"/>
         </w:rPr>
       </w:pPr>
       <w:r>
@@ -5525,7 +5579,6 @@
           <w:color w:val="181818"/>
           <w:spacing w:val="-6"/>
           <w:kern w:val="24"/>
-          <w:lang w:eastAsia="en-SE"/>
         </w:rPr>
         <w:t xml:space="preserve">Bytes newly </w:t>
       </w:r>
@@ -5536,7 +5589,6 @@
           <w:color w:val="181818"/>
           <w:spacing w:val="-6"/>
           <w:kern w:val="24"/>
-          <w:lang w:eastAsia="en-SE"/>
         </w:rPr>
         <w:t>ACKed</w:t>
       </w:r>
@@ -5547,7 +5599,6 @@
           <w:color w:val="181818"/>
           <w:spacing w:val="-6"/>
           <w:kern w:val="24"/>
-          <w:lang w:eastAsia="en-SE"/>
         </w:rPr>
         <w:t xml:space="preserve"> and CE marked</w:t>
       </w:r>
@@ -5571,7 +5622,6 @@
         <w:rPr>
           <w:rFonts w:ascii="Times New Roman" w:eastAsia="Times New Roman" w:hAnsi="Times New Roman" w:cs="Times New Roman"/>
           <w:color w:val="181818"/>
-          <w:lang w:val="en-SE" w:eastAsia="en-SE"/>
         </w:rPr>
       </w:pPr>
       <w:r>
@@ -5580,7 +5630,6 @@
           <w:color w:val="181818"/>
           <w:spacing w:val="-6"/>
           <w:kern w:val="24"/>
-          <w:lang w:eastAsia="en-SE"/>
         </w:rPr>
         <w:t xml:space="preserve">Media coder bitrate [bps] </w:t>
       </w:r>
@@ -5604,7 +5653,6 @@
         <w:rPr>
           <w:rFonts w:ascii="Times New Roman" w:eastAsia="Times New Roman" w:hAnsi="Times New Roman" w:cs="Times New Roman"/>
           <w:color w:val="181818"/>
-          <w:lang w:val="en-SE" w:eastAsia="en-SE"/>
         </w:rPr>
       </w:pPr>
       <w:r>
@@ -5613,7 +5661,6 @@
           <w:color w:val="181818"/>
           <w:spacing w:val="-6"/>
           <w:kern w:val="24"/>
-          <w:lang w:eastAsia="en-SE"/>
         </w:rPr>
         <w:t xml:space="preserve">Transmitted bitrate [bps] </w:t>
       </w:r>
@@ -5637,7 +5684,6 @@
         <w:rPr>
           <w:rFonts w:ascii="Times New Roman" w:eastAsia="Times New Roman" w:hAnsi="Times New Roman" w:cs="Times New Roman"/>
           <w:color w:val="181818"/>
-          <w:lang w:val="en-SE" w:eastAsia="en-SE"/>
         </w:rPr>
       </w:pPr>
       <w:proofErr w:type="spellStart"/>
@@ -5647,7 +5693,6 @@
           <w:color w:val="181818"/>
           <w:spacing w:val="-6"/>
           <w:kern w:val="24"/>
-          <w:lang w:eastAsia="en-SE"/>
         </w:rPr>
         <w:t>ACKed</w:t>
       </w:r>
@@ -5658,7 +5703,6 @@
           <w:color w:val="181818"/>
           <w:spacing w:val="-6"/>
           <w:kern w:val="24"/>
-          <w:lang w:eastAsia="en-SE"/>
         </w:rPr>
         <w:t xml:space="preserve"> bitrate [bps] </w:t>
       </w:r>
@@ -5682,7 +5726,6 @@
         <w:rPr>
           <w:rFonts w:ascii="Times New Roman" w:eastAsia="Times New Roman" w:hAnsi="Times New Roman" w:cs="Times New Roman"/>
           <w:color w:val="181818"/>
-          <w:lang w:val="en-SE" w:eastAsia="en-SE"/>
         </w:rPr>
       </w:pPr>
       <w:r>
@@ -5691,7 +5734,6 @@
           <w:color w:val="181818"/>
           <w:spacing w:val="-6"/>
           <w:kern w:val="24"/>
-          <w:lang w:eastAsia="en-SE"/>
         </w:rPr>
         <w:t xml:space="preserve">Lost bitrate [bps] </w:t>
       </w:r>
@@ -5715,7 +5757,6 @@
         <w:rPr>
           <w:rFonts w:ascii="Times New Roman" w:eastAsia="Times New Roman" w:hAnsi="Times New Roman" w:cs="Times New Roman"/>
           <w:color w:val="181818"/>
-          <w:lang w:val="en-SE" w:eastAsia="en-SE"/>
         </w:rPr>
       </w:pPr>
       <w:r>
@@ -5724,7 +5765,6 @@
           <w:color w:val="181818"/>
           <w:spacing w:val="-6"/>
           <w:kern w:val="24"/>
-          <w:lang w:eastAsia="en-SE"/>
         </w:rPr>
         <w:t xml:space="preserve">CE Marked bitrate [bps] </w:t>
       </w:r>
@@ -5748,7 +5788,6 @@
         <w:rPr>
           <w:rFonts w:ascii="Times New Roman" w:eastAsia="Times New Roman" w:hAnsi="Times New Roman" w:cs="Times New Roman"/>
           <w:color w:val="181818"/>
-          <w:lang w:val="en-SE" w:eastAsia="en-SE"/>
         </w:rPr>
       </w:pPr>
       <w:r>
@@ -5757,7 +5796,6 @@
           <w:color w:val="181818"/>
           <w:spacing w:val="-6"/>
           <w:kern w:val="24"/>
-          <w:lang w:eastAsia="en-SE"/>
         </w:rPr>
         <w:t>Marker bit set</w:t>
       </w:r>
@@ -5781,7 +5819,6 @@
         <w:rPr>
           <w:rFonts w:ascii="Times New Roman" w:eastAsia="Times New Roman" w:hAnsi="Times New Roman" w:cs="Times New Roman"/>
           <w:color w:val="181818"/>
-          <w:lang w:val="en-SE" w:eastAsia="en-SE"/>
         </w:rPr>
       </w:pPr>
       <w:r>
@@ -5790,7 +5827,6 @@
           <w:color w:val="181818"/>
           <w:spacing w:val="-6"/>
           <w:kern w:val="24"/>
-          <w:lang w:eastAsia="en-SE"/>
         </w:rPr>
         <w:t>Target bitrate [bps]</w:t>
       </w:r>
@@ -5814,7 +5850,6 @@
         <w:rPr>
           <w:rFonts w:ascii="Times New Roman" w:eastAsia="Times New Roman" w:hAnsi="Times New Roman" w:cs="Times New Roman"/>
           <w:color w:val="181818"/>
-          <w:lang w:val="en-SE" w:eastAsia="en-SE"/>
         </w:rPr>
       </w:pPr>
       <w:r>
@@ -5823,7 +5858,6 @@
           <w:color w:val="181818"/>
           <w:spacing w:val="-6"/>
           <w:kern w:val="24"/>
-          <w:lang w:eastAsia="en-SE"/>
         </w:rPr>
         <w:t xml:space="preserve">RTP queue delay for last </w:t>
       </w:r>
@@ -5834,7 +5868,6 @@
           <w:color w:val="181818"/>
           <w:spacing w:val="-6"/>
           <w:kern w:val="24"/>
-          <w:lang w:eastAsia="en-SE"/>
         </w:rPr>
         <w:t>ACKed</w:t>
       </w:r>
@@ -5845,7 +5878,6 @@
           <w:color w:val="181818"/>
           <w:spacing w:val="-6"/>
           <w:kern w:val="24"/>
-          <w:lang w:eastAsia="en-SE"/>
         </w:rPr>
         <w:t xml:space="preserve"> RTP packet [s]</w:t>
       </w:r>
@@ -5853,7 +5885,15 @@
     <w:p/>
     <w:p>
       <w:r>
-        <w:t xml:space="preserve">The log file contains some items that are either superfluous or duplicates. The reason is that the same logging is used for multi stream applications. </w:t>
+        <w:t xml:space="preserve">The log file contains some items that are either superfluous or </w:t>
+      </w:r>
+      <w:proofErr w:type="gramStart"/>
+      <w:r>
+        <w:t>duplicates</w:t>
+      </w:r>
+      <w:proofErr w:type="gramEnd"/>
+      <w:r>
+        <w:t xml:space="preserve">. The reason is that the same logging is used for multi stream applications. </w:t>
       </w:r>
     </w:p>
     <w:p>
@@ -5901,7 +5941,6 @@
         <w:rPr>
           <w:rFonts w:ascii="Times New Roman" w:eastAsia="Times New Roman" w:hAnsi="Times New Roman" w:cs="Times New Roman"/>
           <w:color w:val="181818"/>
-          <w:lang w:val="en-SE" w:eastAsia="en-SE"/>
         </w:rPr>
       </w:pPr>
       <w:r>
@@ -5910,7 +5949,6 @@
           <w:color w:val="181818"/>
           <w:spacing w:val="-6"/>
           <w:kern w:val="24"/>
-          <w:lang w:eastAsia="en-SE"/>
         </w:rPr>
         <w:t xml:space="preserve">Col </w:t>
       </w:r>
@@ -5921,7 +5959,6 @@
           <w:color w:val="181818"/>
           <w:spacing w:val="-6"/>
           <w:kern w:val="24"/>
-          <w:lang w:eastAsia="en-SE"/>
         </w:rPr>
         <w:t>1:</w:t>
       </w:r>
@@ -5931,7 +5968,6 @@
           <w:color w:val="181818"/>
           <w:spacing w:val="-6"/>
           <w:kern w:val="24"/>
-          <w:lang w:eastAsia="en-SE"/>
         </w:rPr>
         <w:t>Time</w:t>
       </w:r>
@@ -5942,7 +5978,6 @@
           <w:color w:val="181818"/>
           <w:spacing w:val="-6"/>
           <w:kern w:val="24"/>
-          <w:lang w:eastAsia="en-SE"/>
         </w:rPr>
         <w:t xml:space="preserve"> [s] </w:t>
       </w:r>
@@ -5968,7 +6003,6 @@
         <w:rPr>
           <w:rFonts w:ascii="Times New Roman" w:eastAsia="Times New Roman" w:hAnsi="Times New Roman" w:cs="Times New Roman"/>
           <w:color w:val="181818"/>
-          <w:lang w:val="en-SE" w:eastAsia="en-SE"/>
         </w:rPr>
       </w:pPr>
       <w:r>
@@ -5977,7 +6011,6 @@
           <w:color w:val="181818"/>
           <w:spacing w:val="-6"/>
           <w:kern w:val="24"/>
-          <w:lang w:eastAsia="en-SE"/>
         </w:rPr>
         <w:t xml:space="preserve">Col </w:t>
       </w:r>
@@ -5988,7 +6021,6 @@
           <w:color w:val="181818"/>
           <w:spacing w:val="-6"/>
           <w:kern w:val="24"/>
-          <w:lang w:eastAsia="en-SE"/>
         </w:rPr>
         <w:t>2:</w:t>
       </w:r>
@@ -5998,7 +6030,6 @@
           <w:color w:val="181818"/>
           <w:spacing w:val="-6"/>
           <w:kern w:val="24"/>
-          <w:lang w:eastAsia="en-SE"/>
         </w:rPr>
         <w:t>Estimated</w:t>
       </w:r>
@@ -6009,7 +6040,6 @@
           <w:color w:val="181818"/>
           <w:spacing w:val="-6"/>
           <w:kern w:val="24"/>
-          <w:lang w:eastAsia="en-SE"/>
         </w:rPr>
         <w:t xml:space="preserve"> queue delay [s] </w:t>
       </w:r>
@@ -6035,7 +6065,6 @@
         <w:rPr>
           <w:rFonts w:ascii="Times New Roman" w:eastAsia="Times New Roman" w:hAnsi="Times New Roman" w:cs="Times New Roman"/>
           <w:color w:val="181818"/>
-          <w:lang w:val="en-SE" w:eastAsia="en-SE"/>
         </w:rPr>
       </w:pPr>
       <w:r>
@@ -6044,7 +6073,6 @@
           <w:color w:val="181818"/>
           <w:spacing w:val="-6"/>
           <w:kern w:val="24"/>
-          <w:lang w:eastAsia="en-SE"/>
         </w:rPr>
         <w:t xml:space="preserve">Col 3: </w:t>
       </w:r>
@@ -6054,7 +6082,6 @@
           <w:color w:val="181818"/>
           <w:spacing w:val="-6"/>
           <w:kern w:val="24"/>
-          <w:lang w:eastAsia="en-SE"/>
         </w:rPr>
         <w:t xml:space="preserve">RTT [s] </w:t>
       </w:r>
@@ -6080,7 +6107,6 @@
         <w:rPr>
           <w:rFonts w:ascii="Times New Roman" w:eastAsia="Times New Roman" w:hAnsi="Times New Roman" w:cs="Times New Roman"/>
           <w:color w:val="181818"/>
-          <w:lang w:val="en-SE" w:eastAsia="en-SE"/>
         </w:rPr>
       </w:pPr>
       <w:r>
@@ -6089,7 +6115,6 @@
           <w:color w:val="181818"/>
           <w:spacing w:val="-6"/>
           <w:kern w:val="24"/>
-          <w:lang w:eastAsia="en-SE"/>
         </w:rPr>
         <w:t xml:space="preserve">Col </w:t>
       </w:r>
@@ -6100,7 +6125,6 @@
           <w:color w:val="181818"/>
           <w:spacing w:val="-6"/>
           <w:kern w:val="24"/>
-          <w:lang w:eastAsia="en-SE"/>
         </w:rPr>
         <w:t>4:</w:t>
       </w:r>
@@ -6110,7 +6134,6 @@
           <w:color w:val="181818"/>
           <w:spacing w:val="-6"/>
           <w:kern w:val="24"/>
-          <w:lang w:eastAsia="en-SE"/>
         </w:rPr>
         <w:t>Congestion</w:t>
       </w:r>
@@ -6121,7 +6144,6 @@
           <w:color w:val="181818"/>
           <w:spacing w:val="-6"/>
           <w:kern w:val="24"/>
-          <w:lang w:eastAsia="en-SE"/>
         </w:rPr>
         <w:t xml:space="preserve"> window [byte] </w:t>
       </w:r>
@@ -6147,7 +6169,6 @@
         <w:rPr>
           <w:rFonts w:ascii="Times New Roman" w:eastAsia="Times New Roman" w:hAnsi="Times New Roman" w:cs="Times New Roman"/>
           <w:color w:val="181818"/>
-          <w:lang w:val="en-SE" w:eastAsia="en-SE"/>
         </w:rPr>
       </w:pPr>
       <w:r>
@@ -6156,7 +6177,6 @@
           <w:color w:val="181818"/>
           <w:spacing w:val="-6"/>
           <w:kern w:val="24"/>
-          <w:lang w:eastAsia="en-SE"/>
         </w:rPr>
         <w:t xml:space="preserve">Col 5: </w:t>
       </w:r>
@@ -6166,7 +6186,6 @@
           <w:color w:val="181818"/>
           <w:spacing w:val="-6"/>
           <w:kern w:val="24"/>
-          <w:lang w:eastAsia="en-SE"/>
         </w:rPr>
         <w:t xml:space="preserve">Bytes in flight [byte] </w:t>
       </w:r>
@@ -6192,7 +6211,6 @@
         <w:rPr>
           <w:rFonts w:ascii="Times New Roman" w:eastAsia="Times New Roman" w:hAnsi="Times New Roman" w:cs="Times New Roman"/>
           <w:color w:val="181818"/>
-          <w:lang w:val="en-SE" w:eastAsia="en-SE"/>
         </w:rPr>
       </w:pPr>
       <w:r>
@@ -6201,7 +6219,6 @@
           <w:color w:val="181818"/>
           <w:spacing w:val="-6"/>
           <w:kern w:val="24"/>
-          <w:lang w:val="en-SE" w:eastAsia="en-SE"/>
         </w:rPr>
         <w:t xml:space="preserve">Col 10: </w:t>
       </w:r>
@@ -6211,7 +6228,6 @@
           <w:color w:val="181818"/>
           <w:spacing w:val="-6"/>
           <w:kern w:val="24"/>
-          <w:lang w:eastAsia="en-SE"/>
         </w:rPr>
         <w:t xml:space="preserve">Bytes newly </w:t>
       </w:r>
@@ -6222,7 +6238,6 @@
           <w:color w:val="181818"/>
           <w:spacing w:val="-6"/>
           <w:kern w:val="24"/>
-          <w:lang w:eastAsia="en-SE"/>
         </w:rPr>
         <w:t>ACKed</w:t>
       </w:r>
@@ -6249,7 +6264,6 @@
         <w:rPr>
           <w:rFonts w:ascii="Times New Roman" w:eastAsia="Times New Roman" w:hAnsi="Times New Roman" w:cs="Times New Roman"/>
           <w:color w:val="181818"/>
-          <w:lang w:val="en-SE" w:eastAsia="en-SE"/>
         </w:rPr>
       </w:pPr>
       <w:r>
@@ -6258,7 +6272,6 @@
           <w:color w:val="181818"/>
           <w:spacing w:val="-6"/>
           <w:kern w:val="24"/>
-          <w:lang w:eastAsia="en-SE"/>
         </w:rPr>
         <w:t xml:space="preserve">Col 11: </w:t>
       </w:r>
@@ -6268,7 +6281,6 @@
           <w:color w:val="181818"/>
           <w:spacing w:val="-6"/>
           <w:kern w:val="24"/>
-          <w:lang w:eastAsia="en-SE"/>
         </w:rPr>
         <w:t xml:space="preserve">Bytes newly </w:t>
       </w:r>
@@ -6279,7 +6291,6 @@
           <w:color w:val="181818"/>
           <w:spacing w:val="-6"/>
           <w:kern w:val="24"/>
-          <w:lang w:eastAsia="en-SE"/>
         </w:rPr>
         <w:t>ACKed</w:t>
       </w:r>
@@ -6290,7 +6301,6 @@
           <w:color w:val="181818"/>
           <w:spacing w:val="-6"/>
           <w:kern w:val="24"/>
-          <w:lang w:eastAsia="en-SE"/>
         </w:rPr>
         <w:t xml:space="preserve"> and CE marked</w:t>
       </w:r>
@@ -6316,7 +6326,6 @@
         <w:rPr>
           <w:rFonts w:ascii="Times New Roman" w:eastAsia="Times New Roman" w:hAnsi="Times New Roman" w:cs="Times New Roman"/>
           <w:color w:val="181818"/>
-          <w:lang w:val="en-SE" w:eastAsia="en-SE"/>
         </w:rPr>
       </w:pPr>
       <w:r>
@@ -6325,7 +6334,6 @@
           <w:color w:val="181818"/>
           <w:spacing w:val="-6"/>
           <w:kern w:val="24"/>
-          <w:lang w:eastAsia="en-SE"/>
         </w:rPr>
         <w:t xml:space="preserve">Col 13: </w:t>
       </w:r>
@@ -6335,7 +6343,6 @@
           <w:color w:val="181818"/>
           <w:spacing w:val="-6"/>
           <w:kern w:val="24"/>
-          <w:lang w:eastAsia="en-SE"/>
         </w:rPr>
         <w:t xml:space="preserve">Transmitted bitrate [bps] </w:t>
       </w:r>
@@ -6361,7 +6368,6 @@
         <w:rPr>
           <w:rFonts w:ascii="Times New Roman" w:eastAsia="Times New Roman" w:hAnsi="Times New Roman" w:cs="Times New Roman"/>
           <w:color w:val="181818"/>
-          <w:lang w:val="en-SE" w:eastAsia="en-SE"/>
         </w:rPr>
       </w:pPr>
       <w:r>
@@ -6370,7 +6376,6 @@
           <w:color w:val="181818"/>
           <w:spacing w:val="-6"/>
           <w:kern w:val="24"/>
-          <w:lang w:eastAsia="en-SE"/>
         </w:rPr>
         <w:t xml:space="preserve">Col 14: </w:t>
       </w:r>
@@ -6381,7 +6386,6 @@
           <w:color w:val="181818"/>
           <w:spacing w:val="-6"/>
           <w:kern w:val="24"/>
-          <w:lang w:eastAsia="en-SE"/>
         </w:rPr>
         <w:t>ACKed</w:t>
       </w:r>
@@ -6392,7 +6396,6 @@
           <w:color w:val="181818"/>
           <w:spacing w:val="-6"/>
           <w:kern w:val="24"/>
-          <w:lang w:eastAsia="en-SE"/>
         </w:rPr>
         <w:t xml:space="preserve"> bitrate [bps] </w:t>
       </w:r>
@@ -6418,7 +6421,6 @@
         <w:rPr>
           <w:rFonts w:ascii="Times New Roman" w:eastAsia="Times New Roman" w:hAnsi="Times New Roman" w:cs="Times New Roman"/>
           <w:color w:val="181818"/>
-          <w:lang w:val="en-SE" w:eastAsia="en-SE"/>
         </w:rPr>
       </w:pPr>
       <w:r>
@@ -6427,7 +6429,6 @@
           <w:color w:val="181818"/>
           <w:spacing w:val="-6"/>
           <w:kern w:val="24"/>
-          <w:lang w:eastAsia="en-SE"/>
         </w:rPr>
         <w:t xml:space="preserve">Col 18: </w:t>
       </w:r>
@@ -6437,7 +6438,6 @@
           <w:color w:val="181818"/>
           <w:spacing w:val="-6"/>
           <w:kern w:val="24"/>
-          <w:lang w:eastAsia="en-SE"/>
         </w:rPr>
         <w:t>Target bitrate [bps]</w:t>
       </w:r>
@@ -6458,7 +6458,6 @@
           <w:color w:val="181818"/>
           <w:spacing w:val="-6"/>
           <w:kern w:val="24"/>
-          <w:lang w:eastAsia="en-SE"/>
         </w:rPr>
       </w:pPr>
     </w:p>
@@ -6473,155 +6472,97 @@
         </w:tabs>
         <w:rPr>
           <w:b/>
-          <w:lang w:val="en-SE" w:eastAsia="en-SE"/>
         </w:rPr>
       </w:pPr>
       <w:r>
-        <w:rPr>
-          <w:lang w:val="en-SE" w:eastAsia="en-SE"/>
-        </w:rPr>
         <w:br w:type="page"/>
       </w:r>
     </w:p>
     <w:p>
       <w:pPr>
         <w:pStyle w:val="Heading"/>
-        <w:rPr>
-          <w:lang w:val="en-SE" w:eastAsia="en-SE"/>
-        </w:rPr>
-      </w:pPr>
-      <w:r>
-        <w:rPr>
-          <w:lang w:val="en-SE" w:eastAsia="en-SE"/>
-        </w:rPr>
+      </w:pPr>
+      <w:r>
         <w:lastRenderedPageBreak/>
         <w:t>Examples</w:t>
       </w:r>
     </w:p>
     <w:p>
-      <w:pPr>
-        <w:rPr>
-          <w:lang w:val="en-SE" w:eastAsia="en-SE"/>
-        </w:rPr>
-      </w:pPr>
-      <w:r>
-        <w:rPr>
-          <w:lang w:val="en-SE" w:eastAsia="en-SE"/>
-        </w:rPr>
+      <w:r>
         <w:t xml:space="preserve">The logs can be displayed </w:t>
       </w:r>
       <w:r>
-        <w:rPr>
-          <w:lang w:val="en-SE" w:eastAsia="en-SE"/>
-        </w:rPr>
         <w:t xml:space="preserve">in </w:t>
       </w:r>
       <w:proofErr w:type="spellStart"/>
       <w:r>
-        <w:rPr>
-          <w:lang w:val="en-SE" w:eastAsia="en-SE"/>
-        </w:rPr>
         <w:t>matlab</w:t>
       </w:r>
       <w:proofErr w:type="spellEnd"/>
       <w:r>
-        <w:rPr>
-          <w:lang w:val="en-SE" w:eastAsia="en-SE"/>
-        </w:rPr>
         <w:t xml:space="preserve"> or octave. There are a few </w:t>
       </w:r>
       <w:proofErr w:type="spellStart"/>
-      <w:r>
-        <w:rPr>
-          <w:lang w:val="en-SE" w:eastAsia="en-SE"/>
-        </w:rPr>
+      <w:proofErr w:type="gramStart"/>
+      <w:r>
         <w:t>matlab</w:t>
       </w:r>
       <w:proofErr w:type="spellEnd"/>
       <w:r>
-        <w:rPr>
-          <w:lang w:val="en-SE" w:eastAsia="en-SE"/>
-        </w:rPr>
         <w:t xml:space="preserve"> (</w:t>
       </w:r>
       <w:r>
         <w:rPr>
           <w:b/>
           <w:bCs/>
-          <w:lang w:val="en-SE" w:eastAsia="en-SE"/>
         </w:rPr>
-        <w:t>.m</w:t>
-      </w:r>
+        <w:t>.</w:t>
+      </w:r>
+      <w:proofErr w:type="gramEnd"/>
       <w:r>
         <w:rPr>
-          <w:lang w:val="en-SE" w:eastAsia="en-SE"/>
+          <w:b/>
+          <w:bCs/>
         </w:rPr>
+        <w:t>m</w:t>
+      </w:r>
+      <w:r>
         <w:t>) scr</w:t>
       </w:r>
       <w:r>
-        <w:rPr>
-          <w:lang w:val="en-SE" w:eastAsia="en-SE"/>
-        </w:rPr>
         <w:t xml:space="preserve">ipts available. Example data is found in </w:t>
       </w:r>
       <w:proofErr w:type="gramStart"/>
       <w:r>
-        <w:rPr>
-          <w:lang w:val="en-SE" w:eastAsia="en-SE"/>
-        </w:rPr>
         <w:t>the .</w:t>
       </w:r>
       <w:proofErr w:type="gramEnd"/>
       <w:r>
-        <w:rPr>
-          <w:lang w:val="en-SE" w:eastAsia="en-SE"/>
-        </w:rPr>
         <w:t xml:space="preserve">/examples folder. The examples represent a simple test setup with a </w:t>
       </w:r>
       <w:r>
-        <w:rPr>
-          <w:lang w:val="en-SE" w:eastAsia="en-SE"/>
-        </w:rPr>
         <w:t xml:space="preserve">simple 50Mbps link with </w:t>
       </w:r>
       <w:proofErr w:type="spellStart"/>
       <w:r>
-        <w:rPr>
-          <w:lang w:val="en-SE" w:eastAsia="en-SE"/>
-        </w:rPr>
         <w:t>DualQ</w:t>
       </w:r>
       <w:proofErr w:type="spellEnd"/>
       <w:r>
-        <w:rPr>
-          <w:lang w:val="en-SE" w:eastAsia="en-SE"/>
-        </w:rPr>
         <w:t xml:space="preserve"> AQM and 20ms RTT</w:t>
       </w:r>
       <w:r>
-        <w:rPr>
-          <w:lang w:val="en-SE" w:eastAsia="en-SE"/>
-        </w:rPr>
         <w:t xml:space="preserve">. </w:t>
       </w:r>
       <w:proofErr w:type="spellStart"/>
       <w:r>
-        <w:rPr>
-          <w:lang w:val="en-SE" w:eastAsia="en-SE"/>
-        </w:rPr>
         <w:t>Matlad</w:t>
       </w:r>
       <w:proofErr w:type="spellEnd"/>
       <w:r>
-        <w:rPr>
-          <w:lang w:val="en-SE" w:eastAsia="en-SE"/>
-        </w:rPr>
         <w:t xml:space="preserve">/octave commands and the </w:t>
       </w:r>
       <w:r>
-        <w:rPr>
-          <w:lang w:val="en-SE" w:eastAsia="en-SE"/>
-        </w:rPr>
         <w:t xml:space="preserve">graphs are displayed below </w:t>
       </w:r>
     </w:p>
@@ -6632,21 +6573,18 @@
       <w:r>
         <w:rPr>
           <w:rFonts w:ascii="Courier New" w:hAnsi="Courier New" w:cs="Courier New"/>
-          <w:lang w:val="en-SE" w:eastAsia="en-SE"/>
         </w:rPr>
         <w:t xml:space="preserve">&gt; </w:t>
       </w:r>
       <w:r>
         <w:rPr>
           <w:rFonts w:ascii="Courier New" w:hAnsi="Courier New" w:cs="Courier New"/>
-          <w:lang w:val="en-SE" w:eastAsia="en-SE"/>
         </w:rPr>
         <w:t>a = load('./examples/trace-dualpi-50Mbps-25ms-nol4s.txt');</w:t>
       </w:r>
       <w:r>
         <w:rPr>
           <w:rFonts w:ascii="Courier New" w:hAnsi="Courier New" w:cs="Courier New"/>
-          <w:lang w:val="en-SE" w:eastAsia="en-SE"/>
         </w:rPr>
         <w:br/>
         <w:t xml:space="preserve">&gt; </w:t>
@@ -6655,7 +6593,6 @@
       <w:r>
         <w:rPr>
           <w:rFonts w:ascii="Courier New" w:hAnsi="Courier New" w:cs="Courier New"/>
-          <w:lang w:val="en-SE" w:eastAsia="en-SE"/>
         </w:rPr>
         <w:t>plot_thp_</w:t>
       </w:r>
@@ -6663,7 +6600,6 @@
       <w:r>
         <w:rPr>
           <w:rFonts w:ascii="Courier New" w:hAnsi="Courier New" w:cs="Courier New"/>
-          <w:lang w:val="en-SE" w:eastAsia="en-SE"/>
         </w:rPr>
         <w:t>delay</w:t>
       </w:r>
@@ -6671,7 +6607,6 @@
       <w:r>
         <w:rPr>
           <w:rFonts w:ascii="Courier New" w:hAnsi="Courier New" w:cs="Courier New"/>
-          <w:lang w:val="en-SE" w:eastAsia="en-SE"/>
         </w:rPr>
         <w:t>(</w:t>
       </w:r>
@@ -6679,14 +6614,26 @@
       <w:r>
         <w:rPr>
           <w:rFonts w:ascii="Courier New" w:hAnsi="Courier New" w:cs="Courier New"/>
-          <w:lang w:val="en-SE" w:eastAsia="en-SE"/>
         </w:rPr>
-        <w:t>a,0,[0 25],60,0.06);</w:t>
-      </w:r>
+        <w:t>a,</w:t>
+      </w:r>
+      <w:proofErr w:type="gramStart"/>
       <w:r>
         <w:rPr>
           <w:rFonts w:ascii="Courier New" w:hAnsi="Courier New" w:cs="Courier New"/>
-          <w:lang w:val="en-SE" w:eastAsia="en-SE"/>
+        </w:rPr>
+        <w:t>0,[</w:t>
+      </w:r>
+      <w:proofErr w:type="gramEnd"/>
+      <w:r>
+        <w:rPr>
+          <w:rFonts w:ascii="Courier New" w:hAnsi="Courier New" w:cs="Courier New"/>
+        </w:rPr>
+        <w:t>0 25],60,0.06);</w:t>
+      </w:r>
+      <w:r>
+        <w:rPr>
+          <w:rFonts w:ascii="Courier New" w:hAnsi="Courier New" w:cs="Courier New"/>
         </w:rPr>
         <w:br/>
       </w:r>
@@ -6696,7 +6643,6 @@
           <w:b/>
           <w:bCs/>
           <w:noProof/>
-          <w:lang w:val="en-SE" w:eastAsia="en-SE"/>
         </w:rPr>
         <w:drawing>
           <wp:inline distT="0" distB="0" distL="0" distR="0" wp14:anchorId="0AE910AE" wp14:editId="7E78E62D">
@@ -6753,7 +6699,6 @@
         <w:pStyle w:val="Caption"/>
         <w:rPr>
           <w:rFonts w:ascii="Courier New" w:hAnsi="Courier New" w:cs="Courier New"/>
-          <w:lang w:val="en-SE" w:eastAsia="en-SE"/>
         </w:rPr>
       </w:pPr>
       <w:r>
@@ -6801,13 +6746,11 @@
         </w:tabs>
         <w:rPr>
           <w:rFonts w:ascii="Courier New" w:hAnsi="Courier New" w:cs="Courier New"/>
-          <w:lang w:val="en-SE" w:eastAsia="en-SE"/>
         </w:rPr>
       </w:pPr>
       <w:r>
         <w:rPr>
           <w:rFonts w:ascii="Courier New" w:hAnsi="Courier New" w:cs="Courier New"/>
-          <w:lang w:val="en-SE" w:eastAsia="en-SE"/>
         </w:rPr>
         <w:br w:type="page"/>
       </w:r>
@@ -6816,13 +6759,11 @@
       <w:pPr>
         <w:rPr>
           <w:rFonts w:ascii="Courier New" w:hAnsi="Courier New" w:cs="Courier New"/>
-          <w:lang w:val="en-SE" w:eastAsia="en-SE"/>
         </w:rPr>
       </w:pPr>
       <w:r>
         <w:rPr>
           <w:rFonts w:ascii="Courier New" w:hAnsi="Courier New" w:cs="Courier New"/>
-          <w:lang w:val="en-SE" w:eastAsia="en-SE"/>
         </w:rPr>
         <w:lastRenderedPageBreak/>
         <w:t>&gt; b</w:t>
@@ -6830,14 +6771,12 @@
       <w:r>
         <w:rPr>
           <w:rFonts w:ascii="Courier New" w:hAnsi="Courier New" w:cs="Courier New"/>
-          <w:lang w:val="en-SE" w:eastAsia="en-SE"/>
         </w:rPr>
         <w:t xml:space="preserve"> = load('./examples/trace-dualpi-50Mbps-25ms-l4s.txt');</w:t>
       </w:r>
       <w:r>
         <w:rPr>
           <w:rFonts w:ascii="Courier New" w:hAnsi="Courier New" w:cs="Courier New"/>
-          <w:lang w:val="en-SE" w:eastAsia="en-SE"/>
         </w:rPr>
         <w:br/>
         <w:t xml:space="preserve">&gt; </w:t>
@@ -6846,7 +6785,6 @@
       <w:r>
         <w:rPr>
           <w:rFonts w:ascii="Courier New" w:hAnsi="Courier New" w:cs="Courier New"/>
-          <w:lang w:val="en-SE" w:eastAsia="en-SE"/>
         </w:rPr>
         <w:t>plot_thp_</w:t>
       </w:r>
@@ -6854,7 +6792,6 @@
       <w:r>
         <w:rPr>
           <w:rFonts w:ascii="Courier New" w:hAnsi="Courier New" w:cs="Courier New"/>
-          <w:lang w:val="en-SE" w:eastAsia="en-SE"/>
         </w:rPr>
         <w:t>delay</w:t>
       </w:r>
@@ -6862,7 +6799,6 @@
       <w:r>
         <w:rPr>
           <w:rFonts w:ascii="Courier New" w:hAnsi="Courier New" w:cs="Courier New"/>
-          <w:lang w:val="en-SE" w:eastAsia="en-SE"/>
         </w:rPr>
         <w:t>(</w:t>
       </w:r>
@@ -6870,16 +6806,28 @@
       <w:r>
         <w:rPr>
           <w:rFonts w:ascii="Courier New" w:hAnsi="Courier New" w:cs="Courier New"/>
-          <w:lang w:val="en-SE" w:eastAsia="en-SE"/>
         </w:rPr>
         <w:t>b</w:t>
       </w:r>
       <w:r>
         <w:rPr>
           <w:rFonts w:ascii="Courier New" w:hAnsi="Courier New" w:cs="Courier New"/>
-          <w:lang w:val="en-SE" w:eastAsia="en-SE"/>
         </w:rPr>
-        <w:t>,0,[0 25],60,0.06);</w:t>
+        <w:t>,</w:t>
+      </w:r>
+      <w:proofErr w:type="gramStart"/>
+      <w:r>
+        <w:rPr>
+          <w:rFonts w:ascii="Courier New" w:hAnsi="Courier New" w:cs="Courier New"/>
+        </w:rPr>
+        <w:t>0,[</w:t>
+      </w:r>
+      <w:proofErr w:type="gramEnd"/>
+      <w:r>
+        <w:rPr>
+          <w:rFonts w:ascii="Courier New" w:hAnsi="Courier New" w:cs="Courier New"/>
+        </w:rPr>
+        <w:t>0 25],60,0.06);</w:t>
       </w:r>
     </w:p>
     <w:p>
@@ -6892,7 +6840,6 @@
           <w:b/>
           <w:bCs/>
           <w:noProof/>
-          <w:lang w:val="en-SE" w:eastAsia="en-SE"/>
         </w:rPr>
         <w:drawing>
           <wp:inline distT="0" distB="0" distL="0" distR="0" wp14:anchorId="2E2A9CC5" wp14:editId="7DD4233D">
@@ -6951,7 +6898,6 @@
           <w:rFonts w:ascii="Courier New" w:hAnsi="Courier New" w:cs="Courier New"/>
           <w:b/>
           <w:bCs w:val="0"/>
-          <w:lang w:val="en-SE" w:eastAsia="en-SE"/>
         </w:rPr>
       </w:pPr>
       <w:r>
@@ -6989,7 +6935,6 @@
       <w:r>
         <w:rPr>
           <w:rFonts w:ascii="Courier New" w:hAnsi="Courier New" w:cs="Courier New"/>
-          <w:lang w:val="en-SE" w:eastAsia="en-SE"/>
         </w:rPr>
         <w:lastRenderedPageBreak/>
         <w:t xml:space="preserve">&gt; </w:t>
@@ -6998,7 +6943,6 @@
       <w:r>
         <w:rPr>
           <w:rFonts w:ascii="Courier New" w:hAnsi="Courier New" w:cs="Courier New"/>
-          <w:lang w:val="en-SE" w:eastAsia="en-SE"/>
         </w:rPr>
         <w:t>plot_</w:t>
       </w:r>
@@ -7006,7 +6950,6 @@
       <w:r>
         <w:rPr>
           <w:rFonts w:ascii="Courier New" w:hAnsi="Courier New" w:cs="Courier New"/>
-          <w:lang w:val="en-SE" w:eastAsia="en-SE"/>
         </w:rPr>
         <w:t>cdf</w:t>
       </w:r>
@@ -7014,24 +6957,21 @@
       <w:r>
         <w:rPr>
           <w:rFonts w:ascii="Courier New" w:hAnsi="Courier New" w:cs="Courier New"/>
-          <w:lang w:val="en-SE" w:eastAsia="en-SE"/>
         </w:rPr>
-        <w:t>(</w:t>
+        <w:t>(a,[</w:t>
       </w:r>
       <w:proofErr w:type="gramEnd"/>
       <w:r>
         <w:rPr>
           <w:rFonts w:ascii="Courier New" w:hAnsi="Courier New" w:cs="Courier New"/>
-          <w:lang w:val="en-SE" w:eastAsia="en-SE"/>
         </w:rPr>
-        <w:t>a,[0 20],0.06);</w:t>
+        <w:t>0 20],0.06);</w:t>
       </w:r>
       <w:r>
         <w:rPr>
           <w:rFonts w:ascii="Courier New" w:hAnsi="Courier New" w:cs="Courier New"/>
           <w:b/>
           <w:bCs/>
-          <w:lang w:val="en-SE" w:eastAsia="en-SE"/>
         </w:rPr>
         <w:br/>
       </w:r>
@@ -7041,7 +6981,6 @@
           <w:b/>
           <w:bCs/>
           <w:noProof/>
-          <w:lang w:val="en-SE" w:eastAsia="en-SE"/>
         </w:rPr>
         <w:drawing>
           <wp:inline distT="0" distB="0" distL="0" distR="0" wp14:anchorId="50438277" wp14:editId="360B7273">
@@ -7100,7 +7039,6 @@
           <w:rFonts w:ascii="Courier New" w:hAnsi="Courier New" w:cs="Courier New"/>
           <w:b/>
           <w:bCs w:val="0"/>
-          <w:lang w:val="en-SE" w:eastAsia="en-SE"/>
         </w:rPr>
       </w:pPr>
       <w:r>
@@ -7152,11 +7090,6 @@
       </w:r>
     </w:p>
     <w:p>
-      <w:pPr>
-        <w:rPr>
-          <w:lang w:val="en-SE"/>
-        </w:rPr>
-      </w:pPr>
       <w:r>
         <w:t>The -</w:t>
       </w:r>
@@ -7166,46 +7099,32 @@
       </w:r>
       <w:proofErr w:type="spellEnd"/>
       <w:r>
-        <w:t xml:space="preserve"> option logs transmit and receive times for RTP packets. </w:t>
+        <w:t xml:space="preserve"> option logs </w:t>
+      </w:r>
+      <w:proofErr w:type="gramStart"/>
+      <w:r>
+        <w:t>transmit and receive</w:t>
+      </w:r>
+      <w:proofErr w:type="gramEnd"/>
+      <w:r>
+        <w:t xml:space="preserve"> times for RTP packets. </w:t>
       </w:r>
     </w:p>
     <w:p>
-      <w:pPr>
-        <w:rPr>
-          <w:lang w:val="en-SE"/>
-        </w:rPr>
-      </w:pPr>
-      <w:r>
-        <w:rPr>
-          <w:lang w:val="en-SE"/>
-        </w:rPr>
+      <w:r>
         <w:t>This feature may be useful for postprocessing and e.g. evaluation of things like out of sequence delivery of packets. </w:t>
       </w:r>
     </w:p>
     <w:p>
-      <w:pPr>
-        <w:rPr>
-          <w:lang w:val="en-SE"/>
-        </w:rPr>
-      </w:pPr>
-      <w:r>
-        <w:rPr>
-          <w:lang w:val="en-SE"/>
-        </w:rPr>
+      <w:r>
         <w:t>The data format is one line per RTP packet</w:t>
       </w:r>
     </w:p>
     <w:p>
-      <w:pPr>
-        <w:rPr>
-          <w:lang w:val="en-SE"/>
-        </w:rPr>
-      </w:pPr>
       <w:r>
         <w:rPr>
           <w:b/>
           <w:bCs/>
-          <w:lang w:val="en-SE"/>
         </w:rPr>
         <w:t>time[</w:t>
       </w:r>
@@ -7214,7 +7133,6 @@
         <w:rPr>
           <w:b/>
           <w:bCs/>
-          <w:lang w:val="en-SE"/>
         </w:rPr>
         <w:t>s]  </w:t>
       </w:r>
@@ -7223,7 +7141,6 @@
         <w:rPr>
           <w:b/>
           <w:bCs/>
-          <w:lang w:val="en-SE"/>
         </w:rPr>
         <w:t>seqNr</w:t>
       </w:r>
@@ -7233,7 +7150,6 @@
         <w:rPr>
           <w:b/>
           <w:bCs/>
-          <w:lang w:val="en-SE"/>
         </w:rPr>
         <w:t xml:space="preserve">  </w:t>
       </w:r>
@@ -7242,7 +7158,6 @@
         <w:rPr>
           <w:b/>
           <w:bCs/>
-          <w:lang w:val="en-SE"/>
         </w:rPr>
         <w:t>txTime</w:t>
       </w:r>
@@ -7251,7 +7166,6 @@
         <w:rPr>
           <w:b/>
           <w:bCs/>
-          <w:lang w:val="en-SE"/>
         </w:rPr>
         <w:t xml:space="preserve">[s] </w:t>
       </w:r>
@@ -7260,7 +7174,6 @@
         <w:rPr>
           <w:b/>
           <w:bCs/>
-          <w:lang w:val="en-SE"/>
         </w:rPr>
         <w:t>rxTime</w:t>
       </w:r>
@@ -7269,59 +7182,58 @@
         <w:rPr>
           <w:b/>
           <w:bCs/>
-          <w:lang w:val="en-SE"/>
         </w:rPr>
-        <w:t xml:space="preserve">[s]     </w:t>
-      </w:r>
-      <w:proofErr w:type="spellStart"/>
+        <w:t>[</w:t>
+      </w:r>
+      <w:proofErr w:type="gramStart"/>
       <w:r>
         <w:rPr>
           <w:b/>
           <w:bCs/>
-          <w:lang w:val="en-SE"/>
+        </w:rPr>
+        <w:t xml:space="preserve">s]   </w:t>
+      </w:r>
+      <w:proofErr w:type="gramEnd"/>
+      <w:r>
+        <w:rPr>
+          <w:b/>
+          <w:bCs/>
+        </w:rPr>
+        <w:t xml:space="preserve">  </w:t>
+      </w:r>
+      <w:proofErr w:type="spellStart"/>
+      <w:r>
+        <w:rPr>
+          <w:b/>
+          <w:bCs/>
         </w:rPr>
         <w:t>rxTime-txTime</w:t>
       </w:r>
       <w:proofErr w:type="spellEnd"/>
     </w:p>
     <w:p>
-      <w:pPr>
-        <w:rPr>
-          <w:lang w:val="en-SE"/>
-        </w:rPr>
-      </w:pPr>
-      <w:r>
-        <w:rPr>
-          <w:lang w:val="en-SE"/>
-        </w:rPr>
-        <w:t xml:space="preserve">If case the packet was lost or just too late to be </w:t>
+      <w:proofErr w:type="gramStart"/>
+      <w:r>
+        <w:t>If case</w:t>
+      </w:r>
+      <w:proofErr w:type="gramEnd"/>
+      <w:r>
+        <w:t xml:space="preserve"> the packet was lost or just too late to be </w:t>
       </w:r>
       <w:proofErr w:type="spellStart"/>
       <w:r>
-        <w:rPr>
-          <w:lang w:val="en-SE"/>
-        </w:rPr>
         <w:t>ACKed</w:t>
       </w:r>
       <w:proofErr w:type="spellEnd"/>
       <w:r>
-        <w:rPr>
-          <w:lang w:val="en-SE"/>
-        </w:rPr>
         <w:t xml:space="preserve"> properly the line will be</w:t>
       </w:r>
     </w:p>
     <w:p>
-      <w:pPr>
-        <w:rPr>
-          <w:lang w:val="en-SE"/>
-        </w:rPr>
-      </w:pPr>
       <w:r>
         <w:rPr>
           <w:b/>
           <w:bCs/>
-          <w:lang w:val="en-SE"/>
         </w:rPr>
         <w:t xml:space="preserve">time[s] </w:t>
       </w:r>
@@ -7330,7 +7242,6 @@
         <w:rPr>
           <w:b/>
           <w:bCs/>
-          <w:lang w:val="en-SE"/>
         </w:rPr>
         <w:t>seqNr</w:t>
       </w:r>
@@ -7339,7 +7250,6 @@
         <w:rPr>
           <w:b/>
           <w:bCs/>
-          <w:lang w:val="en-SE"/>
         </w:rPr>
         <w:t xml:space="preserve"> </w:t>
       </w:r>
@@ -7348,7 +7258,6 @@
         <w:rPr>
           <w:b/>
           <w:bCs/>
-          <w:lang w:val="en-SE"/>
         </w:rPr>
         <w:t>txTime</w:t>
       </w:r>
@@ -7357,61 +7266,34 @@
         <w:rPr>
           <w:b/>
           <w:bCs/>
-          <w:lang w:val="en-SE"/>
         </w:rPr>
         <w:t>[s] -1.0 -1.0</w:t>
       </w:r>
     </w:p>
     <w:p>
-      <w:pPr>
-        <w:rPr>
-          <w:lang w:val="en-SE"/>
-        </w:rPr>
-      </w:pPr>
-      <w:r>
-        <w:rPr>
-          <w:lang w:val="en-SE"/>
-        </w:rPr>
+      <w:r>
         <w:t xml:space="preserve">Note 1: </w:t>
       </w:r>
       <w:proofErr w:type="spellStart"/>
       <w:r>
-        <w:rPr>
-          <w:lang w:val="en-SE"/>
-        </w:rPr>
         <w:t>rxTime-txTime</w:t>
       </w:r>
       <w:proofErr w:type="spellEnd"/>
       <w:r>
-        <w:rPr>
-          <w:lang w:val="en-SE"/>
-        </w:rPr>
         <w:t xml:space="preserve"> will have an offset that needs to be subtracted</w:t>
       </w:r>
       <w:r>
-        <w:rPr>
-          <w:lang w:val="en-SE"/>
-        </w:rPr>
         <w:t xml:space="preserve">. The simple </w:t>
       </w:r>
       <w:proofErr w:type="spellStart"/>
       <w:r>
-        <w:rPr>
-          <w:lang w:val="en-SE"/>
-        </w:rPr>
         <w:t>matlab</w:t>
       </w:r>
       <w:proofErr w:type="spellEnd"/>
       <w:r>
-        <w:rPr>
-          <w:lang w:val="en-SE"/>
-        </w:rPr>
         <w:t xml:space="preserve"> code below fixes this.</w:t>
       </w:r>
       <w:r>
-        <w:rPr>
-          <w:lang w:val="en-SE"/>
-        </w:rPr>
         <w:br/>
       </w:r>
       <w:r>
@@ -7419,7 +7301,6 @@
           <w:rFonts w:ascii="Courier New" w:hAnsi="Courier New" w:cs="Courier New"/>
           <w:sz w:val="16"/>
           <w:szCs w:val="16"/>
-          <w:lang w:val="en-SE"/>
         </w:rPr>
         <w:t xml:space="preserve">&gt; a = % vector of </w:t>
       </w:r>
@@ -7429,7 +7310,6 @@
           <w:rFonts w:ascii="Courier New" w:hAnsi="Courier New" w:cs="Courier New"/>
           <w:sz w:val="16"/>
           <w:szCs w:val="16"/>
-          <w:lang w:val="en-SE"/>
         </w:rPr>
         <w:t>rxTime-txTime</w:t>
       </w:r>
@@ -7439,7 +7319,6 @@
           <w:rFonts w:ascii="Courier New" w:hAnsi="Courier New" w:cs="Courier New"/>
           <w:sz w:val="16"/>
           <w:szCs w:val="16"/>
-          <w:lang w:val="en-SE"/>
         </w:rPr>
         <w:t xml:space="preserve"> </w:t>
       </w:r>
@@ -7449,7 +7328,6 @@
           <w:rFonts w:ascii="Courier New" w:hAnsi="Courier New" w:cs="Courier New"/>
           <w:sz w:val="16"/>
           <w:szCs w:val="16"/>
-          <w:lang w:val="en-SE"/>
         </w:rPr>
         <w:t>i.e</w:t>
       </w:r>
@@ -7459,7 +7337,6 @@
           <w:rFonts w:ascii="Courier New" w:hAnsi="Courier New" w:cs="Courier New"/>
           <w:sz w:val="16"/>
           <w:szCs w:val="16"/>
-          <w:lang w:val="en-SE"/>
         </w:rPr>
         <w:t xml:space="preserve"> </w:t>
       </w:r>
@@ -7468,7 +7345,6 @@
           <w:rFonts w:ascii="Courier New" w:hAnsi="Courier New" w:cs="Courier New"/>
           <w:sz w:val="16"/>
           <w:szCs w:val="16"/>
-          <w:lang w:val="en-SE"/>
         </w:rPr>
         <w:t>5</w:t>
       </w:r>
@@ -7478,7 +7354,6 @@
           <w:sz w:val="16"/>
           <w:szCs w:val="16"/>
           <w:vertAlign w:val="superscript"/>
-          <w:lang w:val="en-SE"/>
         </w:rPr>
         <w:t>th</w:t>
       </w:r>
@@ -7487,7 +7362,6 @@
           <w:rFonts w:ascii="Courier New" w:hAnsi="Courier New" w:cs="Courier New"/>
           <w:sz w:val="16"/>
           <w:szCs w:val="16"/>
-          <w:lang w:val="en-SE"/>
         </w:rPr>
         <w:t xml:space="preserve"> column in </w:t>
       </w:r>
@@ -7497,7 +7371,6 @@
           <w:rFonts w:ascii="Courier New" w:hAnsi="Courier New" w:cs="Courier New"/>
           <w:sz w:val="16"/>
           <w:szCs w:val="16"/>
-          <w:lang w:val="en-SE"/>
         </w:rPr>
         <w:t>tx</w:t>
       </w:r>
@@ -7507,7 +7380,6 @@
           <w:rFonts w:ascii="Courier New" w:hAnsi="Courier New" w:cs="Courier New"/>
           <w:sz w:val="16"/>
           <w:szCs w:val="16"/>
-          <w:lang w:val="en-SE"/>
         </w:rPr>
         <w:t xml:space="preserve"> </w:t>
       </w:r>
@@ -7517,7 +7389,6 @@
           <w:rFonts w:ascii="Courier New" w:hAnsi="Courier New" w:cs="Courier New"/>
           <w:sz w:val="16"/>
           <w:szCs w:val="16"/>
-          <w:lang w:val="en-SE"/>
         </w:rPr>
         <w:t>rx</w:t>
       </w:r>
@@ -7527,7 +7398,6 @@
           <w:rFonts w:ascii="Courier New" w:hAnsi="Courier New" w:cs="Courier New"/>
           <w:sz w:val="16"/>
           <w:szCs w:val="16"/>
-          <w:lang w:val="en-SE"/>
         </w:rPr>
         <w:t xml:space="preserve"> logfile</w:t>
       </w:r>
@@ -7536,7 +7406,6 @@
           <w:rFonts w:ascii="Courier New" w:hAnsi="Courier New" w:cs="Courier New"/>
           <w:sz w:val="16"/>
           <w:szCs w:val="16"/>
-          <w:lang w:val="en-SE"/>
         </w:rPr>
         <w:br/>
         <w:t xml:space="preserve">&gt; ix = </w:t>
@@ -7547,7 +7416,6 @@
           <w:rFonts w:ascii="Courier New" w:hAnsi="Courier New" w:cs="Courier New"/>
           <w:sz w:val="16"/>
           <w:szCs w:val="16"/>
-          <w:lang w:val="en-SE"/>
         </w:rPr>
         <w:t>find(</w:t>
       </w:r>
@@ -7557,7 +7425,6 @@
           <w:rFonts w:ascii="Courier New" w:hAnsi="Courier New" w:cs="Courier New"/>
           <w:sz w:val="16"/>
           <w:szCs w:val="16"/>
-          <w:lang w:val="en-SE"/>
         </w:rPr>
         <w:t>a &gt; 0.0); % Only entries that that represent successfully transmitted packets</w:t>
       </w:r>
@@ -7566,7 +7433,6 @@
           <w:rFonts w:ascii="Courier New" w:hAnsi="Courier New" w:cs="Courier New"/>
           <w:sz w:val="16"/>
           <w:szCs w:val="16"/>
-          <w:lang w:val="en-SE"/>
         </w:rPr>
         <w:br/>
       </w:r>
@@ -7575,7 +7441,6 @@
           <w:rFonts w:ascii="Courier New" w:hAnsi="Courier New" w:cs="Courier New"/>
           <w:sz w:val="16"/>
           <w:szCs w:val="16"/>
-          <w:lang w:val="en-SE"/>
         </w:rPr>
         <w:lastRenderedPageBreak/>
         <w:t xml:space="preserve">&gt; </w:t>
@@ -7586,7 +7451,6 @@
           <w:rFonts w:ascii="Courier New" w:hAnsi="Courier New" w:cs="Courier New"/>
           <w:sz w:val="16"/>
           <w:szCs w:val="16"/>
-          <w:lang w:val="en-SE"/>
         </w:rPr>
         <w:t>a_min</w:t>
       </w:r>
@@ -7596,7 +7460,6 @@
           <w:rFonts w:ascii="Courier New" w:hAnsi="Courier New" w:cs="Courier New"/>
           <w:sz w:val="16"/>
           <w:szCs w:val="16"/>
-          <w:lang w:val="en-SE"/>
         </w:rPr>
         <w:t xml:space="preserve"> = min(a(ix));  </w:t>
       </w:r>
@@ -7605,7 +7468,6 @@
           <w:rFonts w:ascii="Courier New" w:hAnsi="Courier New" w:cs="Courier New"/>
           <w:sz w:val="16"/>
           <w:szCs w:val="16"/>
-          <w:lang w:val="en-SE"/>
         </w:rPr>
         <w:br/>
         <w:t>&gt; a(ix) = a(ix)-</w:t>
@@ -7616,7 +7478,6 @@
           <w:rFonts w:ascii="Courier New" w:hAnsi="Courier New" w:cs="Courier New"/>
           <w:sz w:val="16"/>
           <w:szCs w:val="16"/>
-          <w:lang w:val="en-SE"/>
         </w:rPr>
         <w:t>a_min</w:t>
       </w:r>
@@ -7626,134 +7487,77 @@
           <w:rFonts w:ascii="Courier New" w:hAnsi="Courier New" w:cs="Courier New"/>
           <w:sz w:val="16"/>
           <w:szCs w:val="16"/>
-          <w:lang w:val="en-SE"/>
         </w:rPr>
         <w:t>;</w:t>
       </w:r>
     </w:p>
     <w:p>
-      <w:pPr>
-        <w:rPr>
-          <w:lang w:val="en-SE"/>
-        </w:rPr>
-      </w:pPr>
-      <w:r>
-        <w:rPr>
-          <w:lang w:val="en-SE"/>
-        </w:rPr>
+      <w:r>
         <w:t xml:space="preserve">Note 2: </w:t>
       </w:r>
       <w:proofErr w:type="spellStart"/>
       <w:r>
-        <w:rPr>
-          <w:lang w:val="en-SE"/>
-        </w:rPr>
         <w:t>rxTime-txTime</w:t>
       </w:r>
       <w:proofErr w:type="spellEnd"/>
       <w:r>
-        <w:rPr>
-          <w:lang w:val="en-SE"/>
-        </w:rPr>
         <w:t xml:space="preserve"> may be skewed by clock drift that need</w:t>
       </w:r>
       <w:r>
-        <w:rPr>
-          <w:lang w:val="en-SE"/>
-        </w:rPr>
         <w:t>s</w:t>
       </w:r>
       <w:r>
-        <w:rPr>
-          <w:lang w:val="en-SE"/>
-        </w:rPr>
         <w:t xml:space="preserve"> to be corrected for</w:t>
       </w:r>
       <w:r>
-        <w:rPr>
-          <w:lang w:val="en-SE"/>
-        </w:rPr>
         <w:t xml:space="preserve">. This </w:t>
       </w:r>
       <w:proofErr w:type="spellStart"/>
       <w:r>
-        <w:rPr>
-          <w:lang w:val="en-SE"/>
-        </w:rPr>
         <w:t>clockdrift</w:t>
       </w:r>
       <w:proofErr w:type="spellEnd"/>
       <w:r>
-        <w:rPr>
-          <w:lang w:val="en-SE"/>
-        </w:rPr>
-        <w:t xml:space="preserve"> is mostly monotonically increasing or decreasing and can for instance be resolved with a 1</w:t>
+        <w:t xml:space="preserve"> is mostly monotonically increasing or decreasing and can for instance be resolved with </w:t>
+      </w:r>
+      <w:proofErr w:type="gramStart"/>
+      <w:r>
+        <w:t>a 1</w:t>
       </w:r>
       <w:r>
         <w:rPr>
           <w:vertAlign w:val="superscript"/>
-          <w:lang w:val="en-SE"/>
         </w:rPr>
         <w:t>st</w:t>
       </w:r>
-      <w:r>
-        <w:rPr>
-          <w:lang w:val="en-SE"/>
-        </w:rPr>
+      <w:proofErr w:type="gramEnd"/>
+      <w:r>
         <w:t xml:space="preserve"> order least square fit.</w:t>
       </w:r>
     </w:p>
     <w:p>
-      <w:pPr>
-        <w:rPr>
-          <w:lang w:val="en-SE"/>
-        </w:rPr>
-      </w:pPr>
-      <w:r>
-        <w:rPr>
-          <w:lang w:val="en-SE"/>
-        </w:rPr>
+      <w:r>
         <w:t>Note 3: Given that the RX timestamps are given by the RFC8888 RTCP feedback, the accuracy can never be better than 1.0/1024 seconds.</w:t>
       </w:r>
     </w:p>
     <w:p>
-      <w:pPr>
-        <w:rPr>
-          <w:lang w:val="en-SE"/>
-        </w:rPr>
-      </w:pPr>
-      <w:r>
-        <w:rPr>
-          <w:lang w:val="en-SE"/>
-        </w:rPr>
+      <w:r>
         <w:t xml:space="preserve">Note 4: The times are based on a </w:t>
       </w:r>
       <w:proofErr w:type="gramStart"/>
       <w:r>
-        <w:rPr>
-          <w:lang w:val="en-SE"/>
-        </w:rPr>
         <w:t>32 bit</w:t>
       </w:r>
       <w:proofErr w:type="gramEnd"/>
       <w:r>
-        <w:rPr>
-          <w:lang w:val="en-SE"/>
-        </w:rPr>
         <w:t xml:space="preserve"> unsigned NTP time where the 16 MSB are seconds and the 16 LSB are decimal seconds. This means that the time stamp values can wrap around at 65536 seconds. </w:t>
       </w:r>
     </w:p>
     <w:p>
       <w:pPr>
         <w:pStyle w:val="Heading"/>
-        <w:rPr>
-          <w:lang w:val="en-SE"/>
-        </w:rPr>
-      </w:pPr>
-      <w:r>
-        <w:rPr>
-          <w:lang w:val="en-SE"/>
-        </w:rPr>
+      </w:pPr>
+      <w:r>
         <w:t>Example</w:t>
       </w:r>
     </w:p>
@@ -7761,34 +7565,29 @@
       <w:pPr>
         <w:rPr>
           <w:rFonts w:ascii="Courier New" w:hAnsi="Courier New" w:cs="Courier New"/>
-          <w:lang w:val="en-SE"/>
         </w:rPr>
       </w:pPr>
       <w:r>
         <w:rPr>
           <w:rFonts w:ascii="Courier New" w:hAnsi="Courier New" w:cs="Courier New"/>
-          <w:lang w:val="en-SE"/>
         </w:rPr>
         <w:t>&gt;</w:t>
       </w:r>
       <w:r>
         <w:rPr>
           <w:rFonts w:ascii="Courier New" w:hAnsi="Courier New" w:cs="Courier New"/>
-          <w:lang w:val="en-SE"/>
         </w:rPr>
         <w:t xml:space="preserve"> </w:t>
       </w:r>
       <w:r>
         <w:rPr>
           <w:rFonts w:ascii="Courier New" w:hAnsi="Courier New" w:cs="Courier New"/>
-          <w:lang w:val="en-SE"/>
         </w:rPr>
         <w:t>a = load('./examples/trace-dualpi-50Mbps-25ms-l4s-txrx.txt');</w:t>
       </w:r>
       <w:r>
         <w:rPr>
           <w:rFonts w:ascii="Courier New" w:hAnsi="Courier New" w:cs="Courier New"/>
-          <w:lang w:val="en-SE"/>
         </w:rPr>
         <w:br/>
         <w:t xml:space="preserve">&gt; </w:t>
@@ -7797,7 +7596,6 @@
       <w:r>
         <w:rPr>
           <w:rFonts w:ascii="Courier New" w:hAnsi="Courier New" w:cs="Courier New"/>
-          <w:lang w:val="en-SE"/>
         </w:rPr>
         <w:t>plot_</w:t>
       </w:r>
@@ -7805,7 +7603,6 @@
       <w:r>
         <w:rPr>
           <w:rFonts w:ascii="Courier New" w:hAnsi="Courier New" w:cs="Courier New"/>
-          <w:lang w:val="en-SE"/>
         </w:rPr>
         <w:t>txrx</w:t>
       </w:r>
@@ -7813,17 +7610,15 @@
       <w:r>
         <w:rPr>
           <w:rFonts w:ascii="Courier New" w:hAnsi="Courier New" w:cs="Courier New"/>
-          <w:lang w:val="en-SE"/>
         </w:rPr>
-        <w:t>(</w:t>
+        <w:t>(a,[</w:t>
       </w:r>
       <w:proofErr w:type="gramEnd"/>
       <w:r>
         <w:rPr>
           <w:rFonts w:ascii="Courier New" w:hAnsi="Courier New" w:cs="Courier New"/>
-          <w:lang w:val="en-SE"/>
         </w:rPr>
-        <w:t>a,[0 20],0.01);</w:t>
+        <w:t>0 20],0.01);</w:t>
       </w:r>
     </w:p>
     <w:p>
@@ -7889,7 +7684,6 @@
         <w:pStyle w:val="Caption"/>
         <w:rPr>
           <w:rFonts w:ascii="Courier New" w:hAnsi="Courier New" w:cs="Courier New"/>
-          <w:lang w:val="en-SE"/>
         </w:rPr>
       </w:pPr>
       <w:r>
@@ -7921,7 +7715,6 @@
       <w:pPr>
         <w:rPr>
           <w:rFonts w:ascii="Courier New" w:hAnsi="Courier New" w:cs="Courier New"/>
-          <w:lang w:val="en-SE"/>
         </w:rPr>
       </w:pPr>
     </w:p>
@@ -7946,7 +7739,15 @@
     </w:p>
     <w:p>
       <w:r>
-        <w:t xml:space="preserve">Limited socket buffers can lead to lost packets, this issue is particularly relevant when the </w:t>
+        <w:t xml:space="preserve">Limited socket buffers can lead to lost </w:t>
+      </w:r>
+      <w:proofErr w:type="gramStart"/>
+      <w:r>
+        <w:t>packets,</w:t>
+      </w:r>
+      <w:proofErr w:type="gramEnd"/>
+      <w:r>
+        <w:t xml:space="preserve"> this issue is particularly relevant when the </w:t>
       </w:r>
       <w:proofErr w:type="spellStart"/>
       <w:r>
@@ -7958,11 +7759,6 @@
       </w:r>
     </w:p>
     <w:p>
-      <w:pPr>
-        <w:rPr>
-          <w:lang w:val="en-SE"/>
-        </w:rPr>
-      </w:pPr>
       <w:r>
         <w:t>To avoid dropped packet due to socket buffer overflow it is recommended to add the following lines to /</w:t>
       </w:r>
@@ -8013,7 +7809,6 @@
       <w:r>
         <w:rPr>
           <w:rFonts w:ascii="Courier New" w:hAnsi="Courier New" w:cs="Courier New"/>
-          <w:lang w:val="en-SE"/>
         </w:rPr>
         <w:br/>
       </w:r>
@@ -8021,7 +7816,6 @@
       <w:r>
         <w:rPr>
           <w:rFonts w:ascii="Courier New" w:hAnsi="Courier New" w:cs="Courier New"/>
-          <w:lang w:val="en-SE"/>
         </w:rPr>
         <w:t>net.core.wmem_default</w:t>
       </w:r>
@@ -8029,14 +7823,12 @@
       <w:r>
         <w:rPr>
           <w:rFonts w:ascii="Courier New" w:hAnsi="Courier New" w:cs="Courier New"/>
-          <w:lang w:val="en-SE"/>
         </w:rPr>
         <w:t>=26214400</w:t>
       </w:r>
       <w:r>
         <w:rPr>
           <w:rFonts w:ascii="Courier New" w:hAnsi="Courier New" w:cs="Courier New"/>
-          <w:lang w:val="en-SE"/>
         </w:rPr>
         <w:br/>
       </w:r>
@@ -8044,7 +7836,6 @@
       <w:r>
         <w:rPr>
           <w:rFonts w:ascii="Courier New" w:hAnsi="Courier New" w:cs="Courier New"/>
-          <w:lang w:val="en-SE"/>
         </w:rPr>
         <w:t>net.core.rmem_max</w:t>
       </w:r>
@@ -8052,14 +7843,12 @@
       <w:r>
         <w:rPr>
           <w:rFonts w:ascii="Courier New" w:hAnsi="Courier New" w:cs="Courier New"/>
-          <w:lang w:val="en-SE"/>
         </w:rPr>
         <w:t>=26214400</w:t>
       </w:r>
       <w:r>
         <w:rPr>
           <w:rFonts w:ascii="Courier New" w:hAnsi="Courier New" w:cs="Courier New"/>
-          <w:lang w:val="en-SE"/>
         </w:rPr>
         <w:br/>
       </w:r>
@@ -8129,11 +7918,6 @@
       </w:r>
     </w:p>
     <w:p>
-      <w:pPr>
-        <w:rPr>
-          <w:lang w:val="en-SE"/>
-        </w:rPr>
-      </w:pPr>
       <w:r>
         <w:t xml:space="preserve">The general rule is that the </w:t>
       </w:r>
@@ -8152,128 +7936,80 @@
         <w:t>first</w:t>
       </w:r>
       <w:r>
-        <w:t xml:space="preserve"> started on the PC that is on the modem side, regardless if is the s</w:t>
+        <w:t xml:space="preserve"> started on the PC that is on the modem side, </w:t>
+      </w:r>
+      <w:proofErr w:type="gramStart"/>
+      <w:r>
+        <w:t>regardless</w:t>
+      </w:r>
+      <w:proofErr w:type="gramEnd"/>
+      <w:r>
+        <w:t xml:space="preserve"> if is the </w:t>
       </w:r>
       <w:proofErr w:type="spellStart"/>
       <w:r>
-        <w:rPr>
-          <w:lang w:val="en-SE"/>
-        </w:rPr>
+        <w:t>s</w:t>
+      </w:r>
+      <w:r>
         <w:t>cream_bw_test_rx</w:t>
       </w:r>
       <w:proofErr w:type="spellEnd"/>
       <w:r>
-        <w:rPr>
-          <w:lang w:val="en-SE"/>
-        </w:rPr>
         <w:t xml:space="preserve"> </w:t>
       </w:r>
       <w:r>
-        <w:rPr>
-          <w:lang w:val="en-SE"/>
-        </w:rPr>
         <w:t xml:space="preserve">or </w:t>
       </w:r>
       <w:proofErr w:type="gramStart"/>
       <w:r>
-        <w:rPr>
-          <w:lang w:val="en-SE"/>
-        </w:rPr>
         <w:t xml:space="preserve">the </w:t>
       </w:r>
       <w:r>
-        <w:rPr>
-          <w:lang w:val="en-SE"/>
-        </w:rPr>
         <w:t xml:space="preserve"> </w:t>
       </w:r>
       <w:proofErr w:type="spellStart"/>
       <w:r>
-        <w:rPr>
-          <w:lang w:val="en-SE"/>
-        </w:rPr>
         <w:t>scream</w:t>
       </w:r>
       <w:proofErr w:type="gramEnd"/>
       <w:r>
-        <w:rPr>
-          <w:lang w:val="en-SE"/>
-        </w:rPr>
         <w:t>_bw_test_tx</w:t>
       </w:r>
       <w:proofErr w:type="spellEnd"/>
       <w:r>
-        <w:rPr>
-          <w:lang w:val="en-SE"/>
-        </w:rPr>
         <w:t xml:space="preserve"> application. This punches a hole in the NAT from the PC on the modem side to the outside world. It also helps to avoid a strange </w:t>
       </w:r>
-      <w:r>
-        <w:rPr>
-          <w:lang w:val="en-SE"/>
-        </w:rPr>
+      <w:proofErr w:type="spellStart"/>
+      <w:r>
         <w:t>behaviour</w:t>
       </w:r>
-      <w:r>
-        <w:rPr>
-          <w:lang w:val="en-SE"/>
-        </w:rPr>
+      <w:proofErr w:type="spellEnd"/>
+      <w:r>
         <w:t xml:space="preserve"> that port numbers are remapped. </w:t>
       </w:r>
     </w:p>
     <w:p>
-      <w:pPr>
-        <w:rPr>
-          <w:lang w:val="en-SE"/>
-        </w:rPr>
-      </w:pPr>
-      <w:r>
-        <w:rPr>
-          <w:lang w:val="en-SE"/>
-        </w:rPr>
+      <w:r>
         <w:t xml:space="preserve">To make it possible to know the public IP address of the modem there are </w:t>
       </w:r>
       <w:proofErr w:type="gramStart"/>
       <w:r>
-        <w:rPr>
-          <w:lang w:val="en-SE"/>
-        </w:rPr>
         <w:t>a number of</w:t>
       </w:r>
       <w:proofErr w:type="gramEnd"/>
       <w:r>
-        <w:rPr>
-          <w:lang w:val="en-SE"/>
-        </w:rPr>
         <w:t xml:space="preserve"> methods. One way is to ping the opposing side that is on a public (fixed) IP address and to a TCP dump on the opposing side to get the IP address. In the </w:t>
       </w:r>
       <w:r>
-        <w:rPr>
-          <w:lang w:val="en-SE"/>
-        </w:rPr>
         <w:t xml:space="preserve">example in </w:t>
       </w:r>
       <w:r>
-        <w:rPr>
-          <w:lang w:val="en-SE"/>
-        </w:rPr>
         <w:fldChar w:fldCharType="begin"/>
       </w:r>
       <w:r>
-        <w:rPr>
-          <w:lang w:val="en-SE"/>
-        </w:rPr>
         <w:instrText xml:space="preserve"> REF _Ref197541364 \h </w:instrText>
       </w:r>
       <w:r>
-        <w:rPr>
-          <w:lang w:val="en-SE"/>
-        </w:rPr>
-      </w:r>
-      <w:r>
-        <w:rPr>
-          <w:lang w:val="en-SE"/>
-        </w:rPr>
         <w:fldChar w:fldCharType="separate"/>
       </w:r>
       <w:r>
@@ -8286,21 +8022,12 @@
         <w:t>10</w:t>
       </w:r>
       <w:r>
-        <w:rPr>
-          <w:lang w:val="en-SE"/>
-        </w:rPr>
         <w:fldChar w:fldCharType="end"/>
       </w:r>
       <w:r>
-        <w:rPr>
-          <w:lang w:val="en-SE"/>
-        </w:rPr>
         <w:t xml:space="preserve"> the receiver PC is connected to the modem. From the receiver PC one ping the sender PC which is on a public (or fixed) IP address. A TCP dump records the ping traffic to get the IP address of the modem.</w:t>
       </w:r>
       <w:r>
-        <w:rPr>
-          <w:lang w:val="en-SE"/>
-        </w:rPr>
         <w:t xml:space="preserve"> </w:t>
       </w:r>
     </w:p>
@@ -8309,9 +8036,6 @@
         <w:keepNext/>
       </w:pPr>
       <w:r>
-        <w:rPr>
-          <w:lang w:val="en-SE"/>
-        </w:rPr>
         <w:br/>
       </w:r>
       <w:r>
@@ -8451,7 +8175,7 @@
 </file>
 
 <file path=word/endnotes.xml><?xml version="1.0" encoding="utf-8"?>
-<w:endnotes xmlns:wpc="http://schemas.microsoft.com/office/word/2010/wordprocessingCanvas" xmlns:cx="http://schemas.microsoft.com/office/drawing/2014/chartex" xmlns:cx1="http://schemas.microsoft.com/office/drawing/2015/9/8/chartex" xmlns:cx2="http://schemas.microsoft.com/office/drawing/2015/10/21/chartex" xmlns:cx3="http://schemas.microsoft.com/office/drawing/2016/5/9/chartex" xmlns:cx4="http://schemas.microsoft.com/office/drawing/2016/5/10/chartex" xmlns:cx5="http://schemas.microsoft.com/office/drawing/2016/5/11/chartex" xmlns:cx6="http://schemas.microsoft.com/office/drawing/2016/5/12/chartex" xmlns:cx7="http://schemas.microsoft.com/office/drawing/2016/5/13/chartex" xmlns:cx8="http://schemas.microsoft.com/office/drawing/2016/5/14/chartex" xmlns:mc="http://schemas.openxmlformats.org/markup-compatibility/2006" xmlns:aink="http://schemas.microsoft.com/office/drawing/2016/ink" xmlns:am3d="http://schemas.microsoft.com/office/drawing/2017/model3d" xmlns:o="urn:schemas-microsoft-com:office:office" xmlns:oel="http://schemas.microsoft.com/office/2019/extlst" xmlns:r="http://schemas.openxmlformats.org/officeDocument/2006/relationships" xmlns:m="http://schemas.openxmlformats.org/officeDocument/2006/math" xmlns:v="urn:schemas-microsoft-com:vml" xmlns:wp14="http://schemas.microsoft.com/office/word/2010/wordprocessingDrawing" xmlns:wp="http://schemas.openxmlformats.org/drawingml/2006/wordprocessingDrawing" xmlns:w10="urn:schemas-microsoft-com:office:word" xmlns:w="http://schemas.openxmlformats.org/wordprocessingml/2006/main" xmlns:w14="http://schemas.microsoft.com/office/word/2010/wordml" xmlns:w15="http://schemas.microsoft.com/office/word/2012/wordml" xmlns:w16cex="http://schemas.microsoft.com/office/word/2018/wordml/cex" xmlns:w16cid="http://schemas.microsoft.com/office/word/2016/wordml/cid" xmlns:w16="http://schemas.microsoft.com/office/word/2018/wordml" xmlns:w16sdtdh="http://schemas.microsoft.com/office/word/2020/wordml/sdtdatahash" xmlns:w16se="http://schemas.microsoft.com/office/word/2015/wordml/symex" xmlns:wpg="http://schemas.microsoft.com/office/word/2010/wordprocessingGroup" xmlns:wpi="http://schemas.microsoft.com/office/word/2010/wordprocessingInk" xmlns:wne="http://schemas.microsoft.com/office/word/2006/wordml" xmlns:wps="http://schemas.microsoft.com/office/word/2010/wordprocessingShape" mc:Ignorable="w14 w15 w16se w16cid w16 w16cex w16sdtdh wp14">
+<w:endnotes xmlns:wpc="http://schemas.microsoft.com/office/word/2010/wordprocessingCanvas" xmlns:cx="http://schemas.microsoft.com/office/drawing/2014/chartex" xmlns:cx1="http://schemas.microsoft.com/office/drawing/2015/9/8/chartex" xmlns:cx2="http://schemas.microsoft.com/office/drawing/2015/10/21/chartex" xmlns:cx3="http://schemas.microsoft.com/office/drawing/2016/5/9/chartex" xmlns:cx4="http://schemas.microsoft.com/office/drawing/2016/5/10/chartex" xmlns:cx5="http://schemas.microsoft.com/office/drawing/2016/5/11/chartex" xmlns:cx6="http://schemas.microsoft.com/office/drawing/2016/5/12/chartex" xmlns:cx7="http://schemas.microsoft.com/office/drawing/2016/5/13/chartex" xmlns:cx8="http://schemas.microsoft.com/office/drawing/2016/5/14/chartex" xmlns:mc="http://schemas.openxmlformats.org/markup-compatibility/2006" xmlns:aink="http://schemas.microsoft.com/office/drawing/2016/ink" xmlns:am3d="http://schemas.microsoft.com/office/drawing/2017/model3d" xmlns:o="urn:schemas-microsoft-com:office:office" xmlns:oel="http://schemas.microsoft.com/office/2019/extlst" xmlns:r="http://schemas.openxmlformats.org/officeDocument/2006/relationships" xmlns:m="http://schemas.openxmlformats.org/officeDocument/2006/math" xmlns:v="urn:schemas-microsoft-com:vml" xmlns:wp14="http://schemas.microsoft.com/office/word/2010/wordprocessingDrawing" xmlns:wp="http://schemas.openxmlformats.org/drawingml/2006/wordprocessingDrawing" xmlns:w10="urn:schemas-microsoft-com:office:word" xmlns:w="http://schemas.openxmlformats.org/wordprocessingml/2006/main" xmlns:w14="http://schemas.microsoft.com/office/word/2010/wordml" xmlns:w15="http://schemas.microsoft.com/office/word/2012/wordml" xmlns:w16cex="http://schemas.microsoft.com/office/word/2018/wordml/cex" xmlns:w16cid="http://schemas.microsoft.com/office/word/2016/wordml/cid" xmlns:w16="http://schemas.microsoft.com/office/word/2018/wordml" xmlns:w16du="http://schemas.microsoft.com/office/word/2023/wordml/word16du" xmlns:w16sdtdh="http://schemas.microsoft.com/office/word/2020/wordml/sdtdatahash" xmlns:w16sdtfl="http://schemas.microsoft.com/office/word/2024/wordml/sdtformatlock" xmlns:w16se="http://schemas.microsoft.com/office/word/2015/wordml/symex" xmlns:wpg="http://schemas.microsoft.com/office/word/2010/wordprocessingGroup" xmlns:wpi="http://schemas.microsoft.com/office/word/2010/wordprocessingInk" xmlns:wne="http://schemas.microsoft.com/office/word/2006/wordml" xmlns:wps="http://schemas.microsoft.com/office/word/2010/wordprocessingShape" mc:Ignorable="w14 w15 w16se w16cid w16 w16cex w16sdtdh w16sdtfl w16du wp14">
   <w:endnote w:type="separator" w:id="-1">
     <w:p>
       <w:r>
@@ -8470,7 +8194,7 @@
 </file>
 
 <file path=word/footer1.xml><?xml version="1.0" encoding="utf-8"?>
-<w:ftr xmlns:wpc="http://schemas.microsoft.com/office/word/2010/wordprocessingCanvas" xmlns:cx="http://schemas.microsoft.com/office/drawing/2014/chartex" xmlns:cx1="http://schemas.microsoft.com/office/drawing/2015/9/8/chartex" xmlns:cx2="http://schemas.microsoft.com/office/drawing/2015/10/21/chartex" xmlns:cx3="http://schemas.microsoft.com/office/drawing/2016/5/9/chartex" xmlns:cx4="http://schemas.microsoft.com/office/drawing/2016/5/10/chartex" xmlns:cx5="http://schemas.microsoft.com/office/drawing/2016/5/11/chartex" xmlns:cx6="http://schemas.microsoft.com/office/drawing/2016/5/12/chartex" xmlns:cx7="http://schemas.microsoft.com/office/drawing/2016/5/13/chartex" xmlns:cx8="http://schemas.microsoft.com/office/drawing/2016/5/14/chartex" xmlns:mc="http://schemas.openxmlformats.org/markup-compatibility/2006" xmlns:aink="http://schemas.microsoft.com/office/drawing/2016/ink" xmlns:am3d="http://schemas.microsoft.com/office/drawing/2017/model3d" xmlns:o="urn:schemas-microsoft-com:office:office" xmlns:oel="http://schemas.microsoft.com/office/2019/extlst" xmlns:r="http://schemas.openxmlformats.org/officeDocument/2006/relationships" xmlns:m="http://schemas.openxmlformats.org/officeDocument/2006/math" xmlns:v="urn:schemas-microsoft-com:vml" xmlns:wp14="http://schemas.microsoft.com/office/word/2010/wordprocessingDrawing" xmlns:wp="http://schemas.openxmlformats.org/drawingml/2006/wordprocessingDrawing" xmlns:w10="urn:schemas-microsoft-com:office:word" xmlns:w="http://schemas.openxmlformats.org/wordprocessingml/2006/main" xmlns:w14="http://schemas.microsoft.com/office/word/2010/wordml" xmlns:w15="http://schemas.microsoft.com/office/word/2012/wordml" xmlns:w16cex="http://schemas.microsoft.com/office/word/2018/wordml/cex" xmlns:w16cid="http://schemas.microsoft.com/office/word/2016/wordml/cid" xmlns:w16="http://schemas.microsoft.com/office/word/2018/wordml" xmlns:w16sdtdh="http://schemas.microsoft.com/office/word/2020/wordml/sdtdatahash" xmlns:w16se="http://schemas.microsoft.com/office/word/2015/wordml/symex" xmlns:wpg="http://schemas.microsoft.com/office/word/2010/wordprocessingGroup" xmlns:wpi="http://schemas.microsoft.com/office/word/2010/wordprocessingInk" xmlns:wne="http://schemas.microsoft.com/office/word/2006/wordml" xmlns:wps="http://schemas.microsoft.com/office/word/2010/wordprocessingShape" mc:Ignorable="w14 w15 w16se w16cid w16 w16cex w16sdtdh wp14">
+<w:ftr xmlns:wpc="http://schemas.microsoft.com/office/word/2010/wordprocessingCanvas" xmlns:cx="http://schemas.microsoft.com/office/drawing/2014/chartex" xmlns:cx1="http://schemas.microsoft.com/office/drawing/2015/9/8/chartex" xmlns:cx2="http://schemas.microsoft.com/office/drawing/2015/10/21/chartex" xmlns:cx3="http://schemas.microsoft.com/office/drawing/2016/5/9/chartex" xmlns:cx4="http://schemas.microsoft.com/office/drawing/2016/5/10/chartex" xmlns:cx5="http://schemas.microsoft.com/office/drawing/2016/5/11/chartex" xmlns:cx6="http://schemas.microsoft.com/office/drawing/2016/5/12/chartex" xmlns:cx7="http://schemas.microsoft.com/office/drawing/2016/5/13/chartex" xmlns:cx8="http://schemas.microsoft.com/office/drawing/2016/5/14/chartex" xmlns:mc="http://schemas.openxmlformats.org/markup-compatibility/2006" xmlns:aink="http://schemas.microsoft.com/office/drawing/2016/ink" xmlns:am3d="http://schemas.microsoft.com/office/drawing/2017/model3d" xmlns:o="urn:schemas-microsoft-com:office:office" xmlns:oel="http://schemas.microsoft.com/office/2019/extlst" xmlns:r="http://schemas.openxmlformats.org/officeDocument/2006/relationships" xmlns:m="http://schemas.openxmlformats.org/officeDocument/2006/math" xmlns:v="urn:schemas-microsoft-com:vml" xmlns:wp14="http://schemas.microsoft.com/office/word/2010/wordprocessingDrawing" xmlns:wp="http://schemas.openxmlformats.org/drawingml/2006/wordprocessingDrawing" xmlns:w10="urn:schemas-microsoft-com:office:word" xmlns:w="http://schemas.openxmlformats.org/wordprocessingml/2006/main" xmlns:w14="http://schemas.microsoft.com/office/word/2010/wordml" xmlns:w15="http://schemas.microsoft.com/office/word/2012/wordml" xmlns:w16cex="http://schemas.microsoft.com/office/word/2018/wordml/cex" xmlns:w16cid="http://schemas.microsoft.com/office/word/2016/wordml/cid" xmlns:w16="http://schemas.microsoft.com/office/word/2018/wordml" xmlns:w16du="http://schemas.microsoft.com/office/word/2023/wordml/word16du" xmlns:w16sdtdh="http://schemas.microsoft.com/office/word/2020/wordml/sdtdatahash" xmlns:w16sdtfl="http://schemas.microsoft.com/office/word/2024/wordml/sdtformatlock" xmlns:w16se="http://schemas.microsoft.com/office/word/2015/wordml/symex" xmlns:wpg="http://schemas.microsoft.com/office/word/2010/wordprocessingGroup" xmlns:wpi="http://schemas.microsoft.com/office/word/2010/wordprocessingInk" xmlns:wne="http://schemas.microsoft.com/office/word/2006/wordml" xmlns:wps="http://schemas.microsoft.com/office/word/2010/wordprocessingShape" mc:Ignorable="w14 w15 w16se w16cid w16 w16cex w16sdtdh w16sdtfl w16du wp14">
   <w:p>
     <w:pPr>
       <w:pStyle w:val="Footer"/>
@@ -8670,7 +8394,7 @@
 </file>
 
 <file path=word/footer2.xml><?xml version="1.0" encoding="utf-8"?>
-<w:ftr xmlns:wpc="http://schemas.microsoft.com/office/word/2010/wordprocessingCanvas" xmlns:cx="http://schemas.microsoft.com/office/drawing/2014/chartex" xmlns:cx1="http://schemas.microsoft.com/office/drawing/2015/9/8/chartex" xmlns:cx2="http://schemas.microsoft.com/office/drawing/2015/10/21/chartex" xmlns:cx3="http://schemas.microsoft.com/office/drawing/2016/5/9/chartex" xmlns:cx4="http://schemas.microsoft.com/office/drawing/2016/5/10/chartex" xmlns:cx5="http://schemas.microsoft.com/office/drawing/2016/5/11/chartex" xmlns:cx6="http://schemas.microsoft.com/office/drawing/2016/5/12/chartex" xmlns:cx7="http://schemas.microsoft.com/office/drawing/2016/5/13/chartex" xmlns:cx8="http://schemas.microsoft.com/office/drawing/2016/5/14/chartex" xmlns:mc="http://schemas.openxmlformats.org/markup-compatibility/2006" xmlns:aink="http://schemas.microsoft.com/office/drawing/2016/ink" xmlns:am3d="http://schemas.microsoft.com/office/drawing/2017/model3d" xmlns:o="urn:schemas-microsoft-com:office:office" xmlns:oel="http://schemas.microsoft.com/office/2019/extlst" xmlns:r="http://schemas.openxmlformats.org/officeDocument/2006/relationships" xmlns:m="http://schemas.openxmlformats.org/officeDocument/2006/math" xmlns:v="urn:schemas-microsoft-com:vml" xmlns:wp14="http://schemas.microsoft.com/office/word/2010/wordprocessingDrawing" xmlns:wp="http://schemas.openxmlformats.org/drawingml/2006/wordprocessingDrawing" xmlns:w10="urn:schemas-microsoft-com:office:word" xmlns:w="http://schemas.openxmlformats.org/wordprocessingml/2006/main" xmlns:w14="http://schemas.microsoft.com/office/word/2010/wordml" xmlns:w15="http://schemas.microsoft.com/office/word/2012/wordml" xmlns:w16cex="http://schemas.microsoft.com/office/word/2018/wordml/cex" xmlns:w16cid="http://schemas.microsoft.com/office/word/2016/wordml/cid" xmlns:w16="http://schemas.microsoft.com/office/word/2018/wordml" xmlns:w16sdtdh="http://schemas.microsoft.com/office/word/2020/wordml/sdtdatahash" xmlns:w16se="http://schemas.microsoft.com/office/word/2015/wordml/symex" xmlns:wpg="http://schemas.microsoft.com/office/word/2010/wordprocessingGroup" xmlns:wpi="http://schemas.microsoft.com/office/word/2010/wordprocessingInk" xmlns:wne="http://schemas.microsoft.com/office/word/2006/wordml" xmlns:wps="http://schemas.microsoft.com/office/word/2010/wordprocessingShape" mc:Ignorable="w14 w15 w16se w16cid w16 w16cex w16sdtdh wp14">
+<w:ftr xmlns:wpc="http://schemas.microsoft.com/office/word/2010/wordprocessingCanvas" xmlns:cx="http://schemas.microsoft.com/office/drawing/2014/chartex" xmlns:cx1="http://schemas.microsoft.com/office/drawing/2015/9/8/chartex" xmlns:cx2="http://schemas.microsoft.com/office/drawing/2015/10/21/chartex" xmlns:cx3="http://schemas.microsoft.com/office/drawing/2016/5/9/chartex" xmlns:cx4="http://schemas.microsoft.com/office/drawing/2016/5/10/chartex" xmlns:cx5="http://schemas.microsoft.com/office/drawing/2016/5/11/chartex" xmlns:cx6="http://schemas.microsoft.com/office/drawing/2016/5/12/chartex" xmlns:cx7="http://schemas.microsoft.com/office/drawing/2016/5/13/chartex" xmlns:cx8="http://schemas.microsoft.com/office/drawing/2016/5/14/chartex" xmlns:mc="http://schemas.openxmlformats.org/markup-compatibility/2006" xmlns:aink="http://schemas.microsoft.com/office/drawing/2016/ink" xmlns:am3d="http://schemas.microsoft.com/office/drawing/2017/model3d" xmlns:o="urn:schemas-microsoft-com:office:office" xmlns:oel="http://schemas.microsoft.com/office/2019/extlst" xmlns:r="http://schemas.openxmlformats.org/officeDocument/2006/relationships" xmlns:m="http://schemas.openxmlformats.org/officeDocument/2006/math" xmlns:v="urn:schemas-microsoft-com:vml" xmlns:wp14="http://schemas.microsoft.com/office/word/2010/wordprocessingDrawing" xmlns:wp="http://schemas.openxmlformats.org/drawingml/2006/wordprocessingDrawing" xmlns:w10="urn:schemas-microsoft-com:office:word" xmlns:w="http://schemas.openxmlformats.org/wordprocessingml/2006/main" xmlns:w14="http://schemas.microsoft.com/office/word/2010/wordml" xmlns:w15="http://schemas.microsoft.com/office/word/2012/wordml" xmlns:w16cex="http://schemas.microsoft.com/office/word/2018/wordml/cex" xmlns:w16cid="http://schemas.microsoft.com/office/word/2016/wordml/cid" xmlns:w16="http://schemas.microsoft.com/office/word/2018/wordml" xmlns:w16du="http://schemas.microsoft.com/office/word/2023/wordml/word16du" xmlns:w16sdtdh="http://schemas.microsoft.com/office/word/2020/wordml/sdtdatahash" xmlns:w16sdtfl="http://schemas.microsoft.com/office/word/2024/wordml/sdtformatlock" xmlns:w16se="http://schemas.microsoft.com/office/word/2015/wordml/symex" xmlns:wpg="http://schemas.microsoft.com/office/word/2010/wordprocessingGroup" xmlns:wpi="http://schemas.microsoft.com/office/word/2010/wordprocessingInk" xmlns:wne="http://schemas.microsoft.com/office/word/2006/wordml" xmlns:wps="http://schemas.microsoft.com/office/word/2010/wordprocessingShape" mc:Ignorable="w14 w15 w16se w16cid w16 w16cex w16sdtdh w16sdtfl w16du wp14">
   <w:tbl>
     <w:tblPr>
       <w:tblpPr w:leftFromText="1134" w:rightFromText="17010" w:vertAnchor="text" w:horzAnchor="page" w:tblpX="1192" w:tblpY="1"/>
@@ -8768,7 +8492,7 @@
 </file>
 
 <file path=word/footnotes.xml><?xml version="1.0" encoding="utf-8"?>
-<w:footnotes xmlns:wpc="http://schemas.microsoft.com/office/word/2010/wordprocessingCanvas" xmlns:cx="http://schemas.microsoft.com/office/drawing/2014/chartex" xmlns:cx1="http://schemas.microsoft.com/office/drawing/2015/9/8/chartex" xmlns:cx2="http://schemas.microsoft.com/office/drawing/2015/10/21/chartex" xmlns:cx3="http://schemas.microsoft.com/office/drawing/2016/5/9/chartex" xmlns:cx4="http://schemas.microsoft.com/office/drawing/2016/5/10/chartex" xmlns:cx5="http://schemas.microsoft.com/office/drawing/2016/5/11/chartex" xmlns:cx6="http://schemas.microsoft.com/office/drawing/2016/5/12/chartex" xmlns:cx7="http://schemas.microsoft.com/office/drawing/2016/5/13/chartex" xmlns:cx8="http://schemas.microsoft.com/office/drawing/2016/5/14/chartex" xmlns:mc="http://schemas.openxmlformats.org/markup-compatibility/2006" xmlns:aink="http://schemas.microsoft.com/office/drawing/2016/ink" xmlns:am3d="http://schemas.microsoft.com/office/drawing/2017/model3d" xmlns:o="urn:schemas-microsoft-com:office:office" xmlns:oel="http://schemas.microsoft.com/office/2019/extlst" xmlns:r="http://schemas.openxmlformats.org/officeDocument/2006/relationships" xmlns:m="http://schemas.openxmlformats.org/officeDocument/2006/math" xmlns:v="urn:schemas-microsoft-com:vml" xmlns:wp14="http://schemas.microsoft.com/office/word/2010/wordprocessingDrawing" xmlns:wp="http://schemas.openxmlformats.org/drawingml/2006/wordprocessingDrawing" xmlns:w10="urn:schemas-microsoft-com:office:word" xmlns:w="http://schemas.openxmlformats.org/wordprocessingml/2006/main" xmlns:w14="http://schemas.microsoft.com/office/word/2010/wordml" xmlns:w15="http://schemas.microsoft.com/office/word/2012/wordml" xmlns:w16cex="http://schemas.microsoft.com/office/word/2018/wordml/cex" xmlns:w16cid="http://schemas.microsoft.com/office/word/2016/wordml/cid" xmlns:w16="http://schemas.microsoft.com/office/word/2018/wordml" xmlns:w16sdtdh="http://schemas.microsoft.com/office/word/2020/wordml/sdtdatahash" xmlns:w16se="http://schemas.microsoft.com/office/word/2015/wordml/symex" xmlns:wpg="http://schemas.microsoft.com/office/word/2010/wordprocessingGroup" xmlns:wpi="http://schemas.microsoft.com/office/word/2010/wordprocessingInk" xmlns:wne="http://schemas.microsoft.com/office/word/2006/wordml" xmlns:wps="http://schemas.microsoft.com/office/word/2010/wordprocessingShape" mc:Ignorable="w14 w15 w16se w16cid w16 w16cex w16sdtdh wp14">
+<w:footnotes xmlns:wpc="http://schemas.microsoft.com/office/word/2010/wordprocessingCanvas" xmlns:cx="http://schemas.microsoft.com/office/drawing/2014/chartex" xmlns:cx1="http://schemas.microsoft.com/office/drawing/2015/9/8/chartex" xmlns:cx2="http://schemas.microsoft.com/office/drawing/2015/10/21/chartex" xmlns:cx3="http://schemas.microsoft.com/office/drawing/2016/5/9/chartex" xmlns:cx4="http://schemas.microsoft.com/office/drawing/2016/5/10/chartex" xmlns:cx5="http://schemas.microsoft.com/office/drawing/2016/5/11/chartex" xmlns:cx6="http://schemas.microsoft.com/office/drawing/2016/5/12/chartex" xmlns:cx7="http://schemas.microsoft.com/office/drawing/2016/5/13/chartex" xmlns:cx8="http://schemas.microsoft.com/office/drawing/2016/5/14/chartex" xmlns:mc="http://schemas.openxmlformats.org/markup-compatibility/2006" xmlns:aink="http://schemas.microsoft.com/office/drawing/2016/ink" xmlns:am3d="http://schemas.microsoft.com/office/drawing/2017/model3d" xmlns:o="urn:schemas-microsoft-com:office:office" xmlns:oel="http://schemas.microsoft.com/office/2019/extlst" xmlns:r="http://schemas.openxmlformats.org/officeDocument/2006/relationships" xmlns:m="http://schemas.openxmlformats.org/officeDocument/2006/math" xmlns:v="urn:schemas-microsoft-com:vml" xmlns:wp14="http://schemas.microsoft.com/office/word/2010/wordprocessingDrawing" xmlns:wp="http://schemas.openxmlformats.org/drawingml/2006/wordprocessingDrawing" xmlns:w10="urn:schemas-microsoft-com:office:word" xmlns:w="http://schemas.openxmlformats.org/wordprocessingml/2006/main" xmlns:w14="http://schemas.microsoft.com/office/word/2010/wordml" xmlns:w15="http://schemas.microsoft.com/office/word/2012/wordml" xmlns:w16cex="http://schemas.microsoft.com/office/word/2018/wordml/cex" xmlns:w16cid="http://schemas.microsoft.com/office/word/2016/wordml/cid" xmlns:w16="http://schemas.microsoft.com/office/word/2018/wordml" xmlns:w16du="http://schemas.microsoft.com/office/word/2023/wordml/word16du" xmlns:w16sdtdh="http://schemas.microsoft.com/office/word/2020/wordml/sdtdatahash" xmlns:w16sdtfl="http://schemas.microsoft.com/office/word/2024/wordml/sdtformatlock" xmlns:w16se="http://schemas.microsoft.com/office/word/2015/wordml/symex" xmlns:wpg="http://schemas.microsoft.com/office/word/2010/wordprocessingGroup" xmlns:wpi="http://schemas.microsoft.com/office/word/2010/wordprocessingInk" xmlns:wne="http://schemas.microsoft.com/office/word/2006/wordml" xmlns:wps="http://schemas.microsoft.com/office/word/2010/wordprocessingShape" mc:Ignorable="w14 w15 w16se w16cid w16 w16cex w16sdtdh w16sdtfl w16du wp14">
   <w:footnote w:type="separator" w:id="-1">
     <w:p>
       <w:r>
@@ -8822,7 +8546,7 @@
 </file>
 
 <file path=word/header1.xml><?xml version="1.0" encoding="utf-8"?>
-<w:hdr xmlns:wpc="http://schemas.microsoft.com/office/word/2010/wordprocessingCanvas" xmlns:cx="http://schemas.microsoft.com/office/drawing/2014/chartex" xmlns:cx1="http://schemas.microsoft.com/office/drawing/2015/9/8/chartex" xmlns:cx2="http://schemas.microsoft.com/office/drawing/2015/10/21/chartex" xmlns:cx3="http://schemas.microsoft.com/office/drawing/2016/5/9/chartex" xmlns:cx4="http://schemas.microsoft.com/office/drawing/2016/5/10/chartex" xmlns:cx5="http://schemas.microsoft.com/office/drawing/2016/5/11/chartex" xmlns:cx6="http://schemas.microsoft.com/office/drawing/2016/5/12/chartex" xmlns:cx7="http://schemas.microsoft.com/office/drawing/2016/5/13/chartex" xmlns:cx8="http://schemas.microsoft.com/office/drawing/2016/5/14/chartex" xmlns:mc="http://schemas.openxmlformats.org/markup-compatibility/2006" xmlns:aink="http://schemas.microsoft.com/office/drawing/2016/ink" xmlns:am3d="http://schemas.microsoft.com/office/drawing/2017/model3d" xmlns:o="urn:schemas-microsoft-com:office:office" xmlns:oel="http://schemas.microsoft.com/office/2019/extlst" xmlns:r="http://schemas.openxmlformats.org/officeDocument/2006/relationships" xmlns:m="http://schemas.openxmlformats.org/officeDocument/2006/math" xmlns:v="urn:schemas-microsoft-com:vml" xmlns:wp14="http://schemas.microsoft.com/office/word/2010/wordprocessingDrawing" xmlns:wp="http://schemas.openxmlformats.org/drawingml/2006/wordprocessingDrawing" xmlns:w10="urn:schemas-microsoft-com:office:word" xmlns:w="http://schemas.openxmlformats.org/wordprocessingml/2006/main" xmlns:w14="http://schemas.microsoft.com/office/word/2010/wordml" xmlns:w15="http://schemas.microsoft.com/office/word/2012/wordml" xmlns:w16cex="http://schemas.microsoft.com/office/word/2018/wordml/cex" xmlns:w16cid="http://schemas.microsoft.com/office/word/2016/wordml/cid" xmlns:w16="http://schemas.microsoft.com/office/word/2018/wordml" xmlns:w16sdtdh="http://schemas.microsoft.com/office/word/2020/wordml/sdtdatahash" xmlns:w16se="http://schemas.microsoft.com/office/word/2015/wordml/symex" xmlns:wpg="http://schemas.microsoft.com/office/word/2010/wordprocessingGroup" xmlns:wpi="http://schemas.microsoft.com/office/word/2010/wordprocessingInk" xmlns:wne="http://schemas.microsoft.com/office/word/2006/wordml" xmlns:wps="http://schemas.microsoft.com/office/word/2010/wordprocessingShape" mc:Ignorable="w14 w15 w16se w16cid w16 w16cex w16sdtdh wp14">
+<w:hdr xmlns:wpc="http://schemas.microsoft.com/office/word/2010/wordprocessingCanvas" xmlns:cx="http://schemas.microsoft.com/office/drawing/2014/chartex" xmlns:cx1="http://schemas.microsoft.com/office/drawing/2015/9/8/chartex" xmlns:cx2="http://schemas.microsoft.com/office/drawing/2015/10/21/chartex" xmlns:cx3="http://schemas.microsoft.com/office/drawing/2016/5/9/chartex" xmlns:cx4="http://schemas.microsoft.com/office/drawing/2016/5/10/chartex" xmlns:cx5="http://schemas.microsoft.com/office/drawing/2016/5/11/chartex" xmlns:cx6="http://schemas.microsoft.com/office/drawing/2016/5/12/chartex" xmlns:cx7="http://schemas.microsoft.com/office/drawing/2016/5/13/chartex" xmlns:cx8="http://schemas.microsoft.com/office/drawing/2016/5/14/chartex" xmlns:mc="http://schemas.openxmlformats.org/markup-compatibility/2006" xmlns:aink="http://schemas.microsoft.com/office/drawing/2016/ink" xmlns:am3d="http://schemas.microsoft.com/office/drawing/2017/model3d" xmlns:o="urn:schemas-microsoft-com:office:office" xmlns:oel="http://schemas.microsoft.com/office/2019/extlst" xmlns:r="http://schemas.openxmlformats.org/officeDocument/2006/relationships" xmlns:m="http://schemas.openxmlformats.org/officeDocument/2006/math" xmlns:v="urn:schemas-microsoft-com:vml" xmlns:wp14="http://schemas.microsoft.com/office/word/2010/wordprocessingDrawing" xmlns:wp="http://schemas.openxmlformats.org/drawingml/2006/wordprocessingDrawing" xmlns:w10="urn:schemas-microsoft-com:office:word" xmlns:w="http://schemas.openxmlformats.org/wordprocessingml/2006/main" xmlns:w14="http://schemas.microsoft.com/office/word/2010/wordml" xmlns:w15="http://schemas.microsoft.com/office/word/2012/wordml" xmlns:w16cex="http://schemas.microsoft.com/office/word/2018/wordml/cex" xmlns:w16cid="http://schemas.microsoft.com/office/word/2016/wordml/cid" xmlns:w16="http://schemas.microsoft.com/office/word/2018/wordml" xmlns:w16du="http://schemas.microsoft.com/office/word/2023/wordml/word16du" xmlns:w16sdtdh="http://schemas.microsoft.com/office/word/2020/wordml/sdtdatahash" xmlns:w16sdtfl="http://schemas.microsoft.com/office/word/2024/wordml/sdtformatlock" xmlns:w16se="http://schemas.microsoft.com/office/word/2015/wordml/symex" xmlns:wpg="http://schemas.microsoft.com/office/word/2010/wordprocessingGroup" xmlns:wpi="http://schemas.microsoft.com/office/word/2010/wordprocessingInk" xmlns:wne="http://schemas.microsoft.com/office/word/2006/wordml" xmlns:wps="http://schemas.microsoft.com/office/word/2010/wordprocessingShape" mc:Ignorable="w14 w15 w16se w16cid w16 w16cex w16sdtdh w16sdtfl w16du wp14">
   <w:p>
     <w:pPr>
       <w:pStyle w:val="Header"/>
@@ -8884,7 +8608,7 @@
 </file>
 
 <file path=word/header2.xml><?xml version="1.0" encoding="utf-8"?>
-<w:hdr xmlns:wpc="http://schemas.microsoft.com/office/word/2010/wordprocessingCanvas" xmlns:cx="http://schemas.microsoft.com/office/drawing/2014/chartex" xmlns:cx1="http://schemas.microsoft.com/office/drawing/2015/9/8/chartex" xmlns:cx2="http://schemas.microsoft.com/office/drawing/2015/10/21/chartex" xmlns:cx3="http://schemas.microsoft.com/office/drawing/2016/5/9/chartex" xmlns:cx4="http://schemas.microsoft.com/office/drawing/2016/5/10/chartex" xmlns:cx5="http://schemas.microsoft.com/office/drawing/2016/5/11/chartex" xmlns:cx6="http://schemas.microsoft.com/office/drawing/2016/5/12/chartex" xmlns:cx7="http://schemas.microsoft.com/office/drawing/2016/5/13/chartex" xmlns:cx8="http://schemas.microsoft.com/office/drawing/2016/5/14/chartex" xmlns:mc="http://schemas.openxmlformats.org/markup-compatibility/2006" xmlns:aink="http://schemas.microsoft.com/office/drawing/2016/ink" xmlns:am3d="http://schemas.microsoft.com/office/drawing/2017/model3d" xmlns:o="urn:schemas-microsoft-com:office:office" xmlns:oel="http://schemas.microsoft.com/office/2019/extlst" xmlns:r="http://schemas.openxmlformats.org/officeDocument/2006/relationships" xmlns:m="http://schemas.openxmlformats.org/officeDocument/2006/math" xmlns:v="urn:schemas-microsoft-com:vml" xmlns:wp14="http://schemas.microsoft.com/office/word/2010/wordprocessingDrawing" xmlns:wp="http://schemas.openxmlformats.org/drawingml/2006/wordprocessingDrawing" xmlns:w10="urn:schemas-microsoft-com:office:word" xmlns:w="http://schemas.openxmlformats.org/wordprocessingml/2006/main" xmlns:w14="http://schemas.microsoft.com/office/word/2010/wordml" xmlns:w15="http://schemas.microsoft.com/office/word/2012/wordml" xmlns:w16cex="http://schemas.microsoft.com/office/word/2018/wordml/cex" xmlns:w16cid="http://schemas.microsoft.com/office/word/2016/wordml/cid" xmlns:w16="http://schemas.microsoft.com/office/word/2018/wordml" xmlns:w16sdtdh="http://schemas.microsoft.com/office/word/2020/wordml/sdtdatahash" xmlns:w16se="http://schemas.microsoft.com/office/word/2015/wordml/symex" xmlns:wpg="http://schemas.microsoft.com/office/word/2010/wordprocessingGroup" xmlns:wpi="http://schemas.microsoft.com/office/word/2010/wordprocessingInk" xmlns:wne="http://schemas.microsoft.com/office/word/2006/wordml" xmlns:wps="http://schemas.microsoft.com/office/word/2010/wordprocessingShape" mc:Ignorable="w14 w15 w16se w16cid w16 w16cex w16sdtdh wp14">
+<w:hdr xmlns:wpc="http://schemas.microsoft.com/office/word/2010/wordprocessingCanvas" xmlns:cx="http://schemas.microsoft.com/office/drawing/2014/chartex" xmlns:cx1="http://schemas.microsoft.com/office/drawing/2015/9/8/chartex" xmlns:cx2="http://schemas.microsoft.com/office/drawing/2015/10/21/chartex" xmlns:cx3="http://schemas.microsoft.com/office/drawing/2016/5/9/chartex" xmlns:cx4="http://schemas.microsoft.com/office/drawing/2016/5/10/chartex" xmlns:cx5="http://schemas.microsoft.com/office/drawing/2016/5/11/chartex" xmlns:cx6="http://schemas.microsoft.com/office/drawing/2016/5/12/chartex" xmlns:cx7="http://schemas.microsoft.com/office/drawing/2016/5/13/chartex" xmlns:cx8="http://schemas.microsoft.com/office/drawing/2016/5/14/chartex" xmlns:mc="http://schemas.openxmlformats.org/markup-compatibility/2006" xmlns:aink="http://schemas.microsoft.com/office/drawing/2016/ink" xmlns:am3d="http://schemas.microsoft.com/office/drawing/2017/model3d" xmlns:o="urn:schemas-microsoft-com:office:office" xmlns:oel="http://schemas.microsoft.com/office/2019/extlst" xmlns:r="http://schemas.openxmlformats.org/officeDocument/2006/relationships" xmlns:m="http://schemas.openxmlformats.org/officeDocument/2006/math" xmlns:v="urn:schemas-microsoft-com:vml" xmlns:wp14="http://schemas.microsoft.com/office/word/2010/wordprocessingDrawing" xmlns:wp="http://schemas.openxmlformats.org/drawingml/2006/wordprocessingDrawing" xmlns:w10="urn:schemas-microsoft-com:office:word" xmlns:w="http://schemas.openxmlformats.org/wordprocessingml/2006/main" xmlns:w14="http://schemas.microsoft.com/office/word/2010/wordml" xmlns:w15="http://schemas.microsoft.com/office/word/2012/wordml" xmlns:w16cex="http://schemas.microsoft.com/office/word/2018/wordml/cex" xmlns:w16cid="http://schemas.microsoft.com/office/word/2016/wordml/cid" xmlns:w16="http://schemas.microsoft.com/office/word/2018/wordml" xmlns:w16du="http://schemas.microsoft.com/office/word/2023/wordml/word16du" xmlns:w16sdtdh="http://schemas.microsoft.com/office/word/2020/wordml/sdtdatahash" xmlns:w16sdtfl="http://schemas.microsoft.com/office/word/2024/wordml/sdtformatlock" xmlns:w16se="http://schemas.microsoft.com/office/word/2015/wordml/symex" xmlns:wpg="http://schemas.microsoft.com/office/word/2010/wordprocessingGroup" xmlns:wpi="http://schemas.microsoft.com/office/word/2010/wordprocessingInk" xmlns:wne="http://schemas.microsoft.com/office/word/2006/wordml" xmlns:wps="http://schemas.microsoft.com/office/word/2010/wordprocessingShape" mc:Ignorable="w14 w15 w16se w16cid w16 w16cex w16sdtdh w16sdtfl w16du wp14">
   <w:p>
     <w:r>
       <w:rPr>
@@ -8943,7 +8667,7 @@
 </file>
 
 <file path=word/header3.xml><?xml version="1.0" encoding="utf-8"?>
-<w:hdr xmlns:wpc="http://schemas.microsoft.com/office/word/2010/wordprocessingCanvas" xmlns:cx="http://schemas.microsoft.com/office/drawing/2014/chartex" xmlns:cx1="http://schemas.microsoft.com/office/drawing/2015/9/8/chartex" xmlns:cx2="http://schemas.microsoft.com/office/drawing/2015/10/21/chartex" xmlns:cx3="http://schemas.microsoft.com/office/drawing/2016/5/9/chartex" xmlns:cx4="http://schemas.microsoft.com/office/drawing/2016/5/10/chartex" xmlns:cx5="http://schemas.microsoft.com/office/drawing/2016/5/11/chartex" xmlns:cx6="http://schemas.microsoft.com/office/drawing/2016/5/12/chartex" xmlns:cx7="http://schemas.microsoft.com/office/drawing/2016/5/13/chartex" xmlns:cx8="http://schemas.microsoft.com/office/drawing/2016/5/14/chartex" xmlns:mc="http://schemas.openxmlformats.org/markup-compatibility/2006" xmlns:aink="http://schemas.microsoft.com/office/drawing/2016/ink" xmlns:am3d="http://schemas.microsoft.com/office/drawing/2017/model3d" xmlns:o="urn:schemas-microsoft-com:office:office" xmlns:oel="http://schemas.microsoft.com/office/2019/extlst" xmlns:r="http://schemas.openxmlformats.org/officeDocument/2006/relationships" xmlns:m="http://schemas.openxmlformats.org/officeDocument/2006/math" xmlns:v="urn:schemas-microsoft-com:vml" xmlns:wp14="http://schemas.microsoft.com/office/word/2010/wordprocessingDrawing" xmlns:wp="http://schemas.openxmlformats.org/drawingml/2006/wordprocessingDrawing" xmlns:w10="urn:schemas-microsoft-com:office:word" xmlns:w="http://schemas.openxmlformats.org/wordprocessingml/2006/main" xmlns:w14="http://schemas.microsoft.com/office/word/2010/wordml" xmlns:w15="http://schemas.microsoft.com/office/word/2012/wordml" xmlns:w16cex="http://schemas.microsoft.com/office/word/2018/wordml/cex" xmlns:w16cid="http://schemas.microsoft.com/office/word/2016/wordml/cid" xmlns:w16="http://schemas.microsoft.com/office/word/2018/wordml" xmlns:w16sdtdh="http://schemas.microsoft.com/office/word/2020/wordml/sdtdatahash" xmlns:w16se="http://schemas.microsoft.com/office/word/2015/wordml/symex" xmlns:wpg="http://schemas.microsoft.com/office/word/2010/wordprocessingGroup" xmlns:wpi="http://schemas.microsoft.com/office/word/2010/wordprocessingInk" xmlns:wne="http://schemas.microsoft.com/office/word/2006/wordml" xmlns:wps="http://schemas.microsoft.com/office/word/2010/wordprocessingShape" mc:Ignorable="w14 w15 w16se w16cid w16 w16cex w16sdtdh wp14">
+<w:hdr xmlns:wpc="http://schemas.microsoft.com/office/word/2010/wordprocessingCanvas" xmlns:cx="http://schemas.microsoft.com/office/drawing/2014/chartex" xmlns:cx1="http://schemas.microsoft.com/office/drawing/2015/9/8/chartex" xmlns:cx2="http://schemas.microsoft.com/office/drawing/2015/10/21/chartex" xmlns:cx3="http://schemas.microsoft.com/office/drawing/2016/5/9/chartex" xmlns:cx4="http://schemas.microsoft.com/office/drawing/2016/5/10/chartex" xmlns:cx5="http://schemas.microsoft.com/office/drawing/2016/5/11/chartex" xmlns:cx6="http://schemas.microsoft.com/office/drawing/2016/5/12/chartex" xmlns:cx7="http://schemas.microsoft.com/office/drawing/2016/5/13/chartex" xmlns:cx8="http://schemas.microsoft.com/office/drawing/2016/5/14/chartex" xmlns:mc="http://schemas.openxmlformats.org/markup-compatibility/2006" xmlns:aink="http://schemas.microsoft.com/office/drawing/2016/ink" xmlns:am3d="http://schemas.microsoft.com/office/drawing/2017/model3d" xmlns:o="urn:schemas-microsoft-com:office:office" xmlns:oel="http://schemas.microsoft.com/office/2019/extlst" xmlns:r="http://schemas.openxmlformats.org/officeDocument/2006/relationships" xmlns:m="http://schemas.openxmlformats.org/officeDocument/2006/math" xmlns:v="urn:schemas-microsoft-com:vml" xmlns:wp14="http://schemas.microsoft.com/office/word/2010/wordprocessingDrawing" xmlns:wp="http://schemas.openxmlformats.org/drawingml/2006/wordprocessingDrawing" xmlns:w10="urn:schemas-microsoft-com:office:word" xmlns:w="http://schemas.openxmlformats.org/wordprocessingml/2006/main" xmlns:w14="http://schemas.microsoft.com/office/word/2010/wordml" xmlns:w15="http://schemas.microsoft.com/office/word/2012/wordml" xmlns:w16cex="http://schemas.microsoft.com/office/word/2018/wordml/cex" xmlns:w16cid="http://schemas.microsoft.com/office/word/2016/wordml/cid" xmlns:w16="http://schemas.microsoft.com/office/word/2018/wordml" xmlns:w16du="http://schemas.microsoft.com/office/word/2023/wordml/word16du" xmlns:w16sdtdh="http://schemas.microsoft.com/office/word/2020/wordml/sdtdatahash" xmlns:w16sdtfl="http://schemas.microsoft.com/office/word/2024/wordml/sdtformatlock" xmlns:w16se="http://schemas.microsoft.com/office/word/2015/wordml/symex" xmlns:wpg="http://schemas.microsoft.com/office/word/2010/wordprocessingGroup" xmlns:wpi="http://schemas.microsoft.com/office/word/2010/wordprocessingInk" xmlns:wne="http://schemas.microsoft.com/office/word/2006/wordml" xmlns:wps="http://schemas.microsoft.com/office/word/2010/wordprocessingShape" mc:Ignorable="w14 w15 w16se w16cid w16 w16cex w16sdtdh w16sdtfl w16du wp14">
   <w:p>
     <w:pPr>
       <w:pStyle w:val="Header"/>
@@ -8955,7 +8679,7 @@
       <mc:AlternateContent>
         <mc:Choice Requires="wps">
           <w:drawing>
-            <wp:anchor distT="0" distB="0" distL="114300" distR="114300" simplePos="0" relativeHeight="251659264" behindDoc="0" locked="0" layoutInCell="1" allowOverlap="1" wp14:anchorId="2EF0A09C" wp14:editId="604E5DE2">
+            <wp:anchor distT="0" distB="0" distL="114300" distR="114300" simplePos="0" relativeHeight="251659264" behindDoc="0" locked="0" layoutInCell="1" allowOverlap="1" wp14:anchorId="2EF0A09C" wp14:editId="101673DC">
               <wp:simplePos x="0" y="0"/>
               <wp:positionH relativeFrom="page">
                 <wp:align>left</wp:align>
@@ -9023,12 +8747,15 @@
         </mc:Choice>
         <mc:Fallback>
           <w:pict>
-            <v:rect w14:anchorId="52A18E79" id="Border" o:spid="_x0000_s1026" style="position:absolute;margin-left:0;margin-top:0;width:623.6pt;height:107.7pt;z-index:251659264;visibility:visible;mso-wrap-style:square;mso-width-percent:0;mso-height-percent:0;mso-wrap-distance-left:9pt;mso-wrap-distance-top:0;mso-wrap-distance-right:9pt;mso-wrap-distance-bottom:0;mso-position-horizontal:left;mso-position-horizontal-relative:page;mso-position-vertical:top;mso-position-vertical-relative:page;mso-width-percent:0;mso-height-percent:0;mso-width-relative:margin;mso-height-relative:margin;v-text-anchor:middle" o:gfxdata="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" stroked="f" strokeweight="2pt">
+            <v:rect w14:anchorId="19A99F5C" id="Border" o:spid="_x0000_s1026" style="position:absolute;margin-left:0;margin-top:0;width:623.6pt;height:107.7pt;z-index:251659264;visibility:visible;mso-wrap-style:square;mso-width-percent:0;mso-height-percent:0;mso-wrap-distance-left:9pt;mso-wrap-distance-top:0;mso-wrap-distance-right:9pt;mso-wrap-distance-bottom:0;mso-position-horizontal:left;mso-position-horizontal-relative:page;mso-position-vertical:top;mso-position-vertical-relative:page;mso-width-percent:0;mso-height-percent:0;mso-width-relative:margin;mso-height-relative:margin;v-text-anchor:middle" o:gfxdata="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" stroked="f" strokeweight="2pt">
               <w10:wrap anchorx="page" anchory="page"/>
             </v:rect>
           </w:pict>
         </mc:Fallback>
       </mc:AlternateContent>
+    </w:r>
+    <w:r>
+      <w:t>2</w:t>
     </w:r>
   </w:p>
   <w:p>
@@ -9102,10 +8829,12 @@
                 <w:pStyle w:val="Title"/>
               </w:pPr>
               <w:proofErr w:type="spellStart"/>
+              <w:proofErr w:type="gramStart"/>
               <w:r>
                 <w:t>SCReAM</w:t>
               </w:r>
               <w:proofErr w:type="spellEnd"/>
+              <w:proofErr w:type="gramEnd"/>
               <w:r>
                 <w:t xml:space="preserve"> BW test tool</w:t>
               </w:r>
@@ -9162,7 +8891,6 @@
               <w:docPart w:val="356242D123B5454A81E7489AB6420C25"/>
             </w:placeholder>
           </w:sdtPr>
-          <w:sdtEndPr/>
           <w:sdtContent>
             <w:p>
               <w:pPr>
@@ -9298,7 +9026,7 @@
 </file>
 
 <file path=word/numbering.xml><?xml version="1.0" encoding="utf-8"?>
-<w:numbering xmlns:wpc="http://schemas.microsoft.com/office/word/2010/wordprocessingCanvas" xmlns:cx="http://schemas.microsoft.com/office/drawing/2014/chartex" xmlns:cx1="http://schemas.microsoft.com/office/drawing/2015/9/8/chartex" xmlns:cx2="http://schemas.microsoft.com/office/drawing/2015/10/21/chartex" xmlns:cx3="http://schemas.microsoft.com/office/drawing/2016/5/9/chartex" xmlns:cx4="http://schemas.microsoft.com/office/drawing/2016/5/10/chartex" xmlns:cx5="http://schemas.microsoft.com/office/drawing/2016/5/11/chartex" xmlns:cx6="http://schemas.microsoft.com/office/drawing/2016/5/12/chartex" xmlns:cx7="http://schemas.microsoft.com/office/drawing/2016/5/13/chartex" xmlns:cx8="http://schemas.microsoft.com/office/drawing/2016/5/14/chartex" xmlns:mc="http://schemas.openxmlformats.org/markup-compatibility/2006" xmlns:aink="http://schemas.microsoft.com/office/drawing/2016/ink" xmlns:am3d="http://schemas.microsoft.com/office/drawing/2017/model3d" xmlns:o="urn:schemas-microsoft-com:office:office" xmlns:oel="http://schemas.microsoft.com/office/2019/extlst" xmlns:r="http://schemas.openxmlformats.org/officeDocument/2006/relationships" xmlns:m="http://schemas.openxmlformats.org/officeDocument/2006/math" xmlns:v="urn:schemas-microsoft-com:vml" xmlns:wp14="http://schemas.microsoft.com/office/word/2010/wordprocessingDrawing" xmlns:wp="http://schemas.openxmlformats.org/drawingml/2006/wordprocessingDrawing" xmlns:w10="urn:schemas-microsoft-com:office:word" xmlns:w="http://schemas.openxmlformats.org/wordprocessingml/2006/main" xmlns:w14="http://schemas.microsoft.com/office/word/2010/wordml" xmlns:w15="http://schemas.microsoft.com/office/word/2012/wordml" xmlns:w16cex="http://schemas.microsoft.com/office/word/2018/wordml/cex" xmlns:w16cid="http://schemas.microsoft.com/office/word/2016/wordml/cid" xmlns:w16="http://schemas.microsoft.com/office/word/2018/wordml" xmlns:w16sdtdh="http://schemas.microsoft.com/office/word/2020/wordml/sdtdatahash" xmlns:w16se="http://schemas.microsoft.com/office/word/2015/wordml/symex" xmlns:wpg="http://schemas.microsoft.com/office/word/2010/wordprocessingGroup" xmlns:wpi="http://schemas.microsoft.com/office/word/2010/wordprocessingInk" xmlns:wne="http://schemas.microsoft.com/office/word/2006/wordml" xmlns:wps="http://schemas.microsoft.com/office/word/2010/wordprocessingShape" mc:Ignorable="w14 w15 w16se w16cid w16 w16cex w16sdtdh wp14">
+<w:numbering xmlns:wpc="http://schemas.microsoft.com/office/word/2010/wordprocessingCanvas" xmlns:cx="http://schemas.microsoft.com/office/drawing/2014/chartex" xmlns:cx1="http://schemas.microsoft.com/office/drawing/2015/9/8/chartex" xmlns:cx2="http://schemas.microsoft.com/office/drawing/2015/10/21/chartex" xmlns:cx3="http://schemas.microsoft.com/office/drawing/2016/5/9/chartex" xmlns:cx4="http://schemas.microsoft.com/office/drawing/2016/5/10/chartex" xmlns:cx5="http://schemas.microsoft.com/office/drawing/2016/5/11/chartex" xmlns:cx6="http://schemas.microsoft.com/office/drawing/2016/5/12/chartex" xmlns:cx7="http://schemas.microsoft.com/office/drawing/2016/5/13/chartex" xmlns:cx8="http://schemas.microsoft.com/office/drawing/2016/5/14/chartex" xmlns:mc="http://schemas.openxmlformats.org/markup-compatibility/2006" xmlns:aink="http://schemas.microsoft.com/office/drawing/2016/ink" xmlns:am3d="http://schemas.microsoft.com/office/drawing/2017/model3d" xmlns:o="urn:schemas-microsoft-com:office:office" xmlns:oel="http://schemas.microsoft.com/office/2019/extlst" xmlns:r="http://schemas.openxmlformats.org/officeDocument/2006/relationships" xmlns:m="http://schemas.openxmlformats.org/officeDocument/2006/math" xmlns:v="urn:schemas-microsoft-com:vml" xmlns:wp14="http://schemas.microsoft.com/office/word/2010/wordprocessingDrawing" xmlns:wp="http://schemas.openxmlformats.org/drawingml/2006/wordprocessingDrawing" xmlns:w10="urn:schemas-microsoft-com:office:word" xmlns:w="http://schemas.openxmlformats.org/wordprocessingml/2006/main" xmlns:w14="http://schemas.microsoft.com/office/word/2010/wordml" xmlns:w15="http://schemas.microsoft.com/office/word/2012/wordml" xmlns:w16cex="http://schemas.microsoft.com/office/word/2018/wordml/cex" xmlns:w16cid="http://schemas.microsoft.com/office/word/2016/wordml/cid" xmlns:w16="http://schemas.microsoft.com/office/word/2018/wordml" xmlns:w16du="http://schemas.microsoft.com/office/word/2023/wordml/word16du" xmlns:w16sdtdh="http://schemas.microsoft.com/office/word/2020/wordml/sdtdatahash" xmlns:w16sdtfl="http://schemas.microsoft.com/office/word/2024/wordml/sdtformatlock" xmlns:w16se="http://schemas.microsoft.com/office/word/2015/wordml/symex" xmlns:wpg="http://schemas.microsoft.com/office/word/2010/wordprocessingGroup" xmlns:wpi="http://schemas.microsoft.com/office/word/2010/wordprocessingInk" xmlns:wne="http://schemas.microsoft.com/office/word/2006/wordml" xmlns:wps="http://schemas.microsoft.com/office/word/2010/wordprocessingShape" mc:Ignorable="w14 w15 w16se w16cid w16 w16cex w16sdtdh w16sdtfl w16du wp14">
   <w:abstractNum w:abstractNumId="0" w15:restartNumberingAfterBreak="0">
     <w:nsid w:val="FFFFFF7C"/>
     <w:multiLevelType w:val="singleLevel"/>
@@ -13272,7 +13000,7 @@
 </file>
 
 <file path=word/styles.xml><?xml version="1.0" encoding="utf-8"?>
-<w:styles xmlns:mc="http://schemas.openxmlformats.org/markup-compatibility/2006" xmlns:r="http://schemas.openxmlformats.org/officeDocument/2006/relationships" xmlns:w="http://schemas.openxmlformats.org/wordprocessingml/2006/main" xmlns:w14="http://schemas.microsoft.com/office/word/2010/wordml" xmlns:w15="http://schemas.microsoft.com/office/word/2012/wordml" xmlns:w16cex="http://schemas.microsoft.com/office/word/2018/wordml/cex" xmlns:w16cid="http://schemas.microsoft.com/office/word/2016/wordml/cid" xmlns:w16="http://schemas.microsoft.com/office/word/2018/wordml" xmlns:w16sdtdh="http://schemas.microsoft.com/office/word/2020/wordml/sdtdatahash" xmlns:w16se="http://schemas.microsoft.com/office/word/2015/wordml/symex" mc:Ignorable="w14 w15 w16se w16cid w16 w16cex w16sdtdh">
+<w:styles xmlns:mc="http://schemas.openxmlformats.org/markup-compatibility/2006" xmlns:r="http://schemas.openxmlformats.org/officeDocument/2006/relationships" xmlns:w="http://schemas.openxmlformats.org/wordprocessingml/2006/main" xmlns:w14="http://schemas.microsoft.com/office/word/2010/wordml" xmlns:w15="http://schemas.microsoft.com/office/word/2012/wordml" xmlns:w16cex="http://schemas.microsoft.com/office/word/2018/wordml/cex" xmlns:w16cid="http://schemas.microsoft.com/office/word/2016/wordml/cid" xmlns:w16="http://schemas.microsoft.com/office/word/2018/wordml" xmlns:w16du="http://schemas.microsoft.com/office/word/2023/wordml/word16du" xmlns:w16sdtdh="http://schemas.microsoft.com/office/word/2020/wordml/sdtdatahash" xmlns:w16sdtfl="http://schemas.microsoft.com/office/word/2024/wordml/sdtformatlock" xmlns:w16se="http://schemas.microsoft.com/office/word/2015/wordml/symex" mc:Ignorable="w14 w15 w16se w16cid w16 w16cex w16sdtdh w16sdtfl w16du">
   <w:docDefaults>
     <w:rPrDefault>
       <w:rPr>
@@ -13320,7 +13048,7 @@
     <w:lsdException w:name="Normal Indent" w:semiHidden="1" w:uiPriority="0" w:unhideWhenUsed="1"/>
     <w:lsdException w:name="footnote text" w:semiHidden="1" w:unhideWhenUsed="1"/>
     <w:lsdException w:name="annotation text" w:semiHidden="1"/>
-    <w:lsdException w:name="header" w:semiHidden="1" w:uiPriority="0" w:unhideWhenUsed="1"/>
+    <w:lsdException w:name="header" w:semiHidden="1" w:unhideWhenUsed="1"/>
     <w:lsdException w:name="footer" w:semiHidden="1" w:unhideWhenUsed="1"/>
     <w:lsdException w:name="index heading" w:semiHidden="1"/>
     <w:lsdException w:name="caption" w:semiHidden="1" w:uiPriority="8" w:unhideWhenUsed="1" w:qFormat="1"/>
@@ -13971,8 +13699,7 @@
     <w:name w:val="header"/>
     <w:basedOn w:val="Normal"/>
     <w:link w:val="HeaderChar"/>
-    <w:uiPriority w:val="10"/>
-    <w:semiHidden/>
+    <w:uiPriority w:val="99"/>
     <w:rsid w:val="0020755F"/>
     <w:pPr>
       <w:tabs>
@@ -13989,8 +13716,7 @@
     <w:name w:val="Header Char"/>
     <w:basedOn w:val="DefaultParagraphFont"/>
     <w:link w:val="Header"/>
-    <w:uiPriority w:val="10"/>
-    <w:semiHidden/>
+    <w:uiPriority w:val="99"/>
     <w:rsid w:val="002D170D"/>
     <w:rPr>
       <w:sz w:val="16"/>
@@ -15260,7 +14986,7 @@
       <w:lang w:val="en-US"/>
     </w:rPr>
   </w:style>
-  <w:style w:type="table" w:styleId="ColorfulGrid">
+  <w:style w:type="table" w:styleId="ColourfulGrid">
     <w:name w:val="Colorful Grid"/>
     <w:basedOn w:val="TableNormal"/>
     <w:uiPriority w:val="73"/>
@@ -15332,7 +15058,7 @@
       </w:tcPr>
     </w:tblStylePr>
   </w:style>
-  <w:style w:type="table" w:styleId="ColorfulGrid-Accent1">
+  <w:style w:type="table" w:styleId="ColourfulGridAccent1">
     <w:name w:val="Colorful Grid Accent 1"/>
     <w:basedOn w:val="TableNormal"/>
     <w:uiPriority w:val="73"/>
@@ -15404,7 +15130,7 @@
       </w:tcPr>
     </w:tblStylePr>
   </w:style>
-  <w:style w:type="table" w:styleId="ColorfulGrid-Accent2">
+  <w:style w:type="table" w:styleId="ColourfulGridAccent2">
     <w:name w:val="Colorful Grid Accent 2"/>
     <w:basedOn w:val="TableNormal"/>
     <w:uiPriority w:val="73"/>
@@ -15476,7 +15202,7 @@
       </w:tcPr>
     </w:tblStylePr>
   </w:style>
-  <w:style w:type="table" w:styleId="ColorfulGrid-Accent3">
+  <w:style w:type="table" w:styleId="ColourfulGridAccent3">
     <w:name w:val="Colorful Grid Accent 3"/>
     <w:basedOn w:val="TableNormal"/>
     <w:uiPriority w:val="73"/>
@@ -15548,7 +15274,7 @@
       </w:tcPr>
     </w:tblStylePr>
   </w:style>
-  <w:style w:type="table" w:styleId="ColorfulGrid-Accent4">
+  <w:style w:type="table" w:styleId="ColourfulGridAccent4">
     <w:name w:val="Colorful Grid Accent 4"/>
     <w:basedOn w:val="TableNormal"/>
     <w:uiPriority w:val="73"/>
@@ -15620,7 +15346,7 @@
       </w:tcPr>
     </w:tblStylePr>
   </w:style>
-  <w:style w:type="table" w:styleId="ColorfulGrid-Accent5">
+  <w:style w:type="table" w:styleId="ColourfulGridAccent5">
     <w:name w:val="Colorful Grid Accent 5"/>
     <w:basedOn w:val="TableNormal"/>
     <w:uiPriority w:val="73"/>
@@ -15692,7 +15418,7 @@
       </w:tcPr>
     </w:tblStylePr>
   </w:style>
-  <w:style w:type="table" w:styleId="ColorfulGrid-Accent6">
+  <w:style w:type="table" w:styleId="ColourfulGridAccent6">
     <w:name w:val="Colorful Grid Accent 6"/>
     <w:basedOn w:val="TableNormal"/>
     <w:uiPriority w:val="73"/>
@@ -15764,7 +15490,7 @@
       </w:tcPr>
     </w:tblStylePr>
   </w:style>
-  <w:style w:type="table" w:styleId="ColorfulList">
+  <w:style w:type="table" w:styleId="ColourfulList">
     <w:name w:val="Colorful List"/>
     <w:basedOn w:val="TableNormal"/>
     <w:uiPriority w:val="72"/>
@@ -15842,7 +15568,7 @@
       </w:tcPr>
     </w:tblStylePr>
   </w:style>
-  <w:style w:type="table" w:styleId="ColorfulList-Accent1">
+  <w:style w:type="table" w:styleId="ColourfulListAccent1">
     <w:name w:val="Colorful List Accent 1"/>
     <w:basedOn w:val="TableNormal"/>
     <w:uiPriority w:val="72"/>
@@ -15920,7 +15646,7 @@
       </w:tcPr>
     </w:tblStylePr>
   </w:style>
-  <w:style w:type="table" w:styleId="ColorfulList-Accent2">
+  <w:style w:type="table" w:styleId="ColourfulListAccent2">
     <w:name w:val="Colorful List Accent 2"/>
     <w:basedOn w:val="TableNormal"/>
     <w:uiPriority w:val="72"/>
@@ -15998,7 +15724,7 @@
       </w:tcPr>
     </w:tblStylePr>
   </w:style>
-  <w:style w:type="table" w:styleId="ColorfulList-Accent3">
+  <w:style w:type="table" w:styleId="ColourfulListAccent3">
     <w:name w:val="Colorful List Accent 3"/>
     <w:basedOn w:val="TableNormal"/>
     <w:uiPriority w:val="72"/>
@@ -16076,7 +15802,7 @@
       </w:tcPr>
     </w:tblStylePr>
   </w:style>
-  <w:style w:type="table" w:styleId="ColorfulList-Accent4">
+  <w:style w:type="table" w:styleId="ColourfulListAccent4">
     <w:name w:val="Colorful List Accent 4"/>
     <w:basedOn w:val="TableNormal"/>
     <w:uiPriority w:val="72"/>
@@ -16154,7 +15880,7 @@
       </w:tcPr>
     </w:tblStylePr>
   </w:style>
-  <w:style w:type="table" w:styleId="ColorfulList-Accent5">
+  <w:style w:type="table" w:styleId="ColourfulListAccent5">
     <w:name w:val="Colorful List Accent 5"/>
     <w:basedOn w:val="TableNormal"/>
     <w:uiPriority w:val="72"/>
@@ -16232,7 +15958,7 @@
       </w:tcPr>
     </w:tblStylePr>
   </w:style>
-  <w:style w:type="table" w:styleId="ColorfulList-Accent6">
+  <w:style w:type="table" w:styleId="ColourfulListAccent6">
     <w:name w:val="Colorful List Accent 6"/>
     <w:basedOn w:val="TableNormal"/>
     <w:uiPriority w:val="72"/>
@@ -16310,7 +16036,7 @@
       </w:tcPr>
     </w:tblStylePr>
   </w:style>
-  <w:style w:type="table" w:styleId="ColorfulShading">
+  <w:style w:type="table" w:styleId="ColourfulShading">
     <w:name w:val="Colorful Shading"/>
     <w:basedOn w:val="TableNormal"/>
     <w:uiPriority w:val="71"/>
@@ -16424,7 +16150,7 @@
       </w:rPr>
     </w:tblStylePr>
   </w:style>
-  <w:style w:type="table" w:styleId="ColorfulShading-Accent1">
+  <w:style w:type="table" w:styleId="ColourfulShadingAccent1">
     <w:name w:val="Colorful Shading Accent 1"/>
     <w:basedOn w:val="TableNormal"/>
     <w:uiPriority w:val="71"/>
@@ -16538,7 +16264,7 @@
       </w:rPr>
     </w:tblStylePr>
   </w:style>
-  <w:style w:type="table" w:styleId="ColorfulShading-Accent2">
+  <w:style w:type="table" w:styleId="ColourfulShadingAccent2">
     <w:name w:val="Colorful Shading Accent 2"/>
     <w:basedOn w:val="TableNormal"/>
     <w:uiPriority w:val="71"/>
@@ -16652,7 +16378,7 @@
       </w:rPr>
     </w:tblStylePr>
   </w:style>
-  <w:style w:type="table" w:styleId="ColorfulShading-Accent3">
+  <w:style w:type="table" w:styleId="ColourfulShadingAccent3">
     <w:name w:val="Colorful Shading Accent 3"/>
     <w:basedOn w:val="TableNormal"/>
     <w:uiPriority w:val="71"/>
@@ -16756,7 +16482,7 @@
       </w:tcPr>
     </w:tblStylePr>
   </w:style>
-  <w:style w:type="table" w:styleId="ColorfulShading-Accent4">
+  <w:style w:type="table" w:styleId="ColourfulShadingAccent4">
     <w:name w:val="Colorful Shading Accent 4"/>
     <w:basedOn w:val="TableNormal"/>
     <w:uiPriority w:val="71"/>
@@ -16870,7 +16596,7 @@
       </w:rPr>
     </w:tblStylePr>
   </w:style>
-  <w:style w:type="table" w:styleId="ColorfulShading-Accent5">
+  <w:style w:type="table" w:styleId="ColourfulShadingAccent5">
     <w:name w:val="Colorful Shading Accent 5"/>
     <w:basedOn w:val="TableNormal"/>
     <w:uiPriority w:val="71"/>
@@ -16984,7 +16710,7 @@
       </w:rPr>
     </w:tblStylePr>
   </w:style>
-  <w:style w:type="table" w:styleId="ColorfulShading-Accent6">
+  <w:style w:type="table" w:styleId="ColourfulShadingAccent6">
     <w:name w:val="Colorful Shading Accent 6"/>
     <w:basedOn w:val="TableNormal"/>
     <w:uiPriority w:val="71"/>
@@ -17952,18 +17678,18 @@
       <w:lang w:val="en-US"/>
     </w:rPr>
   </w:style>
-  <w:style w:type="paragraph" w:styleId="E-mailSignature">
+  <w:style w:type="paragraph" w:styleId="EmailSignature">
     <w:name w:val="E-mail Signature"/>
     <w:basedOn w:val="Normal"/>
-    <w:link w:val="E-mailSignatureChar"/>
+    <w:link w:val="EmailSignatureChar"/>
     <w:uiPriority w:val="99"/>
     <w:semiHidden/>
     <w:rsid w:val="00D27ABD"/>
   </w:style>
-  <w:style w:type="character" w:customStyle="1" w:styleId="E-mailSignatureChar">
-    <w:name w:val="E-mail Signature Char"/>
+  <w:style w:type="character" w:customStyle="1" w:styleId="EmailSignatureChar">
+    <w:name w:val="Email Signature Char"/>
     <w:basedOn w:val="DefaultParagraphFont"/>
-    <w:link w:val="E-mailSignature"/>
+    <w:link w:val="EmailSignature"/>
     <w:uiPriority w:val="99"/>
     <w:semiHidden/>
     <w:rsid w:val="00822F74"/>
@@ -18141,7 +17867,7 @@
       </w:rPr>
     </w:tblStylePr>
   </w:style>
-  <w:style w:type="table" w:styleId="GridTable1Light-Accent2">
+  <w:style w:type="table" w:styleId="GridTable1LightAccent2">
     <w:name w:val="Grid Table 1 Light Accent 2"/>
     <w:basedOn w:val="TableNormal"/>
     <w:uiPriority w:val="46"/>
@@ -21078,7 +20804,7 @@
       </w:tcPr>
     </w:tblStylePr>
   </w:style>
-  <w:style w:type="table" w:styleId="GridTable6Colorful">
+  <w:style w:type="table" w:styleId="GridTable6Colourful">
     <w:name w:val="Grid Table 6 Colorful"/>
     <w:basedOn w:val="TableNormal"/>
     <w:uiPriority w:val="51"/>
@@ -21147,7 +20873,7 @@
       </w:tcPr>
     </w:tblStylePr>
   </w:style>
-  <w:style w:type="table" w:styleId="GridTable6Colorful-Accent1">
+  <w:style w:type="table" w:styleId="GridTable6ColourfulAccent1">
     <w:name w:val="Grid Table 6 Colorful Accent 1"/>
     <w:basedOn w:val="TableNormal"/>
     <w:uiPriority w:val="51"/>
@@ -21216,7 +20942,7 @@
       </w:tcPr>
     </w:tblStylePr>
   </w:style>
-  <w:style w:type="table" w:styleId="GridTable6Colorful-Accent2">
+  <w:style w:type="table" w:styleId="GridTable6ColourfulAccent2">
     <w:name w:val="Grid Table 6 Colorful Accent 2"/>
     <w:basedOn w:val="TableNormal"/>
     <w:uiPriority w:val="51"/>
@@ -21285,7 +21011,7 @@
       </w:tcPr>
     </w:tblStylePr>
   </w:style>
-  <w:style w:type="table" w:styleId="GridTable6Colorful-Accent3">
+  <w:style w:type="table" w:styleId="GridTable6ColourfulAccent3">
     <w:name w:val="Grid Table 6 Colorful Accent 3"/>
     <w:basedOn w:val="TableNormal"/>
     <w:uiPriority w:val="51"/>
@@ -21354,7 +21080,7 @@
       </w:tcPr>
     </w:tblStylePr>
   </w:style>
-  <w:style w:type="table" w:styleId="GridTable6Colorful-Accent4">
+  <w:style w:type="table" w:styleId="GridTable6ColourfulAccent4">
     <w:name w:val="Grid Table 6 Colorful Accent 4"/>
     <w:basedOn w:val="TableNormal"/>
     <w:uiPriority w:val="51"/>
@@ -21423,7 +21149,7 @@
       </w:tcPr>
     </w:tblStylePr>
   </w:style>
-  <w:style w:type="table" w:styleId="GridTable6Colorful-Accent5">
+  <w:style w:type="table" w:styleId="GridTable6ColourfulAccent5">
     <w:name w:val="Grid Table 6 Colorful Accent 5"/>
     <w:basedOn w:val="TableNormal"/>
     <w:uiPriority w:val="51"/>
@@ -21492,7 +21218,7 @@
       </w:tcPr>
     </w:tblStylePr>
   </w:style>
-  <w:style w:type="table" w:styleId="GridTable6Colorful-Accent6">
+  <w:style w:type="table" w:styleId="GridTable6ColourfulAccent6">
     <w:name w:val="Grid Table 6 Colorful Accent 6"/>
     <w:basedOn w:val="TableNormal"/>
     <w:uiPriority w:val="51"/>
@@ -21561,7 +21287,7 @@
       </w:tcPr>
     </w:tblStylePr>
   </w:style>
-  <w:style w:type="table" w:styleId="GridTable7Colorful">
+  <w:style w:type="table" w:styleId="GridTable7Colourful">
     <w:name w:val="Grid Table 7 Colorful"/>
     <w:basedOn w:val="TableNormal"/>
     <w:uiPriority w:val="52"/>
@@ -21697,7 +21423,7 @@
       </w:tcPr>
     </w:tblStylePr>
   </w:style>
-  <w:style w:type="table" w:styleId="GridTable7Colorful-Accent1">
+  <w:style w:type="table" w:styleId="GridTable7ColourfulAccent1">
     <w:name w:val="Grid Table 7 Colorful Accent 1"/>
     <w:basedOn w:val="TableNormal"/>
     <w:uiPriority w:val="52"/>
@@ -21833,7 +21559,7 @@
       </w:tcPr>
     </w:tblStylePr>
   </w:style>
-  <w:style w:type="table" w:styleId="GridTable7Colorful-Accent2">
+  <w:style w:type="table" w:styleId="GridTable7ColourfulAccent2">
     <w:name w:val="Grid Table 7 Colorful Accent 2"/>
     <w:basedOn w:val="TableNormal"/>
     <w:uiPriority w:val="52"/>
@@ -21969,7 +21695,7 @@
       </w:tcPr>
     </w:tblStylePr>
   </w:style>
-  <w:style w:type="table" w:styleId="GridTable7Colorful-Accent3">
+  <w:style w:type="table" w:styleId="GridTable7ColourfulAccent3">
     <w:name w:val="Grid Table 7 Colorful Accent 3"/>
     <w:basedOn w:val="TableNormal"/>
     <w:uiPriority w:val="52"/>
@@ -22105,7 +21831,7 @@
       </w:tcPr>
     </w:tblStylePr>
   </w:style>
-  <w:style w:type="table" w:styleId="GridTable7Colorful-Accent4">
+  <w:style w:type="table" w:styleId="GridTable7ColourfulAccent4">
     <w:name w:val="Grid Table 7 Colorful Accent 4"/>
     <w:basedOn w:val="TableNormal"/>
     <w:uiPriority w:val="52"/>
@@ -22241,7 +21967,7 @@
       </w:tcPr>
     </w:tblStylePr>
   </w:style>
-  <w:style w:type="table" w:styleId="GridTable7Colorful-Accent5">
+  <w:style w:type="table" w:styleId="GridTable7ColourfulAccent5">
     <w:name w:val="Grid Table 7 Colorful Accent 5"/>
     <w:basedOn w:val="TableNormal"/>
     <w:uiPriority w:val="52"/>
@@ -22377,7 +22103,7 @@
       </w:tcPr>
     </w:tblStylePr>
   </w:style>
-  <w:style w:type="table" w:styleId="GridTable7Colorful-Accent6">
+  <w:style w:type="table" w:styleId="GridTable7ColourfulAccent6">
     <w:name w:val="Grid Table 7 Colorful Accent 6"/>
     <w:basedOn w:val="TableNormal"/>
     <w:uiPriority w:val="52"/>
@@ -28253,7 +27979,7 @@
       </w:tcPr>
     </w:tblStylePr>
   </w:style>
-  <w:style w:type="table" w:styleId="ListTable6Colorful">
+  <w:style w:type="table" w:styleId="ListTable6Colourful">
     <w:name w:val="List Table 6 Colorful"/>
     <w:basedOn w:val="TableNormal"/>
     <w:uiPriority w:val="51"/>
@@ -28318,7 +28044,7 @@
       </w:tcPr>
     </w:tblStylePr>
   </w:style>
-  <w:style w:type="table" w:styleId="ListTable6Colorful-Accent1">
+  <w:style w:type="table" w:styleId="ListTable6ColourfulAccent1">
     <w:name w:val="List Table 6 Colorful Accent 1"/>
     <w:basedOn w:val="TableNormal"/>
     <w:uiPriority w:val="51"/>
@@ -28383,7 +28109,7 @@
       </w:tcPr>
     </w:tblStylePr>
   </w:style>
-  <w:style w:type="table" w:styleId="ListTable6Colorful-Accent2">
+  <w:style w:type="table" w:styleId="ListTable6ColourfulAccent2">
     <w:name w:val="List Table 6 Colorful Accent 2"/>
     <w:basedOn w:val="TableNormal"/>
     <w:uiPriority w:val="51"/>
@@ -28448,7 +28174,7 @@
       </w:tcPr>
     </w:tblStylePr>
   </w:style>
-  <w:style w:type="table" w:styleId="ListTable6Colorful-Accent3">
+  <w:style w:type="table" w:styleId="ListTable6ColourfulAccent3">
     <w:name w:val="List Table 6 Colorful Accent 3"/>
     <w:basedOn w:val="TableNormal"/>
     <w:uiPriority w:val="51"/>
@@ -28513,7 +28239,7 @@
       </w:tcPr>
     </w:tblStylePr>
   </w:style>
-  <w:style w:type="table" w:styleId="ListTable6Colorful-Accent4">
+  <w:style w:type="table" w:styleId="ListTable6ColourfulAccent4">
     <w:name w:val="List Table 6 Colorful Accent 4"/>
     <w:basedOn w:val="TableNormal"/>
     <w:uiPriority w:val="51"/>
@@ -28578,7 +28304,7 @@
       </w:tcPr>
     </w:tblStylePr>
   </w:style>
-  <w:style w:type="table" w:styleId="ListTable6Colorful-Accent5">
+  <w:style w:type="table" w:styleId="ListTable6ColourfulAccent5">
     <w:name w:val="List Table 6 Colorful Accent 5"/>
     <w:basedOn w:val="TableNormal"/>
     <w:uiPriority w:val="51"/>
@@ -28643,7 +28369,7 @@
       </w:tcPr>
     </w:tblStylePr>
   </w:style>
-  <w:style w:type="table" w:styleId="ListTable6Colorful-Accent6">
+  <w:style w:type="table" w:styleId="ListTable6ColourfulAccent6">
     <w:name w:val="List Table 6 Colorful Accent 6"/>
     <w:basedOn w:val="TableNormal"/>
     <w:uiPriority w:val="51"/>
@@ -28708,7 +28434,7 @@
       </w:tcPr>
     </w:tblStylePr>
   </w:style>
-  <w:style w:type="table" w:styleId="ListTable7Colorful">
+  <w:style w:type="table" w:styleId="ListTable7Colourful">
     <w:name w:val="List Table 7 Colorful"/>
     <w:basedOn w:val="TableNormal"/>
     <w:uiPriority w:val="52"/>
@@ -28828,7 +28554,7 @@
       </w:tcPr>
     </w:tblStylePr>
   </w:style>
-  <w:style w:type="table" w:styleId="ListTable7Colorful-Accent1">
+  <w:style w:type="table" w:styleId="ListTable7ColourfulAccent1">
     <w:name w:val="List Table 7 Colorful Accent 1"/>
     <w:basedOn w:val="TableNormal"/>
     <w:uiPriority w:val="52"/>
@@ -28948,7 +28674,7 @@
       </w:tcPr>
     </w:tblStylePr>
   </w:style>
-  <w:style w:type="table" w:styleId="ListTable7Colorful-Accent2">
+  <w:style w:type="table" w:styleId="ListTable7ColourfulAccent2">
     <w:name w:val="List Table 7 Colorful Accent 2"/>
     <w:basedOn w:val="TableNormal"/>
     <w:uiPriority w:val="52"/>
@@ -29068,7 +28794,7 @@
       </w:tcPr>
     </w:tblStylePr>
   </w:style>
-  <w:style w:type="table" w:styleId="ListTable7Colorful-Accent3">
+  <w:style w:type="table" w:styleId="ListTable7ColourfulAccent3">
     <w:name w:val="List Table 7 Colorful Accent 3"/>
     <w:basedOn w:val="TableNormal"/>
     <w:uiPriority w:val="52"/>
@@ -29188,7 +28914,7 @@
       </w:tcPr>
     </w:tblStylePr>
   </w:style>
-  <w:style w:type="table" w:styleId="ListTable7Colorful-Accent4">
+  <w:style w:type="table" w:styleId="ListTable7ColourfulAccent4">
     <w:name w:val="List Table 7 Colorful Accent 4"/>
     <w:basedOn w:val="TableNormal"/>
     <w:uiPriority w:val="52"/>
@@ -29308,7 +29034,7 @@
       </w:tcPr>
     </w:tblStylePr>
   </w:style>
-  <w:style w:type="table" w:styleId="ListTable7Colorful-Accent5">
+  <w:style w:type="table" w:styleId="ListTable7ColourfulAccent5">
     <w:name w:val="List Table 7 Colorful Accent 5"/>
     <w:basedOn w:val="TableNormal"/>
     <w:uiPriority w:val="52"/>
@@ -29428,7 +29154,7 @@
       </w:tcPr>
     </w:tblStylePr>
   </w:style>
-  <w:style w:type="table" w:styleId="ListTable7Colorful-Accent6">
+  <w:style w:type="table" w:styleId="ListTable7ColourfulAccent6">
     <w:name w:val="List Table 7 Colorful Accent 6"/>
     <w:basedOn w:val="TableNormal"/>
     <w:uiPriority w:val="52"/>
@@ -35967,7 +35693,7 @@
       </w:tcPr>
     </w:tblStylePr>
   </w:style>
-  <w:style w:type="table" w:styleId="TableColorful1">
+  <w:style w:type="table" w:styleId="TableColourful1">
     <w:name w:val="Table Colorful 1"/>
     <w:basedOn w:val="TableNormal"/>
     <w:uiPriority w:val="99"/>
@@ -36047,7 +35773,7 @@
       </w:tcPr>
     </w:tblStylePr>
   </w:style>
-  <w:style w:type="table" w:styleId="TableColorful2">
+  <w:style w:type="table" w:styleId="TableColourful2">
     <w:name w:val="Table Colorful 2"/>
     <w:basedOn w:val="TableNormal"/>
     <w:uiPriority w:val="99"/>
@@ -36121,7 +35847,7 @@
       </w:tcPr>
     </w:tblStylePr>
   </w:style>
-  <w:style w:type="table" w:styleId="TableColorful3">
+  <w:style w:type="table" w:styleId="TableColourful3">
     <w:name w:val="Table Colorful 3"/>
     <w:basedOn w:val="TableNormal"/>
     <w:uiPriority w:val="99"/>
@@ -38835,7 +38561,7 @@
 </file>
 
 <file path=word/glossary/document.xml><?xml version="1.0" encoding="utf-8"?>
-<w:glossaryDocument xmlns:wpc="http://schemas.microsoft.com/office/word/2010/wordprocessingCanvas" xmlns:cx="http://schemas.microsoft.com/office/drawing/2014/chartex" xmlns:cx1="http://schemas.microsoft.com/office/drawing/2015/9/8/chartex" xmlns:cx2="http://schemas.microsoft.com/office/drawing/2015/10/21/chartex" xmlns:cx3="http://schemas.microsoft.com/office/drawing/2016/5/9/chartex" xmlns:cx4="http://schemas.microsoft.com/office/drawing/2016/5/10/chartex" xmlns:cx5="http://schemas.microsoft.com/office/drawing/2016/5/11/chartex" xmlns:cx6="http://schemas.microsoft.com/office/drawing/2016/5/12/chartex" xmlns:cx7="http://schemas.microsoft.com/office/drawing/2016/5/13/chartex" xmlns:cx8="http://schemas.microsoft.com/office/drawing/2016/5/14/chartex" xmlns:mc="http://schemas.openxmlformats.org/markup-compatibility/2006" xmlns:aink="http://schemas.microsoft.com/office/drawing/2016/ink" xmlns:am3d="http://schemas.microsoft.com/office/drawing/2017/model3d" xmlns:o="urn:schemas-microsoft-com:office:office" xmlns:oel="http://schemas.microsoft.com/office/2019/extlst" xmlns:r="http://schemas.openxmlformats.org/officeDocument/2006/relationships" xmlns:m="http://schemas.openxmlformats.org/officeDocument/2006/math" xmlns:v="urn:schemas-microsoft-com:vml" xmlns:wp14="http://schemas.microsoft.com/office/word/2010/wordprocessingDrawing" xmlns:wp="http://schemas.openxmlformats.org/drawingml/2006/wordprocessingDrawing" xmlns:w10="urn:schemas-microsoft-com:office:word" xmlns:w="http://schemas.openxmlformats.org/wordprocessingml/2006/main" xmlns:w14="http://schemas.microsoft.com/office/word/2010/wordml" xmlns:w15="http://schemas.microsoft.com/office/word/2012/wordml" xmlns:w16cex="http://schemas.microsoft.com/office/word/2018/wordml/cex" xmlns:w16cid="http://schemas.microsoft.com/office/word/2016/wordml/cid" xmlns:w16="http://schemas.microsoft.com/office/word/2018/wordml" xmlns:w16sdtdh="http://schemas.microsoft.com/office/word/2020/wordml/sdtdatahash" xmlns:w16se="http://schemas.microsoft.com/office/word/2015/wordml/symex" xmlns:wpg="http://schemas.microsoft.com/office/word/2010/wordprocessingGroup" xmlns:wpi="http://schemas.microsoft.com/office/word/2010/wordprocessingInk" xmlns:wne="http://schemas.microsoft.com/office/word/2006/wordml" xmlns:wps="http://schemas.microsoft.com/office/word/2010/wordprocessingShape" mc:Ignorable="w14 w15 w16se w16cid w16 w16cex w16sdtdh wp14">
+<w:glossaryDocument xmlns:wpc="http://schemas.microsoft.com/office/word/2010/wordprocessingCanvas" xmlns:cx="http://schemas.microsoft.com/office/drawing/2014/chartex" xmlns:cx1="http://schemas.microsoft.com/office/drawing/2015/9/8/chartex" xmlns:cx2="http://schemas.microsoft.com/office/drawing/2015/10/21/chartex" xmlns:cx3="http://schemas.microsoft.com/office/drawing/2016/5/9/chartex" xmlns:cx4="http://schemas.microsoft.com/office/drawing/2016/5/10/chartex" xmlns:cx5="http://schemas.microsoft.com/office/drawing/2016/5/11/chartex" xmlns:cx6="http://schemas.microsoft.com/office/drawing/2016/5/12/chartex" xmlns:cx7="http://schemas.microsoft.com/office/drawing/2016/5/13/chartex" xmlns:cx8="http://schemas.microsoft.com/office/drawing/2016/5/14/chartex" xmlns:mc="http://schemas.openxmlformats.org/markup-compatibility/2006" xmlns:aink="http://schemas.microsoft.com/office/drawing/2016/ink" xmlns:am3d="http://schemas.microsoft.com/office/drawing/2017/model3d" xmlns:o="urn:schemas-microsoft-com:office:office" xmlns:oel="http://schemas.microsoft.com/office/2019/extlst" xmlns:r="http://schemas.openxmlformats.org/officeDocument/2006/relationships" xmlns:m="http://schemas.openxmlformats.org/officeDocument/2006/math" xmlns:v="urn:schemas-microsoft-com:vml" xmlns:wp14="http://schemas.microsoft.com/office/word/2010/wordprocessingDrawing" xmlns:wp="http://schemas.openxmlformats.org/drawingml/2006/wordprocessingDrawing" xmlns:w10="urn:schemas-microsoft-com:office:word" xmlns:w="http://schemas.openxmlformats.org/wordprocessingml/2006/main" xmlns:w14="http://schemas.microsoft.com/office/word/2010/wordml" xmlns:w15="http://schemas.microsoft.com/office/word/2012/wordml" xmlns:w16cex="http://schemas.microsoft.com/office/word/2018/wordml/cex" xmlns:w16cid="http://schemas.microsoft.com/office/word/2016/wordml/cid" xmlns:w16="http://schemas.microsoft.com/office/word/2018/wordml" xmlns:w16du="http://schemas.microsoft.com/office/word/2023/wordml/word16du" xmlns:w16sdtdh="http://schemas.microsoft.com/office/word/2020/wordml/sdtdatahash" xmlns:w16sdtfl="http://schemas.microsoft.com/office/word/2024/wordml/sdtformatlock" xmlns:w16se="http://schemas.microsoft.com/office/word/2015/wordml/symex" xmlns:wpg="http://schemas.microsoft.com/office/word/2010/wordprocessingGroup" xmlns:wpi="http://schemas.microsoft.com/office/word/2010/wordprocessingInk" xmlns:wne="http://schemas.microsoft.com/office/word/2006/wordml" xmlns:wps="http://schemas.microsoft.com/office/word/2010/wordprocessingShape" mc:Ignorable="w14 w15 w16se w16cid w16 w16cex w16sdtdh w16sdtfl w16du wp14">
   <w:docParts>
     <w:docPart>
       <w:docPartPr>
@@ -38987,7 +38713,7 @@
 </file>
 
 <file path=word/glossary/fontTable.xml><?xml version="1.0" encoding="utf-8"?>
-<w:fonts xmlns:mc="http://schemas.openxmlformats.org/markup-compatibility/2006" xmlns:r="http://schemas.openxmlformats.org/officeDocument/2006/relationships" xmlns:w="http://schemas.openxmlformats.org/wordprocessingml/2006/main" xmlns:w14="http://schemas.microsoft.com/office/word/2010/wordml" xmlns:w15="http://schemas.microsoft.com/office/word/2012/wordml" xmlns:w16cex="http://schemas.microsoft.com/office/word/2018/wordml/cex" xmlns:w16cid="http://schemas.microsoft.com/office/word/2016/wordml/cid" xmlns:w16="http://schemas.microsoft.com/office/word/2018/wordml" xmlns:w16sdtdh="http://schemas.microsoft.com/office/word/2020/wordml/sdtdatahash" xmlns:w16se="http://schemas.microsoft.com/office/word/2015/wordml/symex" mc:Ignorable="w14 w15 w16se w16cid w16 w16cex w16sdtdh">
+<w:fonts xmlns:mc="http://schemas.openxmlformats.org/markup-compatibility/2006" xmlns:r="http://schemas.openxmlformats.org/officeDocument/2006/relationships" xmlns:w="http://schemas.openxmlformats.org/wordprocessingml/2006/main" xmlns:w14="http://schemas.microsoft.com/office/word/2010/wordml" xmlns:w15="http://schemas.microsoft.com/office/word/2012/wordml" xmlns:w16cex="http://schemas.microsoft.com/office/word/2018/wordml/cex" xmlns:w16cid="http://schemas.microsoft.com/office/word/2016/wordml/cid" xmlns:w16="http://schemas.microsoft.com/office/word/2018/wordml" xmlns:w16du="http://schemas.microsoft.com/office/word/2023/wordml/word16du" xmlns:w16sdtdh="http://schemas.microsoft.com/office/word/2020/wordml/sdtdatahash" xmlns:w16sdtfl="http://schemas.microsoft.com/office/word/2024/wordml/sdtformatlock" xmlns:w16se="http://schemas.microsoft.com/office/word/2015/wordml/symex" mc:Ignorable="w14 w15 w16se w16cid w16 w16cex w16sdtdh w16sdtfl w16du">
   <w:font w:name="Symbol">
     <w:panose1 w:val="05050102010706020507"/>
     <w:charset w:val="02"/>
@@ -39017,7 +38743,6 @@
     <w:sig w:usb0="00000000" w:usb1="10000000" w:usb2="00000000" w:usb3="00000000" w:csb0="80000000" w:csb1="00000000"/>
   </w:font>
   <w:font w:name="PMingLiU">
-    <w:altName w:val="新細明體"/>
     <w:panose1 w:val="02010601000101010101"/>
     <w:charset w:val="88"/>
     <w:family w:val="roman"/>
@@ -39026,7 +38751,6 @@
   </w:font>
   <w:font w:name="Ericsson Hilda">
     <w:altName w:val="Calibri"/>
-    <w:panose1 w:val="00000500000000000000"/>
     <w:charset w:val="00"/>
     <w:family w:val="auto"/>
     <w:pitch w:val="variable"/>
@@ -39048,7 +38772,6 @@
     <w:sig w:usb0="E00002FF" w:usb1="6AC7FDFB" w:usb2="08000012" w:usb3="00000000" w:csb0="0002009F" w:csb1="00000000"/>
   </w:font>
   <w:font w:name="MS Mincho">
-    <w:altName w:val="ＭＳ 明朝"/>
     <w:panose1 w:val="02020609040205080304"/>
     <w:charset w:val="80"/>
     <w:family w:val="modern"/>
@@ -39112,7 +38835,7 @@
 </file>
 
 <file path=word/glossary/settings.xml><?xml version="1.0" encoding="utf-8"?>
-<w:settings xmlns:mc="http://schemas.openxmlformats.org/markup-compatibility/2006" xmlns:o="urn:schemas-microsoft-com:office:office" xmlns:r="http://schemas.openxmlformats.org/officeDocument/2006/relationships" xmlns:m="http://schemas.openxmlformats.org/officeDocument/2006/math" xmlns:v="urn:schemas-microsoft-com:vml" xmlns:w10="urn:schemas-microsoft-com:office:word" xmlns:w="http://schemas.openxmlformats.org/wordprocessingml/2006/main" xmlns:w14="http://schemas.microsoft.com/office/word/2010/wordml" xmlns:w15="http://schemas.microsoft.com/office/word/2012/wordml" xmlns:w16cex="http://schemas.microsoft.com/office/word/2018/wordml/cex" xmlns:w16cid="http://schemas.microsoft.com/office/word/2016/wordml/cid" xmlns:w16="http://schemas.microsoft.com/office/word/2018/wordml" xmlns:w16sdtdh="http://schemas.microsoft.com/office/word/2020/wordml/sdtdatahash" xmlns:w16se="http://schemas.microsoft.com/office/word/2015/wordml/symex" xmlns:sl="http://schemas.openxmlformats.org/schemaLibrary/2006/main" mc:Ignorable="w14 w15 w16se w16cid w16 w16cex w16sdtdh">
+<w:settings xmlns:mc="http://schemas.openxmlformats.org/markup-compatibility/2006" xmlns:o="urn:schemas-microsoft-com:office:office" xmlns:r="http://schemas.openxmlformats.org/officeDocument/2006/relationships" xmlns:m="http://schemas.openxmlformats.org/officeDocument/2006/math" xmlns:v="urn:schemas-microsoft-com:vml" xmlns:w10="urn:schemas-microsoft-com:office:word" xmlns:w="http://schemas.openxmlformats.org/wordprocessingml/2006/main" xmlns:w14="http://schemas.microsoft.com/office/word/2010/wordml" xmlns:w15="http://schemas.microsoft.com/office/word/2012/wordml" xmlns:w16cex="http://schemas.microsoft.com/office/word/2018/wordml/cex" xmlns:w16cid="http://schemas.microsoft.com/office/word/2016/wordml/cid" xmlns:w16="http://schemas.microsoft.com/office/word/2018/wordml" xmlns:w16du="http://schemas.microsoft.com/office/word/2023/wordml/word16du" xmlns:w16sdtdh="http://schemas.microsoft.com/office/word/2020/wordml/sdtdatahash" xmlns:w16sdtfl="http://schemas.microsoft.com/office/word/2024/wordml/sdtformatlock" xmlns:w16se="http://schemas.microsoft.com/office/word/2015/wordml/symex" xmlns:sl="http://schemas.openxmlformats.org/schemaLibrary/2006/main" mc:Ignorable="w14 w15 w16se w16cid w16 w16cex w16sdtdh w16sdtfl w16du">
   <w:view w:val="normal"/>
   <w:defaultTabStop w:val="720"/>
   <w:characterSpacingControl w:val="doNotCompress"/>
@@ -39127,8 +38850,10 @@
   </w:compat>
   <w:rsids>
     <w:rsidRoot w:val="00265F61"/>
+    <w:rsid w:val="000110D0"/>
     <w:rsid w:val="000404AD"/>
     <w:rsid w:val="00055FA6"/>
+    <w:rsid w:val="000661F5"/>
     <w:rsid w:val="000C3796"/>
     <w:rsid w:val="000C6C4F"/>
     <w:rsid w:val="000E5CE3"/>
@@ -39195,8 +38920,10 @@
     <w:rsid w:val="00B74554"/>
     <w:rsid w:val="00B75F29"/>
     <w:rsid w:val="00B77817"/>
+    <w:rsid w:val="00B86DF6"/>
     <w:rsid w:val="00BD0025"/>
     <w:rsid w:val="00C364E2"/>
+    <w:rsid w:val="00C50C1F"/>
     <w:rsid w:val="00C50C8A"/>
     <w:rsid w:val="00C54769"/>
     <w:rsid w:val="00C566B6"/>
@@ -39209,6 +38936,7 @@
     <w:rsid w:val="00D82E41"/>
     <w:rsid w:val="00DF1809"/>
     <w:rsid w:val="00E02769"/>
+    <w:rsid w:val="00E161BF"/>
     <w:rsid w:val="00E6572F"/>
     <w:rsid w:val="00EC6B45"/>
     <w:rsid w:val="00F678AD"/>
@@ -39232,14 +38960,14 @@
   </m:mathPr>
   <w:themeFontLang w:val="en-GB" w:eastAsia="ja-JP"/>
   <w:clrSchemeMapping w:bg1="light1" w:t1="dark1" w:bg2="light2" w:t2="dark2" w:accent1="accent1" w:accent2="accent2" w:accent3="accent3" w:accent4="accent4" w:accent5="accent5" w:accent6="accent6" w:hyperlink="hyperlink" w:followedHyperlink="followedHyperlink"/>
-  <w:decimalSymbol w:val=","/>
+  <w:decimalSymbol w:val="."/>
   <w:listSeparator w:val=","/>
   <w15:chartTrackingRefBased/>
 </w:settings>
 </file>
 
 <file path=word/glossary/styles.xml><?xml version="1.0" encoding="utf-8"?>
-<w:styles xmlns:mc="http://schemas.openxmlformats.org/markup-compatibility/2006" xmlns:r="http://schemas.openxmlformats.org/officeDocument/2006/relationships" xmlns:w="http://schemas.openxmlformats.org/wordprocessingml/2006/main" xmlns:w14="http://schemas.microsoft.com/office/word/2010/wordml" xmlns:w15="http://schemas.microsoft.com/office/word/2012/wordml" xmlns:w16cex="http://schemas.microsoft.com/office/word/2018/wordml/cex" xmlns:w16cid="http://schemas.microsoft.com/office/word/2016/wordml/cid" xmlns:w16="http://schemas.microsoft.com/office/word/2018/wordml" xmlns:w16sdtdh="http://schemas.microsoft.com/office/word/2020/wordml/sdtdatahash" xmlns:w16se="http://schemas.microsoft.com/office/word/2015/wordml/symex" mc:Ignorable="w14 w15 w16se w16cid w16 w16cex w16sdtdh">
+<w:styles xmlns:mc="http://schemas.openxmlformats.org/markup-compatibility/2006" xmlns:r="http://schemas.openxmlformats.org/officeDocument/2006/relationships" xmlns:w="http://schemas.openxmlformats.org/wordprocessingml/2006/main" xmlns:w14="http://schemas.microsoft.com/office/word/2010/wordml" xmlns:w15="http://schemas.microsoft.com/office/word/2012/wordml" xmlns:w16cex="http://schemas.microsoft.com/office/word/2018/wordml/cex" xmlns:w16cid="http://schemas.microsoft.com/office/word/2016/wordml/cid" xmlns:w16="http://schemas.microsoft.com/office/word/2018/wordml" xmlns:w16du="http://schemas.microsoft.com/office/word/2023/wordml/word16du" xmlns:w16sdtdh="http://schemas.microsoft.com/office/word/2020/wordml/sdtdatahash" xmlns:w16sdtfl="http://schemas.microsoft.com/office/word/2024/wordml/sdtformatlock" xmlns:w16se="http://schemas.microsoft.com/office/word/2015/wordml/symex" mc:Ignorable="w14 w15 w16se w16cid w16 w16cex w16sdtdh w16sdtfl w16du">
   <w:docDefaults>
     <w:rPrDefault>
       <w:rPr>
@@ -39700,7 +39428,34 @@
       <w:kern w:val="2"/>
       <w:sz w:val="24"/>
       <w:szCs w:val="24"/>
-      <w:lang w:val="en-SE" w:eastAsia="en-SE"/>
+      <w14:ligatures w14:val="standardContextual"/>
+    </w:rPr>
+  </w:style>
+  <w:style w:type="paragraph" w:customStyle="1" w:styleId="869DC69D235C4D8FA7718BEE50DDA647">
+    <w:name w:val="869DC69D235C4D8FA7718BEE50DDA647"/>
+    <w:rsid w:val="00C50C1F"/>
+    <w:pPr>
+      <w:spacing w:line="278" w:lineRule="auto"/>
+    </w:pPr>
+    <w:rPr>
+      <w:kern w:val="2"/>
+      <w:sz w:val="24"/>
+      <w:szCs w:val="24"/>
+      <w:lang/>
+      <w14:ligatures w14:val="standardContextual"/>
+    </w:rPr>
+  </w:style>
+  <w:style w:type="paragraph" w:customStyle="1" w:styleId="60F07643580C48248581389685B76B04">
+    <w:name w:val="60F07643580C48248581389685B76B04"/>
+    <w:rsid w:val="00C50C1F"/>
+    <w:pPr>
+      <w:spacing w:line="278" w:lineRule="auto"/>
+    </w:pPr>
+    <w:rPr>
+      <w:kern w:val="2"/>
+      <w:sz w:val="24"/>
+      <w:szCs w:val="24"/>
+      <w:lang/>
       <w14:ligatures w14:val="standardContextual"/>
     </w:rPr>
   </w:style>
@@ -39708,7 +39463,7 @@
 </file>
 
 <file path=word/glossary/webSettings.xml><?xml version="1.0" encoding="utf-8"?>
-<w:webSettings xmlns:mc="http://schemas.openxmlformats.org/markup-compatibility/2006" xmlns:r="http://schemas.openxmlformats.org/officeDocument/2006/relationships" xmlns:w="http://schemas.openxmlformats.org/wordprocessingml/2006/main" xmlns:w14="http://schemas.microsoft.com/office/word/2010/wordml" xmlns:w15="http://schemas.microsoft.com/office/word/2012/wordml" xmlns:w16cex="http://schemas.microsoft.com/office/word/2018/wordml/cex" xmlns:w16cid="http://schemas.microsoft.com/office/word/2016/wordml/cid" xmlns:w16="http://schemas.microsoft.com/office/word/2018/wordml" xmlns:w16sdtdh="http://schemas.microsoft.com/office/word/2020/wordml/sdtdatahash" xmlns:w16se="http://schemas.microsoft.com/office/word/2015/wordml/symex" mc:Ignorable="w14 w15 w16se w16cid w16 w16cex w16sdtdh">
+<w:webSettings xmlns:mc="http://schemas.openxmlformats.org/markup-compatibility/2006" xmlns:r="http://schemas.openxmlformats.org/officeDocument/2006/relationships" xmlns:w="http://schemas.openxmlformats.org/wordprocessingml/2006/main" xmlns:w14="http://schemas.microsoft.com/office/word/2010/wordml" xmlns:w15="http://schemas.microsoft.com/office/word/2012/wordml" xmlns:w16cex="http://schemas.microsoft.com/office/word/2018/wordml/cex" xmlns:w16cid="http://schemas.microsoft.com/office/word/2016/wordml/cid" xmlns:w16="http://schemas.microsoft.com/office/word/2018/wordml" xmlns:w16du="http://schemas.microsoft.com/office/word/2023/wordml/word16du" xmlns:w16sdtdh="http://schemas.microsoft.com/office/word/2020/wordml/sdtdatahash" xmlns:w16sdtfl="http://schemas.microsoft.com/office/word/2024/wordml/sdtformatlock" xmlns:w16se="http://schemas.microsoft.com/office/word/2015/wordml/symex" mc:Ignorable="w14 w15 w16se w16cid w16 w16cex w16sdtdh w16sdtfl w16du">
   <w:optimizeForBrowser/>
   <w:allowPNG/>
 </w:webSettings>

</xml_diff>

<commit_message>
Added note about -cyclicpacing option
</commit_message>
<xml_diff>
--- a/SCReAM-BW-test-tool.docx
+++ b/SCReAM-BW-test-tool.docx
@@ -484,15 +484,7 @@
         <w:t>est tool can operate at bitrates ranging from a few 100 kbps up to about 500Mbps</w:t>
       </w:r>
       <w:r>
-        <w:t xml:space="preserve">. As mentioned </w:t>
-      </w:r>
-      <w:proofErr w:type="gramStart"/>
-      <w:r>
-        <w:t>before</w:t>
-      </w:r>
-      <w:proofErr w:type="gramEnd"/>
-      <w:r>
-        <w:t xml:space="preserve"> the tool does not generate any meaningful video</w:t>
+        <w:t>. As mentioned before the tool does not generate any meaningful video</w:t>
       </w:r>
       <w:r>
         <w:t>, it does however mimic video en</w:t>
@@ -595,7 +587,6 @@
         <w:t xml:space="preserve">&gt; </w:t>
       </w:r>
       <w:proofErr w:type="spellStart"/>
-      <w:proofErr w:type="gramStart"/>
       <w:r>
         <w:t>cmake</w:t>
       </w:r>
@@ -603,7 +594,6 @@
       <w:r>
         <w:t xml:space="preserve"> .</w:t>
       </w:r>
-      <w:proofErr w:type="gramEnd"/>
       <w:r>
         <w:br/>
         <w:t>&gt; make</w:t>
@@ -614,15 +604,7 @@
         <w:t xml:space="preserve">The binaries are </w:t>
       </w:r>
       <w:r>
-        <w:t xml:space="preserve">found in </w:t>
-      </w:r>
-      <w:proofErr w:type="gramStart"/>
-      <w:r>
-        <w:t>the .</w:t>
-      </w:r>
-      <w:proofErr w:type="gramEnd"/>
-      <w:r>
-        <w:t xml:space="preserve">/bin folder as </w:t>
+        <w:t xml:space="preserve">found in the ./bin folder as </w:t>
       </w:r>
     </w:p>
     <w:p>
@@ -931,15 +913,7 @@
       </w:r>
       <w:proofErr w:type="spellEnd"/>
       <w:r>
-        <w:t xml:space="preserve"> | F-Droid - Free and </w:t>
-      </w:r>
-      <w:proofErr w:type="gramStart"/>
-      <w:r>
-        <w:t>Open Source</w:t>
-      </w:r>
-      <w:proofErr w:type="gramEnd"/>
-      <w:r>
-        <w:t xml:space="preserve"> Android App Repository, I chose</w:t>
+        <w:t xml:space="preserve"> | F-Droid - Free and Open Source Android App Repository, I chose</w:t>
       </w:r>
       <w:r>
         <w:t xml:space="preserve"> </w:t>
@@ -1022,15 +996,7 @@
         <w:t>F</w:t>
       </w:r>
       <w:r>
-        <w:t xml:space="preserve">rom UE UI, choose files-&gt;internal storage-&gt;Download, com.termux_118.apk should show up there. Click on it, you should see the install from unknown source notice, click on setting to allow </w:t>
-      </w:r>
-      <w:proofErr w:type="gramStart"/>
-      <w:r>
-        <w:t>installing</w:t>
-      </w:r>
-      <w:proofErr w:type="gramEnd"/>
-      <w:r>
-        <w:t xml:space="preserve"> from unknown source. Then it is installed.</w:t>
+        <w:t>rom UE UI, choose files-&gt;internal storage-&gt;Download, com.termux_118.apk should show up there. Click on it, you should see the install from unknown source notice, click on setting to allow installing from unknown source. Then it is installed.</w:t>
       </w:r>
     </w:p>
     <w:p>
@@ -1151,18 +1117,10 @@
         <w:t>&gt;</w:t>
       </w:r>
       <w:r>
-        <w:t xml:space="preserve">pkg install </w:t>
-      </w:r>
-      <w:proofErr w:type="gramStart"/>
-      <w:r>
-        <w:t>vim</w:t>
-      </w:r>
-      <w:r>
-        <w:t xml:space="preserve">  (</w:t>
-      </w:r>
-      <w:proofErr w:type="gramEnd"/>
-      <w:r>
-        <w:t>or nano)</w:t>
+        <w:t>pkg install vim</w:t>
+      </w:r>
+      <w:r>
+        <w:t xml:space="preserve">  (or nano)</w:t>
       </w:r>
     </w:p>
     <w:p>
@@ -1261,28 +1219,15 @@
       <w:r>
         <w:t>&gt;</w:t>
       </w:r>
-      <w:proofErr w:type="gramStart"/>
-      <w:r>
-        <w:t>cd .</w:t>
-      </w:r>
-      <w:proofErr w:type="gramEnd"/>
-      <w:r>
-        <w:t>/scream</w:t>
+      <w:r>
+        <w:t>cd ./scream</w:t>
       </w:r>
       <w:r>
         <w:br/>
         <w:t xml:space="preserve">In </w:t>
       </w:r>
       <w:r>
-        <w:t xml:space="preserve">file: CMakeLists.txt </w:t>
-      </w:r>
-      <w:proofErr w:type="gramStart"/>
-      <w:r>
-        <w:t>SET(</w:t>
-      </w:r>
-      <w:proofErr w:type="gramEnd"/>
-      <w:r>
-        <w:t>CMAKE_CXX_FLAGS "-</w:t>
+        <w:t>file: CMakeLists.txt SET(CMAKE_CXX_FLAGS "-</w:t>
       </w:r>
       <w:proofErr w:type="spellStart"/>
       <w:r>
@@ -1306,15 +1251,7 @@
       </w:r>
       <w:proofErr w:type="spellEnd"/>
       <w:r>
-        <w:t xml:space="preserve">") to </w:t>
-      </w:r>
-      <w:proofErr w:type="gramStart"/>
-      <w:r>
-        <w:t>SET(</w:t>
-      </w:r>
-      <w:proofErr w:type="gramEnd"/>
-      <w:r>
-        <w:t>CMAKE_CXX_FLAGS "-</w:t>
+        <w:t>") to SET(CMAKE_CXX_FLAGS "-</w:t>
       </w:r>
       <w:proofErr w:type="spellStart"/>
       <w:r>
@@ -1354,7 +1291,6 @@
         <w:t>&gt;</w:t>
       </w:r>
       <w:proofErr w:type="spellStart"/>
-      <w:proofErr w:type="gramStart"/>
       <w:r>
         <w:t>cmake</w:t>
       </w:r>
@@ -1362,7 +1298,6 @@
       <w:r>
         <w:t xml:space="preserve"> .</w:t>
       </w:r>
-      <w:proofErr w:type="gramEnd"/>
     </w:p>
     <w:p>
       <w:pPr>
@@ -1390,15 +1325,7 @@
         <w:ind w:left="426"/>
       </w:pPr>
       <w:r>
-        <w:t xml:space="preserve">In </w:t>
-      </w:r>
-      <w:proofErr w:type="gramStart"/>
-      <w:r>
-        <w:t>directory .</w:t>
-      </w:r>
-      <w:proofErr w:type="gramEnd"/>
-      <w:r>
-        <w:t xml:space="preserve">/bin/ you should </w:t>
+        <w:t xml:space="preserve">In directory ./bin/ you should </w:t>
       </w:r>
       <w:r>
         <w:t xml:space="preserve">now </w:t>
@@ -1628,15 +1555,7 @@
         <w:keepNext/>
       </w:pPr>
       <w:r>
-        <w:t xml:space="preserve">The </w:t>
-      </w:r>
-      <w:proofErr w:type="gramStart"/>
-      <w:r>
-        <w:t>most simple</w:t>
-      </w:r>
-      <w:proofErr w:type="gramEnd"/>
-      <w:r>
-        <w:t xml:space="preserve"> </w:t>
+        <w:t xml:space="preserve">The most simple </w:t>
       </w:r>
       <w:r>
         <w:t xml:space="preserve">running </w:t>
@@ -1777,21 +1696,7 @@
         <w:rPr>
           <w:rFonts w:asciiTheme="majorHAnsi" w:hAnsiTheme="majorHAnsi" w:cs="Cambria Math"/>
         </w:rPr>
-        <w:t xml:space="preserve">Note that the IP and PORT </w:t>
-      </w:r>
-      <w:proofErr w:type="gramStart"/>
-      <w:r>
-        <w:rPr>
-          <w:rFonts w:asciiTheme="majorHAnsi" w:hAnsiTheme="majorHAnsi" w:cs="Cambria Math"/>
-        </w:rPr>
-        <w:t>is</w:t>
-      </w:r>
-      <w:proofErr w:type="gramEnd"/>
-      <w:r>
-        <w:rPr>
-          <w:rFonts w:asciiTheme="majorHAnsi" w:hAnsiTheme="majorHAnsi" w:cs="Cambria Math"/>
-        </w:rPr>
-        <w:t xml:space="preserve"> last. </w:t>
+        <w:t xml:space="preserve">Note that the IP and PORT is last. </w:t>
       </w:r>
       <w:r>
         <w:rPr>
@@ -2007,13 +1912,8 @@
           <w:numId w:val="40"/>
         </w:numPr>
       </w:pPr>
-      <w:proofErr w:type="gramStart"/>
-      <w:r>
-        <w:t>CE  marking</w:t>
-      </w:r>
-      <w:proofErr w:type="gramEnd"/>
-      <w:r>
-        <w:t xml:space="preserve"> rate (CE), two values</w:t>
+      <w:r>
+        <w:t>CE  marking rate (CE), two values</w:t>
       </w:r>
     </w:p>
     <w:p>
@@ -2059,23 +1959,7 @@
       </w:r>
       <w:r>
         <w:br/>
-        <w:t xml:space="preserve">[Not-ECT%, </w:t>
-      </w:r>
-      <w:proofErr w:type="gramStart"/>
-      <w:r>
-        <w:t>ECT(0)%</w:t>
-      </w:r>
-      <w:proofErr w:type="gramEnd"/>
-      <w:r>
-        <w:t xml:space="preserve">, </w:t>
-      </w:r>
-      <w:proofErr w:type="gramStart"/>
-      <w:r>
-        <w:t>ECT(1)%</w:t>
-      </w:r>
-      <w:proofErr w:type="gramEnd"/>
-      <w:r>
-        <w:t>, CE%]</w:t>
+        <w:t>[Not-ECT%, ECT(0)%, ECT(1)%, CE%]</w:t>
       </w:r>
       <w:r>
         <w:t xml:space="preserve"> </w:t>
@@ -2311,7 +2195,6 @@
       <w:r>
         <w:t xml:space="preserve">the </w:t>
       </w:r>
-      <w:proofErr w:type="gramStart"/>
       <w:r>
         <w:t>most</w:t>
       </w:r>
@@ -2319,22 +2202,10 @@
         <w:t xml:space="preserve"> </w:t>
       </w:r>
       <w:r>
-        <w:t>commonly used</w:t>
-      </w:r>
-      <w:proofErr w:type="gramEnd"/>
-      <w:r>
-        <w:t xml:space="preserve"> parameters first. </w:t>
-      </w:r>
-      <w:r>
-        <w:t xml:space="preserve">Some options are not </w:t>
-      </w:r>
-      <w:proofErr w:type="gramStart"/>
-      <w:r>
-        <w:t>listed,</w:t>
-      </w:r>
-      <w:proofErr w:type="gramEnd"/>
-      <w:r>
-        <w:t xml:space="preserve"> they will be added as users begin to ask about them</w:t>
+        <w:t xml:space="preserve">commonly used parameters first. </w:t>
+      </w:r>
+      <w:r>
+        <w:t>Some options are not listed, they will be added as users begin to ask about them</w:t>
       </w:r>
     </w:p>
     <w:p>
@@ -2525,25 +2396,7 @@
                 <w:sz w:val="16"/>
                 <w:szCs w:val="16"/>
               </w:rPr>
-              <w:t xml:space="preserve"> </w:t>
-            </w:r>
-            <w:proofErr w:type="gramStart"/>
-            <w:r>
-              <w:rPr>
-                <w:rFonts w:asciiTheme="minorHAnsi" w:hAnsiTheme="minorHAnsi" w:cs="Cambria Math"/>
-                <w:sz w:val="16"/>
-                <w:szCs w:val="16"/>
-              </w:rPr>
-              <w:t>default</w:t>
-            </w:r>
-            <w:proofErr w:type="gramEnd"/>
-            <w:r>
-              <w:rPr>
-                <w:rFonts w:asciiTheme="minorHAnsi" w:hAnsiTheme="minorHAnsi" w:cs="Cambria Math"/>
-                <w:sz w:val="16"/>
-                <w:szCs w:val="16"/>
-              </w:rPr>
-              <w:t xml:space="preserve"> 200000kbps (200Mbps)</w:t>
+              <w:t xml:space="preserve"> default 200000kbps (200Mbps)</w:t>
             </w:r>
           </w:p>
         </w:tc>
@@ -3731,25 +3584,7 @@
                 <w:sz w:val="16"/>
                 <w:szCs w:val="16"/>
               </w:rPr>
-              <w:t xml:space="preserve">Trigger point when </w:t>
-            </w:r>
-            <w:proofErr w:type="gramStart"/>
-            <w:r>
-              <w:rPr>
-                <w:rFonts w:asciiTheme="minorHAnsi" w:hAnsiTheme="minorHAnsi" w:cs="Cambria Math"/>
-                <w:sz w:val="16"/>
-                <w:szCs w:val="16"/>
-              </w:rPr>
-              <w:t>delay based</w:t>
-            </w:r>
-            <w:proofErr w:type="gramEnd"/>
-            <w:r>
-              <w:rPr>
-                <w:rFonts w:asciiTheme="minorHAnsi" w:hAnsiTheme="minorHAnsi" w:cs="Cambria Math"/>
-                <w:sz w:val="16"/>
-                <w:szCs w:val="16"/>
-              </w:rPr>
-              <w:t xml:space="preserve"> congestion control should set in. Bitrate is gradually reduced as the estimated queue delay &gt; </w:t>
+              <w:t xml:space="preserve">Trigger point when delay based congestion control should set in. Bitrate is gradually reduced as the estimated queue delay &gt; </w:t>
             </w:r>
             <w:proofErr w:type="spellStart"/>
             <w:r>
@@ -3921,25 +3756,7 @@
                 <w:sz w:val="16"/>
                 <w:szCs w:val="16"/>
               </w:rPr>
-              <w:t xml:space="preserve"> A value 0.05 means that the CWND can increase by </w:t>
-            </w:r>
-            <w:proofErr w:type="gramStart"/>
-            <w:r>
-              <w:rPr>
-                <w:rFonts w:asciiTheme="minorHAnsi" w:hAnsiTheme="minorHAnsi" w:cs="Cambria Math"/>
-                <w:sz w:val="16"/>
-                <w:szCs w:val="16"/>
-              </w:rPr>
-              <w:t>max(</w:t>
-            </w:r>
-            <w:proofErr w:type="gramEnd"/>
-            <w:r>
-              <w:rPr>
-                <w:rFonts w:asciiTheme="minorHAnsi" w:hAnsiTheme="minorHAnsi" w:cs="Cambria Math"/>
-                <w:sz w:val="16"/>
-                <w:szCs w:val="16"/>
-              </w:rPr>
-              <w:t xml:space="preserve">MSS, 0.05*CWND) per RTT.  </w:t>
+              <w:t xml:space="preserve"> A value 0.05 means that the CWND can increase by max(MSS, 0.05*CWND) per RTT.  </w:t>
             </w:r>
             <w:r>
               <w:rPr>
@@ -4126,6 +3943,84 @@
                 <w:szCs w:val="16"/>
               </w:rPr>
               <w:t xml:space="preserve"> until a full increase of CWND is reached.</w:t>
+            </w:r>
+          </w:p>
+        </w:tc>
+      </w:tr>
+      <w:tr>
+        <w:trPr>
+          <w:trHeight w:val="65"/>
+        </w:trPr>
+        <w:tc>
+          <w:tcPr>
+            <w:tcW w:w="2122" w:type="dxa"/>
+          </w:tcPr>
+          <w:p>
+            <w:pPr>
+              <w:spacing w:after="120"/>
+              <w:rPr>
+                <w:rFonts w:asciiTheme="minorHAnsi" w:hAnsiTheme="minorHAnsi" w:cs="Cambria Math"/>
+                <w:sz w:val="16"/>
+                <w:szCs w:val="16"/>
+              </w:rPr>
+            </w:pPr>
+            <w:r>
+              <w:rPr>
+                <w:rFonts w:asciiTheme="minorHAnsi" w:hAnsiTheme="minorHAnsi" w:cs="Cambria Math"/>
+                <w:sz w:val="16"/>
+                <w:szCs w:val="16"/>
+              </w:rPr>
+              <w:t>-</w:t>
+            </w:r>
+            <w:proofErr w:type="spellStart"/>
+            <w:r>
+              <w:rPr>
+                <w:rFonts w:asciiTheme="minorHAnsi" w:hAnsiTheme="minorHAnsi" w:cs="Cambria Math"/>
+                <w:sz w:val="16"/>
+                <w:szCs w:val="16"/>
+              </w:rPr>
+              <w:t>cyclicpacing</w:t>
+            </w:r>
+            <w:proofErr w:type="spellEnd"/>
+          </w:p>
+        </w:tc>
+        <w:tc>
+          <w:tcPr>
+            <w:tcW w:w="6804" w:type="dxa"/>
+          </w:tcPr>
+          <w:p>
+            <w:pPr>
+              <w:spacing w:after="120"/>
+              <w:rPr>
+                <w:rFonts w:asciiTheme="minorHAnsi" w:hAnsiTheme="minorHAnsi" w:cs="Cambria Math"/>
+                <w:sz w:val="16"/>
+                <w:szCs w:val="16"/>
+              </w:rPr>
+            </w:pPr>
+            <w:r>
+              <w:rPr>
+                <w:rFonts w:asciiTheme="minorHAnsi" w:hAnsiTheme="minorHAnsi" w:cs="Cambria Math"/>
+                <w:sz w:val="16"/>
+                <w:szCs w:val="16"/>
+              </w:rPr>
+              <w:t>Packet paging gain is increased by 25% every 4</w:t>
+            </w:r>
+            <w:r>
+              <w:rPr>
+                <w:rFonts w:asciiTheme="minorHAnsi" w:hAnsiTheme="minorHAnsi" w:cs="Cambria Math"/>
+                <w:sz w:val="16"/>
+                <w:szCs w:val="16"/>
+                <w:vertAlign w:val="superscript"/>
+              </w:rPr>
+              <w:t>th</w:t>
+            </w:r>
+            <w:r>
+              <w:rPr>
+                <w:rFonts w:asciiTheme="minorHAnsi" w:hAnsiTheme="minorHAnsi" w:cs="Cambria Math"/>
+                <w:sz w:val="16"/>
+                <w:szCs w:val="16"/>
+              </w:rPr>
+              <w:t xml:space="preserve"> RTT. This feature periodically tests bottleneck capacity and can solve an issue that the target rate can occasionally oscillate because the test tool normally produces frames that are constant size for the given target and frame rate.  </w:t>
             </w:r>
           </w:p>
         </w:tc>
@@ -4475,79 +4370,7 @@
                 <w:sz w:val="16"/>
                 <w:szCs w:val="16"/>
               </w:rPr>
-              <w:t xml:space="preserve">. Which means that </w:t>
-            </w:r>
-            <w:proofErr w:type="gramStart"/>
-            <w:r>
-              <w:rPr>
-                <w:rFonts w:asciiTheme="minorHAnsi" w:hAnsiTheme="minorHAnsi" w:cs="Cambria Math"/>
-                <w:sz w:val="16"/>
-                <w:szCs w:val="16"/>
-              </w:rPr>
-              <w:t>an RTCP feedback</w:t>
-            </w:r>
-            <w:proofErr w:type="gramEnd"/>
-            <w:r>
-              <w:rPr>
-                <w:rFonts w:asciiTheme="minorHAnsi" w:hAnsiTheme="minorHAnsi" w:cs="Cambria Math"/>
-                <w:sz w:val="16"/>
-                <w:szCs w:val="16"/>
-              </w:rPr>
-              <w:t xml:space="preserve"> is transmitted no more seldom than </w:t>
-            </w:r>
-            <w:proofErr w:type="gramStart"/>
-            <w:r>
-              <w:rPr>
-                <w:rFonts w:asciiTheme="minorHAnsi" w:hAnsiTheme="minorHAnsi" w:cs="Cambria Math"/>
-                <w:sz w:val="16"/>
-                <w:szCs w:val="16"/>
-              </w:rPr>
-              <w:t>evert</w:t>
-            </w:r>
-            <w:proofErr w:type="gramEnd"/>
-            <w:r>
-              <w:rPr>
-                <w:rFonts w:asciiTheme="minorHAnsi" w:hAnsiTheme="minorHAnsi" w:cs="Cambria Math"/>
-                <w:sz w:val="16"/>
-                <w:szCs w:val="16"/>
-              </w:rPr>
-              <w:t xml:space="preserve"> 16 RTP packets. </w:t>
-            </w:r>
-            <w:proofErr w:type="gramStart"/>
-            <w:r>
-              <w:rPr>
-                <w:rFonts w:asciiTheme="minorHAnsi" w:hAnsiTheme="minorHAnsi" w:cs="Cambria Math"/>
-                <w:sz w:val="16"/>
-                <w:szCs w:val="16"/>
-              </w:rPr>
-              <w:t>For at</w:t>
-            </w:r>
-            <w:proofErr w:type="gramEnd"/>
-            <w:r>
-              <w:rPr>
-                <w:rFonts w:asciiTheme="minorHAnsi" w:hAnsiTheme="minorHAnsi" w:cs="Cambria Math"/>
-                <w:sz w:val="16"/>
-                <w:szCs w:val="16"/>
-              </w:rPr>
-              <w:t xml:space="preserve"> low </w:t>
-            </w:r>
-            <w:proofErr w:type="gramStart"/>
-            <w:r>
-              <w:rPr>
-                <w:rFonts w:asciiTheme="minorHAnsi" w:hAnsiTheme="minorHAnsi" w:cs="Cambria Math"/>
-                <w:sz w:val="16"/>
-                <w:szCs w:val="16"/>
-              </w:rPr>
-              <w:t>bitrates</w:t>
-            </w:r>
-            <w:proofErr w:type="gramEnd"/>
-            <w:r>
-              <w:rPr>
-                <w:rFonts w:asciiTheme="minorHAnsi" w:hAnsiTheme="minorHAnsi" w:cs="Cambria Math"/>
-                <w:sz w:val="16"/>
-                <w:szCs w:val="16"/>
-              </w:rPr>
-              <w:t xml:space="preserve"> it can in some cases be beneficial to set -</w:t>
+              <w:t>. Which means that an RTCP feedback is transmitted no more seldom than evert 16 RTP packets. For at low bitrates it can in some cases be beneficial to set -</w:t>
             </w:r>
             <w:proofErr w:type="spellStart"/>
             <w:r>
@@ -4699,15 +4522,7 @@
         <w:t xml:space="preserve"> BW test tool </w:t>
       </w:r>
       <w:r>
-        <w:t xml:space="preserve">provides logs, besides the </w:t>
-      </w:r>
-      <w:proofErr w:type="gramStart"/>
-      <w:r>
-        <w:t>aforementioned summary</w:t>
-      </w:r>
-      <w:proofErr w:type="gramEnd"/>
-      <w:r>
-        <w:t xml:space="preserve"> logs </w:t>
+        <w:t xml:space="preserve">provides logs, besides the aforementioned summary logs </w:t>
       </w:r>
     </w:p>
     <w:p>
@@ -4934,13 +4749,8 @@
         </w:numPr>
         <w:ind w:left="709"/>
       </w:pPr>
-      <w:proofErr w:type="gramStart"/>
-      <w:r>
-        <w:t>Total</w:t>
-      </w:r>
-      <w:proofErr w:type="gramEnd"/>
-      <w:r>
-        <w:t xml:space="preserve"> transmit bitrate [kbps]</w:t>
+      <w:r>
+        <w:t>Total transmit bitrate [kbps]</w:t>
       </w:r>
     </w:p>
     <w:p>
@@ -5019,27 +4829,11 @@
     </w:p>
     <w:p>
       <w:r>
-        <w:t xml:space="preserve">The logfile gives more detailed information that is </w:t>
-      </w:r>
-      <w:proofErr w:type="gramStart"/>
-      <w:r>
-        <w:t>useful</w:t>
-      </w:r>
-      <w:proofErr w:type="gramEnd"/>
-      <w:r>
-        <w:t xml:space="preserve"> for instance for presentation of time traces or for statistical analysis.</w:t>
+        <w:t>The logfile gives more detailed information that is useful for instance for presentation of time traces or for statistical analysis.</w:t>
       </w:r>
       <w:r>
         <w:br/>
-        <w:t xml:space="preserve">The logfile is one line per received RTCP feedback, with the additional </w:t>
-      </w:r>
-      <w:proofErr w:type="gramStart"/>
-      <w:r>
-        <w:t>option -detailed</w:t>
-      </w:r>
-      <w:proofErr w:type="gramEnd"/>
-      <w:r>
-        <w:t xml:space="preserve">. One line is produced for each acknowledged RTP packet. </w:t>
+        <w:t xml:space="preserve">The logfile is one line per received RTCP feedback, with the additional option -detailed. One line is produced for each acknowledged RTP packet. </w:t>
       </w:r>
       <w:r>
         <w:t xml:space="preserve">An example log is </w:t>
@@ -5389,7 +5183,6 @@
           <w:color w:val="181818"/>
         </w:rPr>
       </w:pPr>
-      <w:proofErr w:type="gramStart"/>
       <w:r>
         <w:rPr>
           <w:rFonts w:eastAsiaTheme="minorEastAsia" w:cstheme="minorBidi"/>
@@ -5397,17 +5190,7 @@
           <w:spacing w:val="-6"/>
           <w:kern w:val="24"/>
         </w:rPr>
-        <w:t>Total</w:t>
-      </w:r>
-      <w:proofErr w:type="gramEnd"/>
-      <w:r>
-        <w:rPr>
-          <w:rFonts w:eastAsiaTheme="minorEastAsia" w:cstheme="minorBidi"/>
-          <w:color w:val="181818"/>
-          <w:spacing w:val="-6"/>
-          <w:kern w:val="24"/>
-        </w:rPr>
-        <w:t xml:space="preserve"> transmit bitrate [bps] </w:t>
+        <w:t xml:space="preserve">Total transmit bitrate [bps] </w:t>
       </w:r>
       <w:r>
         <w:rPr>
@@ -5885,15 +5668,7 @@
     <w:p/>
     <w:p>
       <w:r>
-        <w:t xml:space="preserve">The log file contains some items that are either superfluous or </w:t>
-      </w:r>
-      <w:proofErr w:type="gramStart"/>
-      <w:r>
-        <w:t>duplicates</w:t>
-      </w:r>
-      <w:proofErr w:type="gramEnd"/>
-      <w:r>
-        <w:t xml:space="preserve">. The reason is that the same logging is used for multi stream applications. </w:t>
+        <w:t xml:space="preserve">The log file contains some items that are either superfluous or duplicates. The reason is that the same logging is used for multi stream applications. </w:t>
       </w:r>
     </w:p>
     <w:p>
@@ -5912,13 +5687,8 @@
       </w:r>
       <w:proofErr w:type="spellEnd"/>
       <w:r>
-        <w:t xml:space="preserve"> BW test tool </w:t>
-      </w:r>
-      <w:proofErr w:type="gramStart"/>
-      <w:r>
-        <w:t>are :</w:t>
-      </w:r>
-      <w:proofErr w:type="gramEnd"/>
+        <w:t xml:space="preserve"> BW test tool are :</w:t>
+      </w:r>
     </w:p>
     <w:p>
       <w:pPr>
@@ -5950,9 +5720,8 @@
           <w:spacing w:val="-6"/>
           <w:kern w:val="24"/>
         </w:rPr>
-        <w:t xml:space="preserve">Col </w:t>
-      </w:r>
-      <w:proofErr w:type="gramStart"/>
+        <w:t>Col 1:</w:t>
+      </w:r>
       <w:r>
         <w:rPr>
           <w:rFonts w:eastAsiaTheme="minorEastAsia" w:cstheme="minorBidi"/>
@@ -5960,26 +5729,7 @@
           <w:spacing w:val="-6"/>
           <w:kern w:val="24"/>
         </w:rPr>
-        <w:t>1:</w:t>
-      </w:r>
-      <w:r>
-        <w:rPr>
-          <w:rFonts w:eastAsiaTheme="minorEastAsia" w:cstheme="minorBidi"/>
-          <w:color w:val="181818"/>
-          <w:spacing w:val="-6"/>
-          <w:kern w:val="24"/>
-        </w:rPr>
-        <w:t>Time</w:t>
-      </w:r>
-      <w:proofErr w:type="gramEnd"/>
-      <w:r>
-        <w:rPr>
-          <w:rFonts w:eastAsiaTheme="minorEastAsia" w:cstheme="minorBidi"/>
-          <w:color w:val="181818"/>
-          <w:spacing w:val="-6"/>
-          <w:kern w:val="24"/>
-        </w:rPr>
-        <w:t xml:space="preserve"> [s] </w:t>
+        <w:t xml:space="preserve">Time [s] </w:t>
       </w:r>
     </w:p>
     <w:p>
@@ -6012,9 +5762,8 @@
           <w:spacing w:val="-6"/>
           <w:kern w:val="24"/>
         </w:rPr>
-        <w:t xml:space="preserve">Col </w:t>
-      </w:r>
-      <w:proofErr w:type="gramStart"/>
+        <w:t>Col 2:</w:t>
+      </w:r>
       <w:r>
         <w:rPr>
           <w:rFonts w:eastAsiaTheme="minorEastAsia" w:cstheme="minorBidi"/>
@@ -6022,26 +5771,7 @@
           <w:spacing w:val="-6"/>
           <w:kern w:val="24"/>
         </w:rPr>
-        <w:t>2:</w:t>
-      </w:r>
-      <w:r>
-        <w:rPr>
-          <w:rFonts w:eastAsiaTheme="minorEastAsia" w:cstheme="minorBidi"/>
-          <w:color w:val="181818"/>
-          <w:spacing w:val="-6"/>
-          <w:kern w:val="24"/>
-        </w:rPr>
-        <w:t>Estimated</w:t>
-      </w:r>
-      <w:proofErr w:type="gramEnd"/>
-      <w:r>
-        <w:rPr>
-          <w:rFonts w:eastAsiaTheme="minorEastAsia" w:cstheme="minorBidi"/>
-          <w:color w:val="181818"/>
-          <w:spacing w:val="-6"/>
-          <w:kern w:val="24"/>
-        </w:rPr>
-        <w:t xml:space="preserve"> queue delay [s] </w:t>
+        <w:t xml:space="preserve">Estimated queue delay [s] </w:t>
       </w:r>
     </w:p>
     <w:p>
@@ -6116,9 +5846,8 @@
           <w:spacing w:val="-6"/>
           <w:kern w:val="24"/>
         </w:rPr>
-        <w:t xml:space="preserve">Col </w:t>
-      </w:r>
-      <w:proofErr w:type="gramStart"/>
+        <w:t>Col 4:</w:t>
+      </w:r>
       <w:r>
         <w:rPr>
           <w:rFonts w:eastAsiaTheme="minorEastAsia" w:cstheme="minorBidi"/>
@@ -6126,26 +5855,7 @@
           <w:spacing w:val="-6"/>
           <w:kern w:val="24"/>
         </w:rPr>
-        <w:t>4:</w:t>
-      </w:r>
-      <w:r>
-        <w:rPr>
-          <w:rFonts w:eastAsiaTheme="minorEastAsia" w:cstheme="minorBidi"/>
-          <w:color w:val="181818"/>
-          <w:spacing w:val="-6"/>
-          <w:kern w:val="24"/>
-        </w:rPr>
-        <w:t>Congestion</w:t>
-      </w:r>
-      <w:proofErr w:type="gramEnd"/>
-      <w:r>
-        <w:rPr>
-          <w:rFonts w:eastAsiaTheme="minorEastAsia" w:cstheme="minorBidi"/>
-          <w:color w:val="181818"/>
-          <w:spacing w:val="-6"/>
-          <w:kern w:val="24"/>
-        </w:rPr>
-        <w:t xml:space="preserve"> window [byte] </w:t>
+        <w:t xml:space="preserve">Congestion window [byte] </w:t>
       </w:r>
     </w:p>
     <w:p>
@@ -6503,7 +6213,6 @@
         <w:t xml:space="preserve"> or octave. There are a few </w:t>
       </w:r>
       <w:proofErr w:type="spellStart"/>
-      <w:proofErr w:type="gramStart"/>
       <w:r>
         <w:t>matlab</w:t>
       </w:r>
@@ -6516,29 +6225,13 @@
           <w:b/>
           <w:bCs/>
         </w:rPr>
-        <w:t>.</w:t>
-      </w:r>
-      <w:proofErr w:type="gramEnd"/>
-      <w:r>
-        <w:rPr>
-          <w:b/>
-          <w:bCs/>
-        </w:rPr>
-        <w:t>m</w:t>
+        <w:t>.m</w:t>
       </w:r>
       <w:r>
         <w:t>) scr</w:t>
       </w:r>
       <w:r>
-        <w:t xml:space="preserve">ipts available. Example data is found in </w:t>
-      </w:r>
-      <w:proofErr w:type="gramStart"/>
-      <w:r>
-        <w:t>the .</w:t>
-      </w:r>
-      <w:proofErr w:type="gramEnd"/>
-      <w:r>
-        <w:t xml:space="preserve">/examples folder. The examples represent a simple test setup with a </w:t>
+        <w:t xml:space="preserve">ipts available. Example data is found in the ./examples folder. The examples represent a simple test setup with a </w:t>
       </w:r>
       <w:r>
         <w:t xml:space="preserve">simple 50Mbps link with </w:t>
@@ -6594,42 +6287,14 @@
         <w:rPr>
           <w:rFonts w:ascii="Courier New" w:hAnsi="Courier New" w:cs="Courier New"/>
         </w:rPr>
-        <w:t>plot_thp_</w:t>
-      </w:r>
-      <w:proofErr w:type="gramStart"/>
+        <w:t>plot_thp_delay</w:t>
+      </w:r>
+      <w:proofErr w:type="spellEnd"/>
       <w:r>
         <w:rPr>
           <w:rFonts w:ascii="Courier New" w:hAnsi="Courier New" w:cs="Courier New"/>
         </w:rPr>
-        <w:t>delay</w:t>
-      </w:r>
-      <w:proofErr w:type="spellEnd"/>
-      <w:r>
-        <w:rPr>
-          <w:rFonts w:ascii="Courier New" w:hAnsi="Courier New" w:cs="Courier New"/>
-        </w:rPr>
-        <w:t>(</w:t>
-      </w:r>
-      <w:proofErr w:type="gramEnd"/>
-      <w:r>
-        <w:rPr>
-          <w:rFonts w:ascii="Courier New" w:hAnsi="Courier New" w:cs="Courier New"/>
-        </w:rPr>
-        <w:t>a,</w:t>
-      </w:r>
-      <w:proofErr w:type="gramStart"/>
-      <w:r>
-        <w:rPr>
-          <w:rFonts w:ascii="Courier New" w:hAnsi="Courier New" w:cs="Courier New"/>
-        </w:rPr>
-        <w:t>0,[</w:t>
-      </w:r>
-      <w:proofErr w:type="gramEnd"/>
-      <w:r>
-        <w:rPr>
-          <w:rFonts w:ascii="Courier New" w:hAnsi="Courier New" w:cs="Courier New"/>
-        </w:rPr>
-        <w:t>0 25],60,0.06);</w:t>
+        <w:t>(a,0,[0 25],60,0.06);</w:t>
       </w:r>
       <w:r>
         <w:rPr>
@@ -6786,14 +6451,7 @@
         <w:rPr>
           <w:rFonts w:ascii="Courier New" w:hAnsi="Courier New" w:cs="Courier New"/>
         </w:rPr>
-        <w:t>plot_thp_</w:t>
-      </w:r>
-      <w:proofErr w:type="gramStart"/>
-      <w:r>
-        <w:rPr>
-          <w:rFonts w:ascii="Courier New" w:hAnsi="Courier New" w:cs="Courier New"/>
-        </w:rPr>
-        <w:t>delay</w:t>
+        <w:t>plot_thp_delay</w:t>
       </w:r>
       <w:proofErr w:type="spellEnd"/>
       <w:r>
@@ -6802,7 +6460,6 @@
         </w:rPr>
         <w:t>(</w:t>
       </w:r>
-      <w:proofErr w:type="gramEnd"/>
       <w:r>
         <w:rPr>
           <w:rFonts w:ascii="Courier New" w:hAnsi="Courier New" w:cs="Courier New"/>
@@ -6813,21 +6470,7 @@
         <w:rPr>
           <w:rFonts w:ascii="Courier New" w:hAnsi="Courier New" w:cs="Courier New"/>
         </w:rPr>
-        <w:t>,</w:t>
-      </w:r>
-      <w:proofErr w:type="gramStart"/>
-      <w:r>
-        <w:rPr>
-          <w:rFonts w:ascii="Courier New" w:hAnsi="Courier New" w:cs="Courier New"/>
-        </w:rPr>
-        <w:t>0,[</w:t>
-      </w:r>
-      <w:proofErr w:type="gramEnd"/>
-      <w:r>
-        <w:rPr>
-          <w:rFonts w:ascii="Courier New" w:hAnsi="Courier New" w:cs="Courier New"/>
-        </w:rPr>
-        <w:t>0 25],60,0.06);</w:t>
+        <w:t>,0,[0 25],60,0.06);</w:t>
       </w:r>
     </w:p>
     <w:p>
@@ -6944,28 +6587,14 @@
         <w:rPr>
           <w:rFonts w:ascii="Courier New" w:hAnsi="Courier New" w:cs="Courier New"/>
         </w:rPr>
-        <w:t>plot_</w:t>
-      </w:r>
-      <w:proofErr w:type="gramStart"/>
+        <w:t>plot_cdf</w:t>
+      </w:r>
+      <w:proofErr w:type="spellEnd"/>
       <w:r>
         <w:rPr>
           <w:rFonts w:ascii="Courier New" w:hAnsi="Courier New" w:cs="Courier New"/>
         </w:rPr>
-        <w:t>cdf</w:t>
-      </w:r>
-      <w:proofErr w:type="spellEnd"/>
-      <w:r>
-        <w:rPr>
-          <w:rFonts w:ascii="Courier New" w:hAnsi="Courier New" w:cs="Courier New"/>
-        </w:rPr>
-        <w:t>(a,[</w:t>
-      </w:r>
-      <w:proofErr w:type="gramEnd"/>
-      <w:r>
-        <w:rPr>
-          <w:rFonts w:ascii="Courier New" w:hAnsi="Courier New" w:cs="Courier New"/>
-        </w:rPr>
-        <w:t>0 20],0.06);</w:t>
+        <w:t>(a,[0 20],0.06);</w:t>
       </w:r>
       <w:r>
         <w:rPr>
@@ -7099,15 +6728,7 @@
       </w:r>
       <w:proofErr w:type="spellEnd"/>
       <w:r>
-        <w:t xml:space="preserve"> option logs </w:t>
-      </w:r>
-      <w:proofErr w:type="gramStart"/>
-      <w:r>
-        <w:t>transmit and receive</w:t>
-      </w:r>
-      <w:proofErr w:type="gramEnd"/>
-      <w:r>
-        <w:t xml:space="preserve"> times for RTP packets. </w:t>
+        <w:t xml:space="preserve"> option logs transmit and receive times for RTP packets. </w:t>
       </w:r>
     </w:p>
     <w:p>
@@ -7126,15 +6747,7 @@
           <w:b/>
           <w:bCs/>
         </w:rPr>
-        <w:t>time[</w:t>
-      </w:r>
-      <w:proofErr w:type="gramStart"/>
-      <w:r>
-        <w:rPr>
-          <w:b/>
-          <w:bCs/>
-        </w:rPr>
-        <w:t>s]  </w:t>
+        <w:t>time[s]  </w:t>
       </w:r>
       <w:proofErr w:type="spellStart"/>
       <w:r>
@@ -7145,7 +6758,6 @@
         <w:t>seqNr</w:t>
       </w:r>
       <w:proofErr w:type="spellEnd"/>
-      <w:proofErr w:type="gramEnd"/>
       <w:r>
         <w:rPr>
           <w:b/>
@@ -7183,23 +6795,7 @@
           <w:b/>
           <w:bCs/>
         </w:rPr>
-        <w:t>[</w:t>
-      </w:r>
-      <w:proofErr w:type="gramStart"/>
-      <w:r>
-        <w:rPr>
-          <w:b/>
-          <w:bCs/>
-        </w:rPr>
-        <w:t xml:space="preserve">s]   </w:t>
-      </w:r>
-      <w:proofErr w:type="gramEnd"/>
-      <w:r>
-        <w:rPr>
-          <w:b/>
-          <w:bCs/>
-        </w:rPr>
-        <w:t xml:space="preserve">  </w:t>
+        <w:t xml:space="preserve">[s]     </w:t>
       </w:r>
       <w:proofErr w:type="spellStart"/>
       <w:r>
@@ -7212,13 +6808,8 @@
       <w:proofErr w:type="spellEnd"/>
     </w:p>
     <w:p>
-      <w:proofErr w:type="gramStart"/>
-      <w:r>
-        <w:t>If case</w:t>
-      </w:r>
-      <w:proofErr w:type="gramEnd"/>
-      <w:r>
-        <w:t xml:space="preserve"> the packet was lost or just too late to be </w:t>
+      <w:r>
+        <w:t xml:space="preserve">If case the packet was lost or just too late to be </w:t>
       </w:r>
       <w:proofErr w:type="spellStart"/>
       <w:r>
@@ -7408,25 +6999,7 @@
           <w:szCs w:val="16"/>
         </w:rPr>
         <w:br/>
-        <w:t xml:space="preserve">&gt; ix = </w:t>
-      </w:r>
-      <w:proofErr w:type="gramStart"/>
-      <w:r>
-        <w:rPr>
-          <w:rFonts w:ascii="Courier New" w:hAnsi="Courier New" w:cs="Courier New"/>
-          <w:sz w:val="16"/>
-          <w:szCs w:val="16"/>
-        </w:rPr>
-        <w:t>find(</w:t>
-      </w:r>
-      <w:proofErr w:type="gramEnd"/>
-      <w:r>
-        <w:rPr>
-          <w:rFonts w:ascii="Courier New" w:hAnsi="Courier New" w:cs="Courier New"/>
-          <w:sz w:val="16"/>
-          <w:szCs w:val="16"/>
-        </w:rPr>
-        <w:t>a &gt; 0.0); % Only entries that that represent successfully transmitted packets</w:t>
+        <w:t>&gt; ix = find(a &gt; 0.0); % Only entries that that represent successfully transmitted packets</w:t>
       </w:r>
       <w:r>
         <w:rPr>
@@ -7518,11 +7091,7 @@
       </w:r>
       <w:proofErr w:type="spellEnd"/>
       <w:r>
-        <w:t xml:space="preserve"> is mostly monotonically increasing or decreasing and can for instance be resolved with </w:t>
-      </w:r>
-      <w:proofErr w:type="gramStart"/>
-      <w:r>
-        <w:t>a 1</w:t>
+        <w:t xml:space="preserve"> is mostly monotonically increasing or decreasing and can for instance be resolved with a 1</w:t>
       </w:r>
       <w:r>
         <w:rPr>
@@ -7530,7 +7099,6 @@
         </w:rPr>
         <w:t>st</w:t>
       </w:r>
-      <w:proofErr w:type="gramEnd"/>
       <w:r>
         <w:t xml:space="preserve"> order least square fit.</w:t>
       </w:r>
@@ -7542,15 +7110,7 @@
     </w:p>
     <w:p>
       <w:r>
-        <w:t xml:space="preserve">Note 4: The times are based on a </w:t>
-      </w:r>
-      <w:proofErr w:type="gramStart"/>
-      <w:r>
-        <w:t>32 bit</w:t>
-      </w:r>
-      <w:proofErr w:type="gramEnd"/>
-      <w:r>
-        <w:t xml:space="preserve"> unsigned NTP time where the 16 MSB are seconds and the 16 LSB are decimal seconds. This means that the time stamp values can wrap around at 65536 seconds. </w:t>
+        <w:t xml:space="preserve">Note 4: The times are based on a 32 bit unsigned NTP time where the 16 MSB are seconds and the 16 LSB are decimal seconds. This means that the time stamp values can wrap around at 65536 seconds. </w:t>
       </w:r>
     </w:p>
     <w:p>
@@ -7597,28 +7157,14 @@
         <w:rPr>
           <w:rFonts w:ascii="Courier New" w:hAnsi="Courier New" w:cs="Courier New"/>
         </w:rPr>
-        <w:t>plot_</w:t>
-      </w:r>
-      <w:proofErr w:type="gramStart"/>
+        <w:t>plot_txrx</w:t>
+      </w:r>
+      <w:proofErr w:type="spellEnd"/>
       <w:r>
         <w:rPr>
           <w:rFonts w:ascii="Courier New" w:hAnsi="Courier New" w:cs="Courier New"/>
         </w:rPr>
-        <w:t>txrx</w:t>
-      </w:r>
-      <w:proofErr w:type="spellEnd"/>
-      <w:r>
-        <w:rPr>
-          <w:rFonts w:ascii="Courier New" w:hAnsi="Courier New" w:cs="Courier New"/>
-        </w:rPr>
-        <w:t>(a,[</w:t>
-      </w:r>
-      <w:proofErr w:type="gramEnd"/>
-      <w:r>
-        <w:rPr>
-          <w:rFonts w:ascii="Courier New" w:hAnsi="Courier New" w:cs="Courier New"/>
-        </w:rPr>
-        <w:t>0 20],0.01);</w:t>
+        <w:t>(a,[0 20],0.01);</w:t>
       </w:r>
     </w:p>
     <w:p>
@@ -7739,15 +7285,7 @@
     </w:p>
     <w:p>
       <w:r>
-        <w:t xml:space="preserve">Limited socket buffers can lead to lost </w:t>
-      </w:r>
-      <w:proofErr w:type="gramStart"/>
-      <w:r>
-        <w:t>packets,</w:t>
-      </w:r>
-      <w:proofErr w:type="gramEnd"/>
-      <w:r>
-        <w:t xml:space="preserve"> this issue is particularly relevant when the </w:t>
+        <w:t xml:space="preserve">Limited socket buffers can lead to lost packets, this issue is particularly relevant when the </w:t>
       </w:r>
       <w:proofErr w:type="spellStart"/>
       <w:r>
@@ -7785,19 +7323,11 @@
         <w:br/>
       </w:r>
       <w:proofErr w:type="spellStart"/>
-      <w:proofErr w:type="gramStart"/>
       <w:r>
         <w:rPr>
           <w:rFonts w:ascii="Courier New" w:hAnsi="Courier New" w:cs="Courier New"/>
         </w:rPr>
-        <w:t>net.core</w:t>
-      </w:r>
-      <w:proofErr w:type="gramEnd"/>
-      <w:r>
-        <w:rPr>
-          <w:rFonts w:ascii="Courier New" w:hAnsi="Courier New" w:cs="Courier New"/>
-        </w:rPr>
-        <w:t>.rmem_default</w:t>
+        <w:t>net.core.rmem_default</w:t>
       </w:r>
       <w:proofErr w:type="spellEnd"/>
       <w:r>
@@ -7936,15 +7466,7 @@
         <w:t>first</w:t>
       </w:r>
       <w:r>
-        <w:t xml:space="preserve"> started on the PC that is on the modem side, </w:t>
-      </w:r>
-      <w:proofErr w:type="gramStart"/>
-      <w:r>
-        <w:t>regardless</w:t>
-      </w:r>
-      <w:proofErr w:type="gramEnd"/>
-      <w:r>
-        <w:t xml:space="preserve"> if is the </w:t>
+        <w:t xml:space="preserve"> started on the PC that is on the modem side, regardless if is the </w:t>
       </w:r>
       <w:proofErr w:type="spellStart"/>
       <w:r>
@@ -7958,22 +7480,14 @@
         <w:t xml:space="preserve"> </w:t>
       </w:r>
       <w:r>
-        <w:t xml:space="preserve">or </w:t>
-      </w:r>
-      <w:proofErr w:type="gramStart"/>
-      <w:r>
-        <w:t xml:space="preserve">the </w:t>
+        <w:t xml:space="preserve">or the </w:t>
       </w:r>
       <w:r>
         <w:t xml:space="preserve"> </w:t>
       </w:r>
       <w:proofErr w:type="spellStart"/>
       <w:r>
-        <w:t>scream</w:t>
-      </w:r>
-      <w:proofErr w:type="gramEnd"/>
-      <w:r>
-        <w:t>_bw_test_tx</w:t>
+        <w:t>scream_bw_test_tx</w:t>
       </w:r>
       <w:proofErr w:type="spellEnd"/>
       <w:r>
@@ -7990,15 +7504,7 @@
     </w:p>
     <w:p>
       <w:r>
-        <w:t xml:space="preserve">To make it possible to know the public IP address of the modem there are </w:t>
-      </w:r>
-      <w:proofErr w:type="gramStart"/>
-      <w:r>
-        <w:t>a number of</w:t>
-      </w:r>
-      <w:proofErr w:type="gramEnd"/>
-      <w:r>
-        <w:t xml:space="preserve"> methods. One way is to ping the opposing side that is on a public (fixed) IP address and to a TCP dump on the opposing side to get the IP address. In the </w:t>
+        <w:t xml:space="preserve">To make it possible to know the public IP address of the modem there are a number of methods. One way is to ping the opposing side that is on a public (fixed) IP address and to a TCP dump on the opposing side to get the IP address. In the </w:t>
       </w:r>
       <w:r>
         <w:t xml:space="preserve">example in </w:t>
@@ -8519,15 +8025,7 @@
         <w:footnoteRef/>
       </w:r>
       <w:r>
-        <w:t xml:space="preserve"> </w:t>
-      </w:r>
-      <w:proofErr w:type="spellStart"/>
-      <w:r>
-        <w:t>SCReAM</w:t>
-      </w:r>
-      <w:proofErr w:type="spellEnd"/>
-      <w:r>
-        <w:t xml:space="preserve"> IETF draft </w:t>
+        <w:t xml:space="preserve"> SCReAM IETF draft </w:t>
       </w:r>
       <w:hyperlink r:id="rId1" w:history="1">
         <w:r>
@@ -8829,12 +8327,10 @@
                 <w:pStyle w:val="Title"/>
               </w:pPr>
               <w:proofErr w:type="spellStart"/>
-              <w:proofErr w:type="gramStart"/>
               <w:r>
                 <w:t>SCReAM</w:t>
               </w:r>
               <w:proofErr w:type="spellEnd"/>
-              <w:proofErr w:type="gramEnd"/>
               <w:r>
                 <w:t xml:space="preserve"> BW test tool</w:t>
               </w:r>
@@ -38884,6 +38380,7 @@
     <w:rsid w:val="00460B87"/>
     <w:rsid w:val="00471682"/>
     <w:rsid w:val="004C2BBF"/>
+    <w:rsid w:val="004D32C7"/>
     <w:rsid w:val="00516DF4"/>
     <w:rsid w:val="00537E91"/>
     <w:rsid w:val="005577A2"/>
@@ -38914,6 +38411,7 @@
     <w:rsid w:val="009E57D2"/>
     <w:rsid w:val="00A1585B"/>
     <w:rsid w:val="00A844E7"/>
+    <w:rsid w:val="00AB5B12"/>
     <w:rsid w:val="00AC0B18"/>
     <w:rsid w:val="00AC2177"/>
     <w:rsid w:val="00AF1B4D"/>
@@ -39431,34 +38929,6 @@
       <w14:ligatures w14:val="standardContextual"/>
     </w:rPr>
   </w:style>
-  <w:style w:type="paragraph" w:customStyle="1" w:styleId="869DC69D235C4D8FA7718BEE50DDA647">
-    <w:name w:val="869DC69D235C4D8FA7718BEE50DDA647"/>
-    <w:rsid w:val="00C50C1F"/>
-    <w:pPr>
-      <w:spacing w:line="278" w:lineRule="auto"/>
-    </w:pPr>
-    <w:rPr>
-      <w:kern w:val="2"/>
-      <w:sz w:val="24"/>
-      <w:szCs w:val="24"/>
-      <w:lang/>
-      <w14:ligatures w14:val="standardContextual"/>
-    </w:rPr>
-  </w:style>
-  <w:style w:type="paragraph" w:customStyle="1" w:styleId="60F07643580C48248581389685B76B04">
-    <w:name w:val="60F07643580C48248581389685B76B04"/>
-    <w:rsid w:val="00C50C1F"/>
-    <w:pPr>
-      <w:spacing w:line="278" w:lineRule="auto"/>
-    </w:pPr>
-    <w:rPr>
-      <w:kern w:val="2"/>
-      <w:sz w:val="24"/>
-      <w:szCs w:val="24"/>
-      <w:lang/>
-      <w14:ligatures w14:val="standardContextual"/>
-    </w:rPr>
-  </w:style>
 </w:styles>
 </file>
 
@@ -39808,11 +39278,11 @@
 </file>
 
 <file path=customXml/item1.xml><?xml version="1.0" encoding="utf-8"?>
-<TemplafyFormConfiguration><![CDATA[{"formFields":[{"dataSource":"Page Setup","displayColumn":"paperSize","hideIfNoUserInteractionRequired":false,"distinct":true,"required":false,"autoSelectFirstOption":true,"helpTexts":{"prefix":"","postfix":""},"spacing":{},"type":"dropDown","name":"PageSetup","label":"Page Setup (Word)","fullyQualifiedName":"PageSetup"},{"required":true,"placeholder":"","lines":0,"helpTexts":{"prefix":"","postfix":""},"spacing":{},"type":"textBox","name":"DocumentTitle","label":"Document Title","fullyQualifiedName":"DocumentTitle"},{"required":false,"placeholder":"","lines":0,"helpTexts":{"prefix":"","postfix":""},"spacing":{},"type":"textBox","name":"DocumentSubTitle","label":"Document Sub Title (not mandatory)","fullyQualifiedName":"DocumentSubTitle"},{"column":"docType","required":false,"placeholder":"","autoSelectFirstOption":false,"helpTexts":{"prefix":"","postfix":"If the document type differs from the default value, click on the X to delete and type/choose another type."},"spacing":{},"dataSource":"External Communication Document Type","type":"comboBox","name":"DocTypeExternalCom","label":"Document Type","fullyQualifiedName":"DocTypeExternalCom"},{"dataSource":"Confidentiality","displayColumn":"confidentiality","hideIfNoUserInteractionRequired":false,"distinct":true,"required":true,"autoSelectFirstOption":false,"helpTexts":{"prefix":"","postfix":""},"spacing":{},"type":"dropDown","name":"ConfidentialityClass","label":"Confidentiality Class","fullyQualifiedName":"ConfidentialityClass"},{"dataSource":"External Confidentiality label","displayColumn":"externalConfidentiality","hideIfNoUserInteractionRequired":false,"distinct":true,"required":false,"autoSelectFirstOption":false,"helpTexts":{"prefix":"","postfix":"(If no external confidentiality class then please choose the blank value)"},"spacing":{},"type":"dropDown","name":"ExternalConfidentialityLabel","label":"External Confidentiality label","fullyQualifiedName":"ExternalConfidentialityLabel"},{"required":false,"placeholder":"","lines":0,"helpTexts":{"prefix":"","postfix":"(Commonly assigned by EriDoc)"},"spacing":{},"type":"textBox","name":"DocumentNumber","label":"Document Number","fullyQualifiedName":"DocumentNumber"},{"dataSource":"Language code","displayColumn":"showName","defaultValue":"1","hideIfNoUserInteractionRequired":false,"distinct":true,"required":false,"autoSelectFirstOption":false,"helpTexts":{"prefix":"","postfix":"(The language code will be appended to the Document No.)"},"spacing":{},"type":"dropDown","name":"LanguageCode","label":"Language Code","fullyQualifiedName":"LanguageCode"},{"column":"revision","required":false,"placeholder":"","autoSelectFirstOption":false,"helpTexts":{"prefix":"","postfix":""},"spacing":{},"dataSource":"Revision","type":"comboBox","name":"Revision","label":"Revision","fullyQualifiedName":"Revision"},{"required":false,"helpTexts":{"prefix":"","postfix":""},"spacing":{},"type":"datePicker","name":"Date","label":"Date","fullyQualifiedName":"Date"},{"required":false,"placeholder":"","lines":0,"defaultValue":"{{UserProfile.Prepared}}","helpTexts":{"prefix":"","postfix":""},"spacing":{},"type":"textBox","name":"Prepared","label":"Prepared By (Subject Responsible)","fullyQualifiedName":"Prepared"},{"required":false,"placeholder":"","lines":0,"helpTexts":{"prefix":"","postfix":""},"spacing":{},"type":"textBox","name":"ApprovedBy","label":"Approved By (Document Responsible)","fullyQualifiedName":"ApprovedBy"},{"required":false,"placeholder":"","lines":0,"helpTexts":{"prefix":"","postfix":""},"spacing":{},"type":"textBox","name":"Checked","label":"Checked","fullyQualifiedName":"Checked"},{"required":false,"placeholder":"","lines":0,"helpTexts":{"prefix":"","postfix":"(Overwritten with EriDoc values at check-in)"},"spacing":{},"type":"textBox","name":"Reference","label":"Reference","fullyQualifiedName":"Reference"},{"required":true,"placeholder":"","lines":0,"defaultValue":"Ericsson %Date:yyyy%","helpTexts":{"prefix":"","postfix":"Default text is Ericsson %Date:yyyy% (Date format will be replaced by current year). If another text is needed, then delete default text and write other. Correct format “© Full legal company name+Year of Revision”,  e.g. “© Ericsson AB 2019”, or including also year of first Revision  e.g. “© Ericsson AB 2010-2019”. (© is entered automatically.)"},"spacing":{},"type":"textBox","name":"Copyright","label":"Copyright information (company name)","fullyQualifiedName":"Copyright"},{"required":false,"placeholder":"","lines":0,"helpTexts":{"prefix":"","postfix":""},"spacing":{},"type":"textBox","name":"Keywords","label":"Keywords","fullyQualifiedName":"Keywords"},{"required":false,"placeholder":"","lines":0,"helpTexts":{"prefix":"","postfix":""},"spacing":{},"type":"textBox","name":"ContactInformation","label":"Contact information","fullyQualifiedName":"ContactInformation"}],"formDataEntries":[{"name":"PageSetup","value":"5wlu7ZdPxHQj1W0w+yTNSg=="},{"name":"DocumentTitle","value":"z4aSwb2Y68PmvnRNHO+DiTD0XQ6QNGPG+oGJ0/zNvRw="},{"name":"DocTypeExternalCom","value":"McRZznB02w7visdFQkartg=="},{"name":"ConfidentialityClass","value":"cT/FOwTWaPknrhRlNMh4SQ=="},{"name":"ExternalConfidentialityLabel","value":"u2D/MG3wyuAQhkGvE2fPaA=="},{"name":"LanguageCode","value":"5wlu7ZdPxHQj1W0w+yTNSg=="},{"name":"Date","value":"SoXAvnIyXi4svmetIJAGZw=="},{"name":"Prepared","value":"PqdHBiLjqdpOMxfLUK9ToqGZC3IVZ9dKw2P8T4zffR0="},{"name":"Copyright","value":"TG5cB5gDdv8LCPG/oqpdzQ=="}]}]]></TemplafyFormConfiguration>
+<b:Sources xmlns:b="http://schemas.openxmlformats.org/officeDocument/2006/bibliography" xmlns="http://schemas.openxmlformats.org/officeDocument/2006/bibliography" SelectedStyle="\APASixthEditionOfficeOnline.xsl" StyleName="APA" Version="6"/>
 </file>
 
 <file path=customXml/item2.xml><?xml version="1.0" encoding="utf-8"?>
-<b:Sources xmlns:b="http://schemas.openxmlformats.org/officeDocument/2006/bibliography" xmlns="http://schemas.openxmlformats.org/officeDocument/2006/bibliography" SelectedStyle="\APASixthEditionOfficeOnline.xsl" StyleName="APA" Version="6"/>
+<TemplafyFormConfiguration><![CDATA[{"formFields":[{"dataSource":"Page Setup","displayColumn":"paperSize","hideIfNoUserInteractionRequired":false,"distinct":true,"required":false,"autoSelectFirstOption":true,"helpTexts":{"prefix":"","postfix":""},"spacing":{},"type":"dropDown","name":"PageSetup","label":"Page Setup (Word)","fullyQualifiedName":"PageSetup"},{"required":true,"placeholder":"","lines":0,"helpTexts":{"prefix":"","postfix":""},"spacing":{},"type":"textBox","name":"DocumentTitle","label":"Document Title","fullyQualifiedName":"DocumentTitle"},{"required":false,"placeholder":"","lines":0,"helpTexts":{"prefix":"","postfix":""},"spacing":{},"type":"textBox","name":"DocumentSubTitle","label":"Document Sub Title (not mandatory)","fullyQualifiedName":"DocumentSubTitle"},{"column":"docType","required":false,"placeholder":"","autoSelectFirstOption":false,"helpTexts":{"prefix":"","postfix":"If the document type differs from the default value, click on the X to delete and type/choose another type."},"spacing":{},"dataSource":"External Communication Document Type","type":"comboBox","name":"DocTypeExternalCom","label":"Document Type","fullyQualifiedName":"DocTypeExternalCom"},{"dataSource":"Confidentiality","displayColumn":"confidentiality","hideIfNoUserInteractionRequired":false,"distinct":true,"required":true,"autoSelectFirstOption":false,"helpTexts":{"prefix":"","postfix":""},"spacing":{},"type":"dropDown","name":"ConfidentialityClass","label":"Confidentiality Class","fullyQualifiedName":"ConfidentialityClass"},{"dataSource":"External Confidentiality label","displayColumn":"externalConfidentiality","hideIfNoUserInteractionRequired":false,"distinct":true,"required":false,"autoSelectFirstOption":false,"helpTexts":{"prefix":"","postfix":"(If no external confidentiality class then please choose the blank value)"},"spacing":{},"type":"dropDown","name":"ExternalConfidentialityLabel","label":"External Confidentiality label","fullyQualifiedName":"ExternalConfidentialityLabel"},{"required":false,"placeholder":"","lines":0,"helpTexts":{"prefix":"","postfix":"(Commonly assigned by EriDoc)"},"spacing":{},"type":"textBox","name":"DocumentNumber","label":"Document Number","fullyQualifiedName":"DocumentNumber"},{"dataSource":"Language code","displayColumn":"showName","defaultValue":"1","hideIfNoUserInteractionRequired":false,"distinct":true,"required":false,"autoSelectFirstOption":false,"helpTexts":{"prefix":"","postfix":"(The language code will be appended to the Document No.)"},"spacing":{},"type":"dropDown","name":"LanguageCode","label":"Language Code","fullyQualifiedName":"LanguageCode"},{"column":"revision","required":false,"placeholder":"","autoSelectFirstOption":false,"helpTexts":{"prefix":"","postfix":""},"spacing":{},"dataSource":"Revision","type":"comboBox","name":"Revision","label":"Revision","fullyQualifiedName":"Revision"},{"required":false,"helpTexts":{"prefix":"","postfix":""},"spacing":{},"type":"datePicker","name":"Date","label":"Date","fullyQualifiedName":"Date"},{"required":false,"placeholder":"","lines":0,"defaultValue":"{{UserProfile.Prepared}}","helpTexts":{"prefix":"","postfix":""},"spacing":{},"type":"textBox","name":"Prepared","label":"Prepared By (Subject Responsible)","fullyQualifiedName":"Prepared"},{"required":false,"placeholder":"","lines":0,"helpTexts":{"prefix":"","postfix":""},"spacing":{},"type":"textBox","name":"ApprovedBy","label":"Approved By (Document Responsible)","fullyQualifiedName":"ApprovedBy"},{"required":false,"placeholder":"","lines":0,"helpTexts":{"prefix":"","postfix":""},"spacing":{},"type":"textBox","name":"Checked","label":"Checked","fullyQualifiedName":"Checked"},{"required":false,"placeholder":"","lines":0,"helpTexts":{"prefix":"","postfix":"(Overwritten with EriDoc values at check-in)"},"spacing":{},"type":"textBox","name":"Reference","label":"Reference","fullyQualifiedName":"Reference"},{"required":true,"placeholder":"","lines":0,"defaultValue":"Ericsson %Date:yyyy%","helpTexts":{"prefix":"","postfix":"Default text is Ericsson %Date:yyyy% (Date format will be replaced by current year). If another text is needed, then delete default text and write other. Correct format “© Full legal company name+Year of Revision”,  e.g. “© Ericsson AB 2019”, or including also year of first Revision  e.g. “© Ericsson AB 2010-2019”. (© is entered automatically.)"},"spacing":{},"type":"textBox","name":"Copyright","label":"Copyright information (company name)","fullyQualifiedName":"Copyright"},{"required":false,"placeholder":"","lines":0,"helpTexts":{"prefix":"","postfix":""},"spacing":{},"type":"textBox","name":"Keywords","label":"Keywords","fullyQualifiedName":"Keywords"},{"required":false,"placeholder":"","lines":0,"helpTexts":{"prefix":"","postfix":""},"spacing":{},"type":"textBox","name":"ContactInformation","label":"Contact information","fullyQualifiedName":"ContactInformation"}],"formDataEntries":[{"name":"PageSetup","value":"5wlu7ZdPxHQj1W0w+yTNSg=="},{"name":"DocumentTitle","value":"z4aSwb2Y68PmvnRNHO+DiTD0XQ6QNGPG+oGJ0/zNvRw="},{"name":"DocTypeExternalCom","value":"McRZznB02w7visdFQkartg=="},{"name":"ConfidentialityClass","value":"cT/FOwTWaPknrhRlNMh4SQ=="},{"name":"ExternalConfidentialityLabel","value":"u2D/MG3wyuAQhkGvE2fPaA=="},{"name":"LanguageCode","value":"5wlu7ZdPxHQj1W0w+yTNSg=="},{"name":"Date","value":"SoXAvnIyXi4svmetIJAGZw=="},{"name":"Prepared","value":"PqdHBiLjqdpOMxfLUK9ToqGZC3IVZ9dKw2P8T4zffR0="},{"name":"Copyright","value":"TG5cB5gDdv8LCPG/oqpdzQ=="}]}]]></TemplafyFormConfiguration>
 </file>
 
 <file path=customXml/item3.xml><?xml version="1.0" encoding="utf-8"?>
@@ -39820,16 +39290,16 @@
 </file>
 
 <file path=customXml/itemProps1.xml><?xml version="1.0" encoding="utf-8"?>
-<ds:datastoreItem xmlns:ds="http://schemas.openxmlformats.org/officeDocument/2006/customXml" ds:itemID="{AAE82477-59F8-4D80-80B7-6C3D6DA1069A}">
-  <ds:schemaRefs/>
+<ds:datastoreItem xmlns:ds="http://schemas.openxmlformats.org/officeDocument/2006/customXml" ds:itemID="{5F2B0B91-1F73-45B4-B331-805DCD689691}">
+  <ds:schemaRefs>
+    <ds:schemaRef ds:uri="http://schemas.openxmlformats.org/officeDocument/2006/bibliography"/>
+  </ds:schemaRefs>
 </ds:datastoreItem>
 </file>
 
 <file path=customXml/itemProps2.xml><?xml version="1.0" encoding="utf-8"?>
-<ds:datastoreItem xmlns:ds="http://schemas.openxmlformats.org/officeDocument/2006/customXml" ds:itemID="{5F2B0B91-1F73-45B4-B331-805DCD689691}">
-  <ds:schemaRefs>
-    <ds:schemaRef ds:uri="http://schemas.openxmlformats.org/officeDocument/2006/bibliography"/>
-  </ds:schemaRefs>
+<ds:datastoreItem xmlns:ds="http://schemas.openxmlformats.org/officeDocument/2006/customXml" ds:itemID="{AAE82477-59F8-4D80-80B7-6C3D6DA1069A}">
+  <ds:schemaRefs/>
 </ds:datastoreItem>
 </file>
 

</xml_diff>